<commit_message>
Add professional diagrams and experiment photos to document
- Add 7 technical diagrams: system architecture, ROS nodes, vision pipeline,
  hand-eye calibration, DQN architecture, decision flow, pick-place sequence
- Insert 4 experiment photos into Section 5 (performance evaluation)
- Add diagram generation and docx insertion scripts
- Document updated with 17 figures total (5 original + 12 new)

Co-Authored-By: Claude Opus 4.7 <noreply@anthropic.com>
</commit_message>
<xml_diff>
--- a/创意赛技术文档.docx
+++ b/创意赛技术文档.docx
@@ -7755,6 +7755,67 @@
     </w:p>
     <w:p>
       <w:pPr>
+        <w:spacing w:before="160" w:after="40"/>
+        <w:jc w:val="center"/>
+      </w:pPr>
+      <w:r>
+        <w:drawing>
+          <wp:inline xmlns:a="http://schemas.openxmlformats.org/drawingml/2006/main" xmlns:pic="http://schemas.openxmlformats.org/drawingml/2006/picture">
+            <wp:extent cx="5303520" cy="3780600"/>
+            <wp:docPr id="17" name="Picture 17"/>
+            <wp:cNvGraphicFramePr>
+              <a:graphicFrameLocks noChangeAspect="1"/>
+            </wp:cNvGraphicFramePr>
+            <a:graphic>
+              <a:graphicData uri="http://schemas.openxmlformats.org/drawingml/2006/picture">
+                <pic:pic>
+                  <pic:nvPicPr>
+                    <pic:cNvPr id="0" name="fig1_system_architecture.png"/>
+                    <pic:cNvPicPr/>
+                  </pic:nvPicPr>
+                  <pic:blipFill>
+                    <a:blip r:embed="rId23"/>
+                    <a:stretch>
+                      <a:fillRect/>
+                    </a:stretch>
+                  </pic:blipFill>
+                  <pic:spPr>
+                    <a:xfrm>
+                      <a:off x="0" y="0"/>
+                      <a:ext cx="5303520" cy="3780600"/>
+                    </a:xfrm>
+                    <a:prstGeom prst="rect"/>
+                  </pic:spPr>
+                </pic:pic>
+              </a:graphicData>
+            </a:graphic>
+          </wp:inline>
+        </w:drawing>
+      </w:r>
+    </w:p>
+    <w:p>
+      <w:pPr>
+        <w:spacing w:after="200"/>
+        <w:jc w:val="center"/>
+      </w:pPr>
+      <w:r>
+        <w:rPr>
+          <w:rFonts w:ascii="Times New Roman" w:hAnsi="Times New Roman"/>
+          <w:b/>
+          <w:sz w:val="18"/>
+        </w:rPr>
+        <w:t xml:space="preserve">图1-2  </w:t>
+      </w:r>
+      <w:r>
+        <w:rPr>
+          <w:rFonts w:ascii="Times New Roman" w:hAnsi="Times New Roman"/>
+          <w:sz w:val="18"/>
+        </w:rPr>
+        <w:t>系统总体架构图（感知→决策→执行三层递阶架构）</w:t>
+      </w:r>
+    </w:p>
+    <w:p>
+      <w:pPr>
         <w:pStyle w:val="21"/>
         <w:spacing w:before="240" w:after="160" w:line="300" w:lineRule="auto"/>
         <w:jc w:val="left"/>
@@ -11955,6 +12016,67 @@
         <w:t>通信架构</w:t>
       </w:r>
       <w:bookmarkEnd w:id="14"/>
+    </w:p>
+    <w:p>
+      <w:pPr>
+        <w:spacing w:before="160" w:after="40"/>
+        <w:jc w:val="center"/>
+      </w:pPr>
+      <w:r>
+        <w:drawing>
+          <wp:inline xmlns:a="http://schemas.openxmlformats.org/drawingml/2006/main" xmlns:pic="http://schemas.openxmlformats.org/drawingml/2006/picture">
+            <wp:extent cx="5029200" cy="3682127"/>
+            <wp:docPr id="16" name="Picture 16"/>
+            <wp:cNvGraphicFramePr>
+              <a:graphicFrameLocks noChangeAspect="1"/>
+            </wp:cNvGraphicFramePr>
+            <a:graphic>
+              <a:graphicData uri="http://schemas.openxmlformats.org/drawingml/2006/picture">
+                <pic:pic>
+                  <pic:nvPicPr>
+                    <pic:cNvPr id="0" name="fig2_ros_node_graph.png"/>
+                    <pic:cNvPicPr/>
+                  </pic:nvPicPr>
+                  <pic:blipFill>
+                    <a:blip r:embed="rId22"/>
+                    <a:stretch>
+                      <a:fillRect/>
+                    </a:stretch>
+                  </pic:blipFill>
+                  <pic:spPr>
+                    <a:xfrm>
+                      <a:off x="0" y="0"/>
+                      <a:ext cx="5029200" cy="3682127"/>
+                    </a:xfrm>
+                    <a:prstGeom prst="rect"/>
+                  </pic:spPr>
+                </pic:pic>
+              </a:graphicData>
+            </a:graphic>
+          </wp:inline>
+        </w:drawing>
+      </w:r>
+    </w:p>
+    <w:p>
+      <w:pPr>
+        <w:spacing w:after="200"/>
+        <w:jc w:val="center"/>
+      </w:pPr>
+      <w:r>
+        <w:rPr>
+          <w:rFonts w:ascii="Times New Roman" w:hAnsi="Times New Roman"/>
+          <w:b/>
+          <w:sz w:val="18"/>
+        </w:rPr>
+        <w:t xml:space="preserve">图2-1  </w:t>
+      </w:r>
+      <w:r>
+        <w:rPr>
+          <w:rFonts w:ascii="Times New Roman" w:hAnsi="Times New Roman"/>
+          <w:sz w:val="18"/>
+        </w:rPr>
+        <w:t>ROS节点通信架构图（核心节点与话题/服务关系）</w:t>
+      </w:r>
     </w:p>
     <w:p>
       <w:pPr>
@@ -16344,6 +16466,67 @@
     </w:p>
     <w:p>
       <w:pPr>
+        <w:spacing w:before="160" w:after="40"/>
+        <w:jc w:val="center"/>
+      </w:pPr>
+      <w:r>
+        <w:drawing>
+          <wp:inline xmlns:a="http://schemas.openxmlformats.org/drawingml/2006/main" xmlns:pic="http://schemas.openxmlformats.org/drawingml/2006/picture">
+            <wp:extent cx="4846320" cy="3656313"/>
+            <wp:docPr id="15" name="Picture 15"/>
+            <wp:cNvGraphicFramePr>
+              <a:graphicFrameLocks noChangeAspect="1"/>
+            </wp:cNvGraphicFramePr>
+            <a:graphic>
+              <a:graphicData uri="http://schemas.openxmlformats.org/drawingml/2006/picture">
+                <pic:pic>
+                  <pic:nvPicPr>
+                    <pic:cNvPr id="0" name="fig7_handeye_calibration.png"/>
+                    <pic:cNvPicPr/>
+                  </pic:nvPicPr>
+                  <pic:blipFill>
+                    <a:blip r:embed="rId21"/>
+                    <a:stretch>
+                      <a:fillRect/>
+                    </a:stretch>
+                  </pic:blipFill>
+                  <pic:spPr>
+                    <a:xfrm>
+                      <a:off x="0" y="0"/>
+                      <a:ext cx="4846320" cy="3656313"/>
+                    </a:xfrm>
+                    <a:prstGeom prst="rect"/>
+                  </pic:spPr>
+                </pic:pic>
+              </a:graphicData>
+            </a:graphic>
+          </wp:inline>
+        </w:drawing>
+      </w:r>
+    </w:p>
+    <w:p>
+      <w:pPr>
+        <w:spacing w:after="200"/>
+        <w:jc w:val="center"/>
+      </w:pPr>
+      <w:r>
+        <w:rPr>
+          <w:rFonts w:ascii="Times New Roman" w:hAnsi="Times New Roman"/>
+          <w:b/>
+          <w:sz w:val="18"/>
+        </w:rPr>
+        <w:t xml:space="preserve">图4-3  </w:t>
+      </w:r>
+      <w:r>
+        <w:rPr>
+          <w:rFonts w:ascii="Times New Roman" w:hAnsi="Times New Roman"/>
+          <w:sz w:val="18"/>
+        </w:rPr>
+        <w:t>手眼标定流程（Tsai-Lenz算法 AX=XB 求解）</w:t>
+      </w:r>
+    </w:p>
+    <w:p>
+      <w:pPr>
         <w:ind w:firstLine="420"/>
         <w:rPr>
           <w:lang w:eastAsia="zh-CN"/>
@@ -19374,6 +19557,67 @@
       </w:r>
       <w:bookmarkEnd w:id="30"/>
       <w:proofErr w:type="spellEnd"/>
+    </w:p>
+    <w:p>
+      <w:pPr>
+        <w:spacing w:before="160" w:after="40"/>
+        <w:jc w:val="center"/>
+      </w:pPr>
+      <w:r>
+        <w:drawing>
+          <wp:inline xmlns:a="http://schemas.openxmlformats.org/drawingml/2006/main" xmlns:pic="http://schemas.openxmlformats.org/drawingml/2006/picture">
+            <wp:extent cx="5303520" cy="3355213"/>
+            <wp:docPr id="14" name="Picture 14"/>
+            <wp:cNvGraphicFramePr>
+              <a:graphicFrameLocks noChangeAspect="1"/>
+            </wp:cNvGraphicFramePr>
+            <a:graphic>
+              <a:graphicData uri="http://schemas.openxmlformats.org/drawingml/2006/picture">
+                <pic:pic>
+                  <pic:nvPicPr>
+                    <pic:cNvPr id="0" name="fig3_vision_pipeline.png"/>
+                    <pic:cNvPicPr/>
+                  </pic:nvPicPr>
+                  <pic:blipFill>
+                    <a:blip r:embed="rId20"/>
+                    <a:stretch>
+                      <a:fillRect/>
+                    </a:stretch>
+                  </pic:blipFill>
+                  <pic:spPr>
+                    <a:xfrm>
+                      <a:off x="0" y="0"/>
+                      <a:ext cx="5303520" cy="3355213"/>
+                    </a:xfrm>
+                    <a:prstGeom prst="rect"/>
+                  </pic:spPr>
+                </pic:pic>
+              </a:graphicData>
+            </a:graphic>
+          </wp:inline>
+        </w:drawing>
+      </w:r>
+    </w:p>
+    <w:p>
+      <w:pPr>
+        <w:spacing w:after="200"/>
+        <w:jc w:val="center"/>
+      </w:pPr>
+      <w:r>
+        <w:rPr>
+          <w:rFonts w:ascii="Times New Roman" w:hAnsi="Times New Roman"/>
+          <w:b/>
+          <w:sz w:val="18"/>
+        </w:rPr>
+        <w:t xml:space="preserve">图4-8  </w:t>
+      </w:r>
+      <w:r>
+        <w:rPr>
+          <w:rFonts w:ascii="Times New Roman" w:hAnsi="Times New Roman"/>
+          <w:sz w:val="18"/>
+        </w:rPr>
+        <w:t>视觉识别流水线（D435采集→YOLOv8分割→模板匹配→手眼变换→抓取位姿）</w:t>
+      </w:r>
     </w:p>
     <w:p>
       <w:pPr>
@@ -23196,6 +23440,67 @@
     </w:p>
     <w:p>
       <w:pPr>
+        <w:spacing w:before="160" w:after="40"/>
+        <w:jc w:val="center"/>
+      </w:pPr>
+      <w:r>
+        <w:drawing>
+          <wp:inline xmlns:a="http://schemas.openxmlformats.org/drawingml/2006/main" xmlns:pic="http://schemas.openxmlformats.org/drawingml/2006/picture">
+            <wp:extent cx="5303520" cy="3355213"/>
+            <wp:docPr id="13" name="Picture 13"/>
+            <wp:cNvGraphicFramePr>
+              <a:graphicFrameLocks noChangeAspect="1"/>
+            </wp:cNvGraphicFramePr>
+            <a:graphic>
+              <a:graphicData uri="http://schemas.openxmlformats.org/drawingml/2006/picture">
+                <pic:pic>
+                  <pic:nvPicPr>
+                    <pic:cNvPr id="0" name="fig6_dqn_architecture.png"/>
+                    <pic:cNvPicPr/>
+                  </pic:nvPicPr>
+                  <pic:blipFill>
+                    <a:blip r:embed="rId19"/>
+                    <a:stretch>
+                      <a:fillRect/>
+                    </a:stretch>
+                  </pic:blipFill>
+                  <pic:spPr>
+                    <a:xfrm>
+                      <a:off x="0" y="0"/>
+                      <a:ext cx="5303520" cy="3355213"/>
+                    </a:xfrm>
+                    <a:prstGeom prst="rect"/>
+                  </pic:spPr>
+                </pic:pic>
+              </a:graphicData>
+            </a:graphic>
+          </wp:inline>
+        </w:drawing>
+      </w:r>
+    </w:p>
+    <w:p>
+      <w:pPr>
+        <w:spacing w:after="200"/>
+        <w:jc w:val="center"/>
+      </w:pPr>
+      <w:r>
+        <w:rPr>
+          <w:rFonts w:ascii="Times New Roman" w:hAnsi="Times New Roman"/>
+          <w:b/>
+          <w:sz w:val="18"/>
+        </w:rPr>
+        <w:t xml:space="preserve">图4-4  </w:t>
+      </w:r>
+      <w:r>
+        <w:rPr>
+          <w:rFonts w:ascii="Times New Roman" w:hAnsi="Times New Roman"/>
+          <w:sz w:val="18"/>
+        </w:rPr>
+        <w:t>DQN深度Q网络架构（211维状态 → 3层MLP → 400维动作价值）</w:t>
+      </w:r>
+    </w:p>
+    <w:p>
+      <w:pPr>
         <w:ind w:firstLine="420"/>
         <w:rPr>
           <w:lang w:eastAsia="zh-CN"/>
@@ -25223,6 +25528,67 @@
         <w:t>混合决策策略</w:t>
       </w:r>
       <w:bookmarkEnd w:id="35"/>
+    </w:p>
+    <w:p>
+      <w:pPr>
+        <w:spacing w:before="160" w:after="40"/>
+        <w:jc w:val="center"/>
+      </w:pPr>
+      <w:r>
+        <w:drawing>
+          <wp:inline xmlns:a="http://schemas.openxmlformats.org/drawingml/2006/main" xmlns:pic="http://schemas.openxmlformats.org/drawingml/2006/picture">
+            <wp:extent cx="5303520" cy="3568827"/>
+            <wp:docPr id="12" name="Picture 12"/>
+            <wp:cNvGraphicFramePr>
+              <a:graphicFrameLocks noChangeAspect="1"/>
+            </wp:cNvGraphicFramePr>
+            <a:graphic>
+              <a:graphicData uri="http://schemas.openxmlformats.org/drawingml/2006/picture">
+                <pic:pic>
+                  <pic:nvPicPr>
+                    <pic:cNvPr id="0" name="fig4_decision_flow.png"/>
+                    <pic:cNvPicPr/>
+                  </pic:nvPicPr>
+                  <pic:blipFill>
+                    <a:blip r:embed="rId18"/>
+                    <a:stretch>
+                      <a:fillRect/>
+                    </a:stretch>
+                  </pic:blipFill>
+                  <pic:spPr>
+                    <a:xfrm>
+                      <a:off x="0" y="0"/>
+                      <a:ext cx="5303520" cy="3568827"/>
+                    </a:xfrm>
+                    <a:prstGeom prst="rect"/>
+                  </pic:spPr>
+                </pic:pic>
+              </a:graphicData>
+            </a:graphic>
+          </wp:inline>
+        </w:drawing>
+      </w:r>
+    </w:p>
+    <w:p>
+      <w:pPr>
+        <w:spacing w:after="200"/>
+        <w:jc w:val="center"/>
+      </w:pPr>
+      <w:r>
+        <w:rPr>
+          <w:rFonts w:ascii="Times New Roman" w:hAnsi="Times New Roman"/>
+          <w:b/>
+          <w:sz w:val="18"/>
+        </w:rPr>
+        <w:t xml:space="preserve">图4-5  </w:t>
+      </w:r>
+      <w:r>
+        <w:rPr>
+          <w:rFonts w:ascii="Times New Roman" w:hAnsi="Times New Roman"/>
+          <w:sz w:val="18"/>
+        </w:rPr>
+        <w:t>混合决策策略流程（Dellacherie启发式筛选 + DQN长期价值优化）</w:t>
+      </w:r>
     </w:p>
     <w:p>
       <w:pPr>
@@ -30166,6 +30532,67 @@
     </w:p>
     <w:p>
       <w:pPr>
+        <w:spacing w:before="160" w:after="40"/>
+        <w:jc w:val="center"/>
+      </w:pPr>
+      <w:r>
+        <w:drawing>
+          <wp:inline xmlns:a="http://schemas.openxmlformats.org/drawingml/2006/main" xmlns:pic="http://schemas.openxmlformats.org/drawingml/2006/picture">
+            <wp:extent cx="5303520" cy="3355213"/>
+            <wp:docPr id="11" name="Picture 11"/>
+            <wp:cNvGraphicFramePr>
+              <a:graphicFrameLocks noChangeAspect="1"/>
+            </wp:cNvGraphicFramePr>
+            <a:graphic>
+              <a:graphicData uri="http://schemas.openxmlformats.org/drawingml/2006/picture">
+                <pic:pic>
+                  <pic:nvPicPr>
+                    <pic:cNvPr id="0" name="fig5_pick_place_sequence.png"/>
+                    <pic:cNvPicPr/>
+                  </pic:nvPicPr>
+                  <pic:blipFill>
+                    <a:blip r:embed="rId17"/>
+                    <a:stretch>
+                      <a:fillRect/>
+                    </a:stretch>
+                  </pic:blipFill>
+                  <pic:spPr>
+                    <a:xfrm>
+                      <a:off x="0" y="0"/>
+                      <a:ext cx="5303520" cy="3355213"/>
+                    </a:xfrm>
+                    <a:prstGeom prst="rect"/>
+                  </pic:spPr>
+                </pic:pic>
+              </a:graphicData>
+            </a:graphic>
+          </wp:inline>
+        </w:drawing>
+      </w:r>
+    </w:p>
+    <w:p>
+      <w:pPr>
+        <w:spacing w:after="200"/>
+        <w:jc w:val="center"/>
+      </w:pPr>
+      <w:r>
+        <w:rPr>
+          <w:rFonts w:ascii="Times New Roman" w:hAnsi="Times New Roman"/>
+          <w:b/>
+          <w:sz w:val="18"/>
+        </w:rPr>
+        <w:t xml:space="preserve">图4-6  </w:t>
+      </w:r>
+      <w:r>
+        <w:rPr>
+          <w:rFonts w:ascii="Times New Roman" w:hAnsi="Times New Roman"/>
+          <w:sz w:val="18"/>
+        </w:rPr>
+        <w:t>拾取-放置运动时序图（9.8s单次循环）</w:t>
+      </w:r>
+    </w:p>
+    <w:p>
+      <w:pPr>
         <w:ind w:firstLine="420"/>
         <w:rPr>
           <w:lang w:eastAsia="zh-CN"/>
@@ -30690,6 +31117,67 @@
     </w:p>
     <w:p>
       <w:pPr>
+        <w:spacing w:before="160" w:after="40"/>
+        <w:jc w:val="center"/>
+      </w:pPr>
+      <w:r>
+        <w:drawing>
+          <wp:inline xmlns:a="http://schemas.openxmlformats.org/drawingml/2006/main" xmlns:pic="http://schemas.openxmlformats.org/drawingml/2006/picture">
+            <wp:extent cx="4572000" cy="4572000"/>
+            <wp:docPr id="10" name="Picture 10"/>
+            <wp:cNvGraphicFramePr>
+              <a:graphicFrameLocks noChangeAspect="1"/>
+            </wp:cNvGraphicFramePr>
+            <a:graphic>
+              <a:graphicData uri="http://schemas.openxmlformats.org/drawingml/2006/picture">
+                <pic:pic>
+                  <pic:nvPicPr>
+                    <pic:cNvPr id="0" name="system_running.jpg"/>
+                    <pic:cNvPicPr/>
+                  </pic:nvPicPr>
+                  <pic:blipFill>
+                    <a:blip r:embed="rId16"/>
+                    <a:stretch>
+                      <a:fillRect/>
+                    </a:stretch>
+                  </pic:blipFill>
+                  <pic:spPr>
+                    <a:xfrm>
+                      <a:off x="0" y="0"/>
+                      <a:ext cx="4572000" cy="4572000"/>
+                    </a:xfrm>
+                    <a:prstGeom prst="rect"/>
+                  </pic:spPr>
+                </pic:pic>
+              </a:graphicData>
+            </a:graphic>
+          </wp:inline>
+        </w:drawing>
+      </w:r>
+    </w:p>
+    <w:p>
+      <w:pPr>
+        <w:spacing w:after="200"/>
+        <w:jc w:val="center"/>
+      </w:pPr>
+      <w:r>
+        <w:rPr>
+          <w:rFonts w:ascii="Times New Roman" w:hAnsi="Times New Roman"/>
+          <w:b/>
+          <w:sz w:val="18"/>
+        </w:rPr>
+        <w:t xml:space="preserve">图5-1  </w:t>
+      </w:r>
+      <w:r>
+        <w:rPr>
+          <w:rFonts w:ascii="Times New Roman" w:hAnsi="Times New Roman"/>
+          <w:sz w:val="18"/>
+        </w:rPr>
+        <w:t>系统整体运行场景（RM65-B机械臂 + D435相机 + 工作台）</w:t>
+      </w:r>
+    </w:p>
+    <w:p>
+      <w:pPr>
         <w:ind w:firstLine="420"/>
         <w:rPr>
           <w:lang w:eastAsia="zh-CN"/>
@@ -30949,6 +31437,67 @@
         <w:t>视觉识别性能</w:t>
       </w:r>
       <w:bookmarkEnd w:id="47"/>
+    </w:p>
+    <w:p>
+      <w:pPr>
+        <w:spacing w:before="160" w:after="40"/>
+        <w:jc w:val="center"/>
+      </w:pPr>
+      <w:r>
+        <w:drawing>
+          <wp:inline xmlns:a="http://schemas.openxmlformats.org/drawingml/2006/main" xmlns:pic="http://schemas.openxmlformats.org/drawingml/2006/picture">
+            <wp:extent cx="4572000" cy="2571750"/>
+            <wp:docPr id="9" name="Picture 9"/>
+            <wp:cNvGraphicFramePr>
+              <a:graphicFrameLocks noChangeAspect="1"/>
+            </wp:cNvGraphicFramePr>
+            <a:graphic>
+              <a:graphicData uri="http://schemas.openxmlformats.org/drawingml/2006/picture">
+                <pic:pic>
+                  <pic:nvPicPr>
+                    <pic:cNvPr id="0" name="recognition_diagram.jpg"/>
+                    <pic:cNvPicPr/>
+                  </pic:nvPicPr>
+                  <pic:blipFill>
+                    <a:blip r:embed="rId15"/>
+                    <a:stretch>
+                      <a:fillRect/>
+                    </a:stretch>
+                  </pic:blipFill>
+                  <pic:spPr>
+                    <a:xfrm>
+                      <a:off x="0" y="0"/>
+                      <a:ext cx="4572000" cy="2571750"/>
+                    </a:xfrm>
+                    <a:prstGeom prst="rect"/>
+                  </pic:spPr>
+                </pic:pic>
+              </a:graphicData>
+            </a:graphic>
+          </wp:inline>
+        </w:drawing>
+      </w:r>
+    </w:p>
+    <w:p>
+      <w:pPr>
+        <w:spacing w:after="200"/>
+        <w:jc w:val="center"/>
+      </w:pPr>
+      <w:r>
+        <w:rPr>
+          <w:rFonts w:ascii="Times New Roman" w:hAnsi="Times New Roman"/>
+          <w:b/>
+          <w:sz w:val="18"/>
+        </w:rPr>
+        <w:t xml:space="preserve">图5-2  </w:t>
+      </w:r>
+      <w:r>
+        <w:rPr>
+          <w:rFonts w:ascii="Times New Roman" w:hAnsi="Times New Roman"/>
+          <w:sz w:val="18"/>
+        </w:rPr>
+        <w:t>俄罗斯方块视觉识别效果（YOLOv8实例分割+分类标注）</w:t>
+      </w:r>
     </w:p>
     <w:p>
       <w:pPr>
@@ -32249,6 +32798,67 @@
     </w:p>
     <w:p>
       <w:pPr>
+        <w:spacing w:before="160" w:after="40"/>
+        <w:jc w:val="center"/>
+      </w:pPr>
+      <w:r>
+        <w:drawing>
+          <wp:inline xmlns:a="http://schemas.openxmlformats.org/drawingml/2006/main" xmlns:pic="http://schemas.openxmlformats.org/drawingml/2006/picture">
+            <wp:extent cx="4572000" cy="4572000"/>
+            <wp:docPr id="8" name="Picture 8"/>
+            <wp:cNvGraphicFramePr>
+              <a:graphicFrameLocks noChangeAspect="1"/>
+            </wp:cNvGraphicFramePr>
+            <a:graphic>
+              <a:graphicData uri="http://schemas.openxmlformats.org/drawingml/2006/picture">
+                <pic:pic>
+                  <pic:nvPicPr>
+                    <pic:cNvPr id="0" name="grasping_process.jpg"/>
+                    <pic:cNvPicPr/>
+                  </pic:nvPicPr>
+                  <pic:blipFill>
+                    <a:blip r:embed="rId14"/>
+                    <a:stretch>
+                      <a:fillRect/>
+                    </a:stretch>
+                  </pic:blipFill>
+                  <pic:spPr>
+                    <a:xfrm>
+                      <a:off x="0" y="0"/>
+                      <a:ext cx="4572000" cy="4572000"/>
+                    </a:xfrm>
+                    <a:prstGeom prst="rect"/>
+                  </pic:spPr>
+                </pic:pic>
+              </a:graphicData>
+            </a:graphic>
+          </wp:inline>
+        </w:drawing>
+      </w:r>
+    </w:p>
+    <w:p>
+      <w:pPr>
+        <w:spacing w:after="200"/>
+        <w:jc w:val="center"/>
+      </w:pPr>
+      <w:r>
+        <w:rPr>
+          <w:rFonts w:ascii="Times New Roman" w:hAnsi="Times New Roman"/>
+          <w:b/>
+          <w:sz w:val="18"/>
+        </w:rPr>
+        <w:t xml:space="preserve">图5-3  </w:t>
+      </w:r>
+      <w:r>
+        <w:rPr>
+          <w:rFonts w:ascii="Times New Roman" w:hAnsi="Times New Roman"/>
+          <w:sz w:val="18"/>
+        </w:rPr>
+        <w:t>气动吸盘精准拾取俄罗斯方块过程</w:t>
+      </w:r>
+    </w:p>
+    <w:p>
+      <w:pPr>
         <w:spacing w:before="120" w:after="80"/>
         <w:jc w:val="center"/>
         <w:rPr>
@@ -33941,6 +34551,67 @@
         <w:t>系统整体性能</w:t>
       </w:r>
       <w:bookmarkEnd w:id="50"/>
+    </w:p>
+    <w:p>
+      <w:pPr>
+        <w:spacing w:before="160" w:after="40"/>
+        <w:jc w:val="center"/>
+      </w:pPr>
+      <w:r>
+        <w:drawing>
+          <wp:inline xmlns:a="http://schemas.openxmlformats.org/drawingml/2006/main" xmlns:pic="http://schemas.openxmlformats.org/drawingml/2006/picture">
+            <wp:extent cx="4572000" cy="4572000"/>
+            <wp:docPr id="7" name="Picture 7"/>
+            <wp:cNvGraphicFramePr>
+              <a:graphicFrameLocks noChangeAspect="1"/>
+            </wp:cNvGraphicFramePr>
+            <a:graphic>
+              <a:graphicData uri="http://schemas.openxmlformats.org/drawingml/2006/picture">
+                <pic:pic>
+                  <pic:nvPicPr>
+                    <pic:cNvPr id="0" name="assembly_result.jpg"/>
+                    <pic:cNvPicPr/>
+                  </pic:nvPicPr>
+                  <pic:blipFill>
+                    <a:blip r:embed="rId13"/>
+                    <a:stretch>
+                      <a:fillRect/>
+                    </a:stretch>
+                  </pic:blipFill>
+                  <pic:spPr>
+                    <a:xfrm>
+                      <a:off x="0" y="0"/>
+                      <a:ext cx="4572000" cy="4572000"/>
+                    </a:xfrm>
+                    <a:prstGeom prst="rect"/>
+                  </pic:spPr>
+                </pic:pic>
+              </a:graphicData>
+            </a:graphic>
+          </wp:inline>
+        </w:drawing>
+      </w:r>
+    </w:p>
+    <w:p>
+      <w:pPr>
+        <w:spacing w:after="200"/>
+        <w:jc w:val="center"/>
+      </w:pPr>
+      <w:r>
+        <w:rPr>
+          <w:rFonts w:ascii="Times New Roman" w:hAnsi="Times New Roman"/>
+          <w:b/>
+          <w:sz w:val="18"/>
+        </w:rPr>
+        <w:t xml:space="preserve">图5-4  </w:t>
+      </w:r>
+      <w:r>
+        <w:rPr>
+          <w:rFonts w:ascii="Times New Roman" w:hAnsi="Times New Roman"/>
+          <w:sz w:val="18"/>
+        </w:rPr>
+        <w:t>35块俄罗斯方块全自动拼接完成效果</w:t>
+      </w:r>
     </w:p>
     <w:p>
       <w:pPr>

</xml_diff>

<commit_message>
Redesign diagrams in academic style and remove page breaks
- Regenerate all 7 technical diagrams with clean monochrome academic style
- Remove all 14 page breaks from document
- Fix figure numbering (no duplicates)
- Updated docx with consistent academic formatting

Co-Authored-By: Claude Opus 4.7 <noreply@anthropic.com>
</commit_message>
<xml_diff>
--- a/创意赛技术文档.docx
+++ b/创意赛技术文档.docx
@@ -177,7 +177,6 @@
         <w:rPr>
           <w:lang w:eastAsia="zh-CN"/>
         </w:rPr>
-        <w:br w:type="page"/>
       </w:r>
     </w:p>
     <w:p>
@@ -6935,7 +6934,6 @@
         <w:rPr>
           <w:lang w:eastAsia="zh-CN"/>
         </w:rPr>
-        <w:br w:type="page"/>
       </w:r>
     </w:p>
     <w:p>
@@ -7761,7 +7759,7 @@
       <w:r>
         <w:drawing>
           <wp:inline xmlns:a="http://schemas.openxmlformats.org/drawingml/2006/main" xmlns:pic="http://schemas.openxmlformats.org/drawingml/2006/picture">
-            <wp:extent cx="5303520" cy="3780600"/>
+            <wp:extent cx="5303520" cy="3586710"/>
             <wp:docPr id="17" name="Picture 17"/>
             <wp:cNvGraphicFramePr>
               <a:graphicFrameLocks noChangeAspect="1"/>
@@ -7782,7 +7780,7 @@
                   <pic:spPr>
                     <a:xfrm>
                       <a:off x="0" y="0"/>
-                      <a:ext cx="5303520" cy="3780600"/>
+                      <a:ext cx="5303520" cy="3586710"/>
                     </a:xfrm>
                     <a:prstGeom prst="rect"/>
                   </pic:spPr>
@@ -8563,9 +8561,7 @@
     </w:tbl>
     <w:p/>
     <w:p>
-      <w:r>
-        <w:br w:type="page"/>
-      </w:r>
+      <w:r/>
     </w:p>
     <w:p>
       <w:pPr>
@@ -12025,7 +12021,7 @@
       <w:r>
         <w:drawing>
           <wp:inline xmlns:a="http://schemas.openxmlformats.org/drawingml/2006/main" xmlns:pic="http://schemas.openxmlformats.org/drawingml/2006/picture">
-            <wp:extent cx="5029200" cy="3682127"/>
+            <wp:extent cx="5029200" cy="3479297"/>
             <wp:docPr id="16" name="Picture 16"/>
             <wp:cNvGraphicFramePr>
               <a:graphicFrameLocks noChangeAspect="1"/>
@@ -12046,7 +12042,7 @@
                   <pic:spPr>
                     <a:xfrm>
                       <a:off x="0" y="0"/>
-                      <a:ext cx="5029200" cy="3682127"/>
+                      <a:ext cx="5029200" cy="3479297"/>
                     </a:xfrm>
                     <a:prstGeom prst="rect"/>
                   </pic:spPr>
@@ -12507,9 +12503,7 @@
       </w:r>
     </w:p>
     <w:p>
-      <w:r>
-        <w:br w:type="page"/>
-      </w:r>
+      <w:r/>
     </w:p>
     <w:p>
       <w:pPr>
@@ -14862,7 +14856,6 @@
         <w:rPr>
           <w:lang w:eastAsia="zh-CN"/>
         </w:rPr>
-        <w:br w:type="page"/>
       </w:r>
     </w:p>
     <w:p>
@@ -16472,7 +16465,7 @@
       <w:r>
         <w:drawing>
           <wp:inline xmlns:a="http://schemas.openxmlformats.org/drawingml/2006/main" xmlns:pic="http://schemas.openxmlformats.org/drawingml/2006/picture">
-            <wp:extent cx="4846320" cy="3656313"/>
+            <wp:extent cx="4846320" cy="3287020"/>
             <wp:docPr id="15" name="Picture 15"/>
             <wp:cNvGraphicFramePr>
               <a:graphicFrameLocks noChangeAspect="1"/>
@@ -16493,7 +16486,7 @@
                   <pic:spPr>
                     <a:xfrm>
                       <a:off x="0" y="0"/>
-                      <a:ext cx="4846320" cy="3656313"/>
+                      <a:ext cx="4846320" cy="3287020"/>
                     </a:xfrm>
                     <a:prstGeom prst="rect"/>
                   </pic:spPr>
@@ -18141,7 +18134,6 @@
         <w:rPr>
           <w:lang w:eastAsia="zh-CN"/>
         </w:rPr>
-        <w:br w:type="page"/>
       </w:r>
     </w:p>
     <w:p>
@@ -19566,7 +19558,7 @@
       <w:r>
         <w:drawing>
           <wp:inline xmlns:a="http://schemas.openxmlformats.org/drawingml/2006/main" xmlns:pic="http://schemas.openxmlformats.org/drawingml/2006/picture">
-            <wp:extent cx="5303520" cy="3355213"/>
+            <wp:extent cx="5303520" cy="2806727"/>
             <wp:docPr id="14" name="Picture 14"/>
             <wp:cNvGraphicFramePr>
               <a:graphicFrameLocks noChangeAspect="1"/>
@@ -19587,7 +19579,7 @@
                   <pic:spPr>
                     <a:xfrm>
                       <a:off x="0" y="0"/>
-                      <a:ext cx="5303520" cy="3355213"/>
+                      <a:ext cx="5303520" cy="2806727"/>
                     </a:xfrm>
                     <a:prstGeom prst="rect"/>
                   </pic:spPr>
@@ -20799,7 +20791,6 @@
         <w:rPr>
           <w:lang w:eastAsia="zh-CN"/>
         </w:rPr>
-        <w:br w:type="page"/>
       </w:r>
     </w:p>
     <w:p>
@@ -23446,7 +23437,7 @@
       <w:r>
         <w:drawing>
           <wp:inline xmlns:a="http://schemas.openxmlformats.org/drawingml/2006/main" xmlns:pic="http://schemas.openxmlformats.org/drawingml/2006/picture">
-            <wp:extent cx="5303520" cy="3355213"/>
+            <wp:extent cx="5303520" cy="3375299"/>
             <wp:docPr id="13" name="Picture 13"/>
             <wp:cNvGraphicFramePr>
               <a:graphicFrameLocks noChangeAspect="1"/>
@@ -23467,7 +23458,7 @@
                   <pic:spPr>
                     <a:xfrm>
                       <a:off x="0" y="0"/>
-                      <a:ext cx="5303520" cy="3355213"/>
+                      <a:ext cx="5303520" cy="3375299"/>
                     </a:xfrm>
                     <a:prstGeom prst="rect"/>
                   </pic:spPr>
@@ -25537,7 +25528,7 @@
       <w:r>
         <w:drawing>
           <wp:inline xmlns:a="http://schemas.openxmlformats.org/drawingml/2006/main" xmlns:pic="http://schemas.openxmlformats.org/drawingml/2006/picture">
-            <wp:extent cx="5303520" cy="3568827"/>
+            <wp:extent cx="5303520" cy="3586710"/>
             <wp:docPr id="12" name="Picture 12"/>
             <wp:cNvGraphicFramePr>
               <a:graphicFrameLocks noChangeAspect="1"/>
@@ -25558,7 +25549,7 @@
                   <pic:spPr>
                     <a:xfrm>
                       <a:off x="0" y="0"/>
-                      <a:ext cx="5303520" cy="3568827"/>
+                      <a:ext cx="5303520" cy="3586710"/>
                     </a:xfrm>
                     <a:prstGeom prst="rect"/>
                   </pic:spPr>
@@ -25769,7 +25760,6 @@
         <w:rPr>
           <w:lang w:eastAsia="zh-CN"/>
         </w:rPr>
-        <w:br w:type="page"/>
       </w:r>
     </w:p>
     <w:p>
@@ -29175,7 +29165,6 @@
         <w:rPr>
           <w:lang w:eastAsia="zh-CN"/>
         </w:rPr>
-        <w:br w:type="page"/>
       </w:r>
     </w:p>
     <w:p>
@@ -30496,7 +30485,6 @@
         <w:rPr>
           <w:lang w:eastAsia="zh-CN"/>
         </w:rPr>
-        <w:br w:type="page"/>
       </w:r>
     </w:p>
     <w:p>
@@ -30538,7 +30526,7 @@
       <w:r>
         <w:drawing>
           <wp:inline xmlns:a="http://schemas.openxmlformats.org/drawingml/2006/main" xmlns:pic="http://schemas.openxmlformats.org/drawingml/2006/picture">
-            <wp:extent cx="5303520" cy="3355213"/>
+            <wp:extent cx="5303520" cy="3165709"/>
             <wp:docPr id="11" name="Picture 11"/>
             <wp:cNvGraphicFramePr>
               <a:graphicFrameLocks noChangeAspect="1"/>
@@ -30559,7 +30547,7 @@
                   <pic:spPr>
                     <a:xfrm>
                       <a:off x="0" y="0"/>
-                      <a:ext cx="5303520" cy="3355213"/>
+                      <a:ext cx="5303520" cy="3165709"/>
                     </a:xfrm>
                     <a:prstGeom prst="rect"/>
                   </pic:spPr>
@@ -31051,7 +31039,6 @@
           <w:lang w:eastAsia="zh-CN"/>
         </w:rPr>
         <w:lastRenderedPageBreak/>
-        <w:br w:type="page"/>
       </w:r>
     </w:p>
     <w:p>
@@ -35504,9 +35491,7 @@
     </w:tbl>
     <w:p/>
     <w:p>
-      <w:r>
-        <w:br w:type="page"/>
-      </w:r>
+      <w:r/>
     </w:p>
     <w:p>
       <w:pPr>
@@ -37155,7 +37140,6 @@
         <w:rPr>
           <w:lang w:eastAsia="zh-CN"/>
         </w:rPr>
-        <w:br w:type="page"/>
       </w:r>
     </w:p>
     <w:p>
@@ -37388,9 +37372,7 @@
       </w:r>
     </w:p>
     <w:p>
-      <w:r>
-        <w:br w:type="page"/>
-      </w:r>
+      <w:r/>
     </w:p>
     <w:p>
       <w:pPr>

</xml_diff>

<commit_message>
Add school badge to cover, fix page layout, trim appendix code
- Insert Wuhan University badge on cover page
- Add page breaks: cover|TOC|Abstract|Ch1-6|References|Appendix (10 total)
- Trim appendix code listings to 25 lines each
- Remove all content-level page breaks
- Copy school_badge.png to assets/images/

Co-Authored-By: Claude Opus 4.7 <noreply@anthropic.com>
</commit_message>
<xml_diff>
--- a/创意赛技术文档.docx
+++ b/创意赛技术文档.docx
@@ -4,8 +4,14 @@
   <w:body>
     <w:p/>
     <w:p/>
-    <w:p/>
-    <w:p/>
+    <w:p>
+      <w:pPr>
+        <w:rPr>
+          <w:rFonts w:hint="eastAsia"/>
+          <w:lang w:eastAsia="zh-CN"/>
+        </w:rPr>
+      </w:pPr>
+    </w:p>
     <w:p/>
     <w:p/>
     <w:p>
@@ -36,47 +42,108 @@
       <w:pPr>
         <w:jc w:val="center"/>
         <w:rPr>
-          <w:lang w:eastAsia="zh-CN"/>
-        </w:rPr>
-      </w:pPr>
-      <w:r>
-        <w:rPr>
           <w:rFonts w:ascii="黑体" w:eastAsia="黑体" w:hAnsi="黑体"/>
           <w:sz w:val="36"/>
           <w:lang w:eastAsia="zh-CN"/>
         </w:rPr>
-        <w:t>专项赛</w:t>
-      </w:r>
-      <w:proofErr w:type="gramStart"/>
+      </w:pPr>
       <w:r>
         <w:rPr>
           <w:rFonts w:ascii="黑体" w:eastAsia="黑体" w:hAnsi="黑体"/>
           <w:sz w:val="36"/>
           <w:lang w:eastAsia="zh-CN"/>
         </w:rPr>
-        <w:t>一</w:t>
-      </w:r>
-      <w:proofErr w:type="gramEnd"/>
+        <w:t>专项赛</w:t>
+      </w:r>
+      <w:proofErr w:type="gramStart"/>
       <w:r>
         <w:rPr>
           <w:rFonts w:ascii="黑体" w:eastAsia="黑体" w:hAnsi="黑体"/>
           <w:sz w:val="36"/>
           <w:lang w:eastAsia="zh-CN"/>
         </w:rPr>
-        <w:t xml:space="preserve">  基于ROS的单臂机器人</w:t>
-      </w:r>
+        <w:t>一</w:t>
+      </w:r>
+      <w:proofErr w:type="gramEnd"/>
       <w:r>
         <w:rPr>
           <w:rFonts w:ascii="黑体" w:eastAsia="黑体" w:hAnsi="黑体"/>
           <w:sz w:val="36"/>
           <w:lang w:eastAsia="zh-CN"/>
         </w:rPr>
+        <w:t xml:space="preserve">  基于ROS的单臂机器人</w:t>
+      </w:r>
+      <w:r>
+        <w:rPr>
+          <w:rFonts w:ascii="黑体" w:eastAsia="黑体" w:hAnsi="黑体"/>
+          <w:sz w:val="36"/>
+          <w:lang w:eastAsia="zh-CN"/>
+        </w:rPr>
         <w:br/>
         <w:t>——俄罗斯方块自动化拼接系统</w:t>
       </w:r>
     </w:p>
     <w:p>
       <w:pPr>
+        <w:spacing w:before="120" w:after="120"/>
+        <w:jc w:val="center"/>
+      </w:pPr>
+      <w:r>
+        <w:drawing>
+          <wp:inline xmlns:a="http://schemas.openxmlformats.org/drawingml/2006/main" xmlns:pic="http://schemas.openxmlformats.org/drawingml/2006/picture">
+            <wp:extent cx="1188720" cy="1188058"/>
+            <wp:docPr id="18" name="Picture 18"/>
+            <wp:cNvGraphicFramePr>
+              <a:graphicFrameLocks noChangeAspect="1"/>
+            </wp:cNvGraphicFramePr>
+            <a:graphic>
+              <a:graphicData uri="http://schemas.openxmlformats.org/drawingml/2006/picture">
+                <pic:pic>
+                  <pic:nvPicPr>
+                    <pic:cNvPr id="0" name="school_badge.png"/>
+                    <pic:cNvPicPr/>
+                  </pic:nvPicPr>
+                  <pic:blipFill>
+                    <a:blip r:embed="rId24"/>
+                    <a:stretch>
+                      <a:fillRect/>
+                    </a:stretch>
+                  </pic:blipFill>
+                  <pic:spPr>
+                    <a:xfrm>
+                      <a:off x="0" y="0"/>
+                      <a:ext cx="1188720" cy="1188058"/>
+                    </a:xfrm>
+                    <a:prstGeom prst="rect"/>
+                  </pic:spPr>
+                </pic:pic>
+              </a:graphicData>
+            </a:graphic>
+          </wp:inline>
+        </w:drawing>
+      </w:r>
+    </w:p>
+    <w:p>
+      <w:pPr>
+        <w:jc w:val="center"/>
+        <w:rPr>
+          <w:rFonts w:ascii="黑体" w:eastAsia="黑体" w:hAnsi="黑体"/>
+          <w:sz w:val="36"/>
+          <w:lang w:eastAsia="zh-CN"/>
+        </w:rPr>
+      </w:pPr>
+    </w:p>
+    <w:p>
+      <w:pPr>
+        <w:jc w:val="center"/>
+        <w:rPr>
+          <w:rFonts w:hint="eastAsia"/>
+          <w:lang w:eastAsia="zh-CN"/>
+        </w:rPr>
+      </w:pPr>
+    </w:p>
+    <w:p>
+      <w:pPr>
         <w:rPr>
           <w:lang w:eastAsia="zh-CN"/>
         </w:rPr>
@@ -139,15 +206,17 @@
       <w:pPr>
         <w:jc w:val="center"/>
         <w:rPr>
-          <w:lang w:eastAsia="zh-CN"/>
-        </w:rPr>
-      </w:pPr>
-      <w:r>
-        <w:rPr>
           <w:rFonts w:ascii="宋体" w:hAnsi="宋体"/>
           <w:sz w:val="28"/>
           <w:lang w:eastAsia="zh-CN"/>
         </w:rPr>
+      </w:pPr>
+      <w:r>
+        <w:rPr>
+          <w:rFonts w:ascii="宋体" w:hAnsi="宋体"/>
+          <w:sz w:val="28"/>
+          <w:lang w:eastAsia="zh-CN"/>
+        </w:rPr>
         <w:t>版本号：</w:t>
       </w:r>
       <w:r>
@@ -169,35 +238,44 @@
     </w:p>
     <w:p>
       <w:pPr>
-        <w:rPr>
-          <w:lang w:eastAsia="zh-CN"/>
-        </w:rPr>
-      </w:pPr>
-      <w:r>
-        <w:rPr>
-          <w:lang w:eastAsia="zh-CN"/>
-        </w:rPr>
-      </w:r>
+        <w:jc w:val="center"/>
+        <w:rPr>
+          <w:rFonts w:ascii="宋体" w:hAnsi="宋体"/>
+          <w:sz w:val="28"/>
+          <w:lang w:eastAsia="zh-CN"/>
+        </w:rPr>
+      </w:pPr>
+    </w:p>
+    <w:p>
+      <w:pPr>
+        <w:rPr>
+          <w:rFonts w:hint="eastAsia"/>
+          <w:lang w:eastAsia="zh-CN"/>
+        </w:rPr>
+      </w:pPr>
     </w:p>
     <w:p>
       <w:pPr>
         <w:pStyle w:val="1"/>
         <w:spacing w:before="360" w:after="240" w:line="300" w:lineRule="auto"/>
         <w:jc w:val="left"/>
+        <w:rPr>
+          <w:lang w:eastAsia="zh-CN"/>
+        </w:rPr>
+        <w:br w:type="page"/>
       </w:pPr>
       <w:bookmarkStart w:id="0" w:name="_Toc229276436"/>
-      <w:proofErr w:type="spellStart"/>
       <w:r>
         <w:rPr>
           <w:rFonts w:ascii="Times New Roman" w:eastAsia="宋体" w:hAnsi="Times New Roman"/>
           <w:color w:val="000000"/>
           <w:sz w:val="32"/>
+          <w:lang w:eastAsia="zh-CN"/>
         </w:rPr>
         <w:lastRenderedPageBreak/>
         <w:t>目录</w:t>
       </w:r>
       <w:bookmarkEnd w:id="0"/>
-      <w:proofErr w:type="spellEnd"/>
     </w:p>
     <w:p>
       <w:pPr>
@@ -6511,6 +6589,7 @@
         <w:rPr>
           <w:lang w:eastAsia="zh-CN"/>
         </w:rPr>
+        <w:br w:type="page"/>
       </w:pPr>
       <w:bookmarkStart w:id="1" w:name="_Toc229276437"/>
       <w:r>
@@ -6930,11 +7009,14 @@
           <w:lang w:eastAsia="zh-CN"/>
         </w:rPr>
       </w:pPr>
-      <w:r>
-        <w:rPr>
-          <w:lang w:eastAsia="zh-CN"/>
-        </w:rPr>
-      </w:r>
+    </w:p>
+    <w:p>
+      <w:pPr>
+        <w:rPr>
+          <w:rFonts w:hint="eastAsia"/>
+          <w:lang w:eastAsia="zh-CN"/>
+        </w:rPr>
+      </w:pPr>
     </w:p>
     <w:p>
       <w:pPr>
@@ -6944,6 +7026,7 @@
         <w:rPr>
           <w:lang w:eastAsia="zh-CN"/>
         </w:rPr>
+        <w:br w:type="page"/>
       </w:pPr>
       <w:bookmarkStart w:id="2" w:name="_Toc229276438"/>
       <w:r>
@@ -7757,22 +7840,27 @@
         <w:jc w:val="center"/>
       </w:pPr>
       <w:r>
+        <w:rPr>
+          <w:noProof/>
+        </w:rPr>
+        <w:lastRenderedPageBreak/>
         <w:drawing>
-          <wp:inline xmlns:a="http://schemas.openxmlformats.org/drawingml/2006/main" xmlns:pic="http://schemas.openxmlformats.org/drawingml/2006/picture">
+          <wp:inline distT="0" distB="0" distL="0" distR="0" wp14:anchorId="27E8AB72" wp14:editId="2405F156">
             <wp:extent cx="5303520" cy="3586710"/>
+            <wp:effectExtent l="0" t="0" r="0" b="0"/>
             <wp:docPr id="17" name="Picture 17"/>
             <wp:cNvGraphicFramePr>
-              <a:graphicFrameLocks noChangeAspect="1"/>
+              <a:graphicFrameLocks xmlns:a="http://schemas.openxmlformats.org/drawingml/2006/main" noChangeAspect="1"/>
             </wp:cNvGraphicFramePr>
-            <a:graphic>
+            <a:graphic xmlns:a="http://schemas.openxmlformats.org/drawingml/2006/main">
               <a:graphicData uri="http://schemas.openxmlformats.org/drawingml/2006/picture">
-                <pic:pic>
+                <pic:pic xmlns:pic="http://schemas.openxmlformats.org/drawingml/2006/picture">
                   <pic:nvPicPr>
                     <pic:cNvPr id="0" name="fig1_system_architecture.png"/>
                     <pic:cNvPicPr/>
                   </pic:nvPicPr>
                   <pic:blipFill>
-                    <a:blip r:embed="rId23"/>
+                    <a:blip r:embed="rId7"/>
                     <a:stretch>
                       <a:fillRect/>
                     </a:stretch>
@@ -7782,7 +7870,9 @@
                       <a:off x="0" y="0"/>
                       <a:ext cx="5303520" cy="3586710"/>
                     </a:xfrm>
-                    <a:prstGeom prst="rect"/>
+                    <a:prstGeom prst="rect">
+                      <a:avLst/>
+                    </a:prstGeom>
                   </pic:spPr>
                 </pic:pic>
               </a:graphicData>
@@ -7795,21 +7885,76 @@
       <w:pPr>
         <w:spacing w:after="200"/>
         <w:jc w:val="center"/>
-      </w:pPr>
-      <w:r>
-        <w:rPr>
-          <w:rFonts w:ascii="Times New Roman" w:hAnsi="Times New Roman"/>
+        <w:rPr>
+          <w:lang w:eastAsia="zh-CN"/>
+        </w:rPr>
+      </w:pPr>
+      <w:r>
+        <w:rPr>
           <w:b/>
           <w:sz w:val="18"/>
-        </w:rPr>
-        <w:t xml:space="preserve">图1-2  </w:t>
-      </w:r>
-      <w:r>
-        <w:rPr>
-          <w:rFonts w:ascii="Times New Roman" w:hAnsi="Times New Roman"/>
+          <w:lang w:eastAsia="zh-CN"/>
+        </w:rPr>
+        <w:t>图</w:t>
+      </w:r>
+      <w:r>
+        <w:rPr>
+          <w:b/>
           <w:sz w:val="18"/>
-        </w:rPr>
-        <w:t>系统总体架构图（感知→决策→执行三层递阶架构）</w:t>
+          <w:lang w:eastAsia="zh-CN"/>
+        </w:rPr>
+        <w:t xml:space="preserve">1-2  </w:t>
+      </w:r>
+      <w:r>
+        <w:rPr>
+          <w:sz w:val="18"/>
+          <w:lang w:eastAsia="zh-CN"/>
+        </w:rPr>
+        <w:t>系统总体架构图（感知</w:t>
+      </w:r>
+      <w:r>
+        <w:rPr>
+          <w:sz w:val="18"/>
+          <w:lang w:eastAsia="zh-CN"/>
+        </w:rPr>
+        <w:t>→</w:t>
+      </w:r>
+      <w:r>
+        <w:rPr>
+          <w:sz w:val="18"/>
+          <w:lang w:eastAsia="zh-CN"/>
+        </w:rPr>
+        <w:t>决策</w:t>
+      </w:r>
+      <w:r>
+        <w:rPr>
+          <w:sz w:val="18"/>
+          <w:lang w:eastAsia="zh-CN"/>
+        </w:rPr>
+        <w:t>→</w:t>
+      </w:r>
+      <w:r>
+        <w:rPr>
+          <w:sz w:val="18"/>
+          <w:lang w:eastAsia="zh-CN"/>
+        </w:rPr>
+        <w:t>执行</w:t>
+      </w:r>
+      <w:proofErr w:type="gramStart"/>
+      <w:r>
+        <w:rPr>
+          <w:sz w:val="18"/>
+          <w:lang w:eastAsia="zh-CN"/>
+        </w:rPr>
+        <w:t>三层递阶架构</w:t>
+      </w:r>
+      <w:proofErr w:type="gramEnd"/>
+      <w:r>
+        <w:rPr>
+          <w:sz w:val="18"/>
+          <w:lang w:eastAsia="zh-CN"/>
+        </w:rPr>
+        <w:t>）</w:t>
       </w:r>
     </w:p>
     <w:p>
@@ -8011,7 +8156,6 @@
                 <w:rFonts w:ascii="宋体" w:hAnsi="宋体"/>
                 <w:sz w:val="20"/>
               </w:rPr>
-              <w:lastRenderedPageBreak/>
               <w:t>视觉识别</w:t>
             </w:r>
           </w:p>
@@ -8559,15 +8703,23 @@
         </w:tc>
       </w:tr>
     </w:tbl>
-    <w:p/>
-    <w:p>
-      <w:r/>
+    <w:p>
+      <w:pPr>
+        <w:rPr>
+          <w:rFonts w:hint="eastAsia"/>
+          <w:lang w:eastAsia="zh-CN"/>
+        </w:rPr>
+      </w:pPr>
     </w:p>
     <w:p>
       <w:pPr>
         <w:pStyle w:val="1"/>
         <w:spacing w:before="360" w:after="240" w:line="300" w:lineRule="auto"/>
         <w:jc w:val="left"/>
+        <w:rPr>
+          <w:lang w:eastAsia="zh-CN"/>
+        </w:rPr>
+        <w:br w:type="page"/>
       </w:pPr>
       <w:bookmarkStart w:id="6" w:name="_Toc229276442"/>
       <w:r>
@@ -8575,8 +8727,8 @@
           <w:rFonts w:ascii="Times New Roman" w:eastAsia="宋体" w:hAnsi="Times New Roman"/>
           <w:color w:val="000000"/>
           <w:sz w:val="32"/>
-        </w:rPr>
-        <w:lastRenderedPageBreak/>
+          <w:lang w:eastAsia="zh-CN"/>
+        </w:rPr>
         <w:t xml:space="preserve">2. </w:t>
       </w:r>
       <w:r>
@@ -8584,6 +8736,7 @@
           <w:rFonts w:ascii="Times New Roman" w:eastAsia="宋体" w:hAnsi="Times New Roman"/>
           <w:color w:val="000000"/>
           <w:sz w:val="32"/>
+          <w:lang w:eastAsia="zh-CN"/>
         </w:rPr>
         <w:t>硬件与软件平台</w:t>
       </w:r>
@@ -8594,6 +8747,9 @@
         <w:pStyle w:val="21"/>
         <w:spacing w:before="240" w:after="160" w:line="300" w:lineRule="auto"/>
         <w:jc w:val="left"/>
+        <w:rPr>
+          <w:lang w:eastAsia="zh-CN"/>
+        </w:rPr>
       </w:pPr>
       <w:bookmarkStart w:id="7" w:name="_Toc229276443"/>
       <w:r>
@@ -8601,6 +8757,7 @@
           <w:rFonts w:ascii="Times New Roman" w:eastAsia="宋体" w:hAnsi="Times New Roman"/>
           <w:color w:val="000000"/>
           <w:sz w:val="28"/>
+          <w:lang w:eastAsia="zh-CN"/>
         </w:rPr>
         <w:t xml:space="preserve">2.1 </w:t>
       </w:r>
@@ -8609,6 +8766,7 @@
           <w:rFonts w:ascii="Times New Roman" w:eastAsia="宋体" w:hAnsi="Times New Roman"/>
           <w:color w:val="000000"/>
           <w:sz w:val="28"/>
+          <w:lang w:eastAsia="zh-CN"/>
         </w:rPr>
         <w:t>硬件配置与选型论证</w:t>
       </w:r>
@@ -12019,32 +12177,47 @@
         <w:jc w:val="center"/>
       </w:pPr>
       <w:r>
+        <w:rPr>
+          <w:noProof/>
+        </w:rPr>
         <w:drawing>
-          <wp:inline xmlns:a="http://schemas.openxmlformats.org/drawingml/2006/main" xmlns:pic="http://schemas.openxmlformats.org/drawingml/2006/picture">
-            <wp:extent cx="5029200" cy="3479297"/>
+          <wp:inline distT="0" distB="0" distL="0" distR="0" wp14:anchorId="13082598" wp14:editId="02EC347A">
+            <wp:extent cx="5029009" cy="2394642"/>
+            <wp:effectExtent l="0" t="0" r="635" b="5715"/>
             <wp:docPr id="16" name="Picture 16"/>
             <wp:cNvGraphicFramePr>
-              <a:graphicFrameLocks noChangeAspect="1"/>
+              <a:graphicFrameLocks xmlns:a="http://schemas.openxmlformats.org/drawingml/2006/main" noChangeAspect="1"/>
             </wp:cNvGraphicFramePr>
-            <a:graphic>
+            <a:graphic xmlns:a="http://schemas.openxmlformats.org/drawingml/2006/main">
               <a:graphicData uri="http://schemas.openxmlformats.org/drawingml/2006/picture">
-                <pic:pic>
+                <pic:pic xmlns:pic="http://schemas.openxmlformats.org/drawingml/2006/picture">
                   <pic:nvPicPr>
                     <pic:cNvPr id="0" name="fig2_ros_node_graph.png"/>
                     <pic:cNvPicPr/>
                   </pic:nvPicPr>
-                  <pic:blipFill>
-                    <a:blip r:embed="rId22"/>
+                  <pic:blipFill rotWithShape="1">
+                    <a:blip r:embed="rId8"/>
+                    <a:srcRect b="31298"/>
                     <a:stretch>
                       <a:fillRect/>
                     </a:stretch>
                   </pic:blipFill>
-                  <pic:spPr>
+                  <pic:spPr bwMode="auto">
                     <a:xfrm>
                       <a:off x="0" y="0"/>
-                      <a:ext cx="5029200" cy="3479297"/>
+                      <a:ext cx="5029200" cy="2394733"/>
                     </a:xfrm>
-                    <a:prstGeom prst="rect"/>
+                    <a:prstGeom prst="rect">
+                      <a:avLst/>
+                    </a:prstGeom>
+                    <a:ln>
+                      <a:noFill/>
+                    </a:ln>
+                    <a:extLst>
+                      <a:ext uri="{53640926-AAD7-44D8-BBD7-CCE9431645EC}">
+                        <a14:shadowObscured xmlns:a14="http://schemas.microsoft.com/office/drawing/2010/main"/>
+                      </a:ext>
+                    </a:extLst>
                   </pic:spPr>
                 </pic:pic>
               </a:graphicData>
@@ -12057,21 +12230,53 @@
       <w:pPr>
         <w:spacing w:after="200"/>
         <w:jc w:val="center"/>
-      </w:pPr>
-      <w:r>
-        <w:rPr>
-          <w:rFonts w:ascii="Times New Roman" w:hAnsi="Times New Roman"/>
+        <w:rPr>
+          <w:lang w:eastAsia="zh-CN"/>
+        </w:rPr>
+      </w:pPr>
+      <w:r>
+        <w:rPr>
           <w:b/>
           <w:sz w:val="18"/>
-        </w:rPr>
-        <w:t xml:space="preserve">图2-1  </w:t>
-      </w:r>
-      <w:r>
-        <w:rPr>
-          <w:rFonts w:ascii="Times New Roman" w:hAnsi="Times New Roman"/>
+          <w:lang w:eastAsia="zh-CN"/>
+        </w:rPr>
+        <w:t>图</w:t>
+      </w:r>
+      <w:r>
+        <w:rPr>
+          <w:b/>
           <w:sz w:val="18"/>
-        </w:rPr>
-        <w:t>ROS节点通信架构图（核心节点与话题/服务关系）</w:t>
+          <w:lang w:eastAsia="zh-CN"/>
+        </w:rPr>
+        <w:t xml:space="preserve">2-1  </w:t>
+      </w:r>
+      <w:r>
+        <w:rPr>
+          <w:sz w:val="18"/>
+          <w:lang w:eastAsia="zh-CN"/>
+        </w:rPr>
+        <w:t>ROS</w:t>
+      </w:r>
+      <w:r>
+        <w:rPr>
+          <w:sz w:val="18"/>
+          <w:lang w:eastAsia="zh-CN"/>
+        </w:rPr>
+        <w:t>节点通信架构图（核心节点与话题</w:t>
+      </w:r>
+      <w:r>
+        <w:rPr>
+          <w:sz w:val="18"/>
+          <w:lang w:eastAsia="zh-CN"/>
+        </w:rPr>
+        <w:t>/</w:t>
+      </w:r>
+      <w:r>
+        <w:rPr>
+          <w:sz w:val="18"/>
+          <w:lang w:eastAsia="zh-CN"/>
+        </w:rPr>
+        <w:t>服务关系）</w:t>
       </w:r>
     </w:p>
     <w:p>
@@ -12308,6 +12513,7 @@
         </w:rPr>
       </w:pPr>
       <w:r>
+        <w:lastRenderedPageBreak/>
         <w:t xml:space="preserve">(3) </w:t>
       </w:r>
       <w:r>
@@ -12502,9 +12708,7 @@
         <w:t>分级过滤）。</w:t>
       </w:r>
     </w:p>
-    <w:p>
-      <w:r/>
-    </w:p>
+    <w:p/>
     <w:p>
       <w:pPr>
         <w:pStyle w:val="1"/>
@@ -12513,6 +12717,7 @@
         <w:rPr>
           <w:lang w:eastAsia="zh-CN"/>
         </w:rPr>
+        <w:br w:type="page"/>
       </w:pPr>
       <w:bookmarkStart w:id="15" w:name="_Toc229276451"/>
       <w:r>
@@ -12522,7 +12727,6 @@
           <w:sz w:val="32"/>
           <w:lang w:eastAsia="zh-CN"/>
         </w:rPr>
-        <w:lastRenderedPageBreak/>
         <w:t xml:space="preserve">3. </w:t>
       </w:r>
       <w:r>
@@ -12983,7 +13187,11 @@
         <w:t>模式编译（启用</w:t>
       </w:r>
       <w:r>
-        <w:t>-O3</w:t>
+        <w:t>-</w:t>
+      </w:r>
+      <w:r>
+        <w:lastRenderedPageBreak/>
+        <w:t>O3</w:t>
       </w:r>
       <w:r>
         <w:t>优化与</w:t>
@@ -13266,11 +13474,7 @@
         <w:t>robot_description</w:t>
       </w:r>
       <w:r>
-        <w:t>参数），初始</w:t>
-      </w:r>
-      <w:r>
-        <w:lastRenderedPageBreak/>
-        <w:t>化</w:t>
+        <w:t>参数），初始化</w:t>
       </w:r>
       <w:r>
         <w:t>CAN</w:t>
@@ -13610,7 +13814,14 @@
         <w:rPr>
           <w:lang w:eastAsia="zh-CN"/>
         </w:rPr>
-        <w:t>）与运动速度比例（</w:t>
+        <w:t>）与运动</w:t>
+      </w:r>
+      <w:r>
+        <w:rPr>
+          <w:lang w:eastAsia="zh-CN"/>
+        </w:rPr>
+        <w:lastRenderedPageBreak/>
+        <w:t>速度比例（</w:t>
       </w:r>
       <w:r>
         <w:rPr>
@@ -13792,7 +14003,6 @@
           <w:color w:val="000000"/>
           <w:sz w:val="28"/>
         </w:rPr>
-        <w:lastRenderedPageBreak/>
         <w:t xml:space="preserve">3.4 </w:t>
       </w:r>
       <w:proofErr w:type="spellStart"/>
@@ -14171,6 +14381,14 @@
                 <w:lang w:eastAsia="zh-CN"/>
               </w:rPr>
               <w:br/>
+            </w:r>
+            <w:r>
+              <w:rPr>
+                <w:rFonts w:ascii="宋体" w:hAnsi="宋体"/>
+                <w:sz w:val="20"/>
+                <w:lang w:eastAsia="zh-CN"/>
+              </w:rPr>
+              <w:lastRenderedPageBreak/>
               <w:t>（CAN通信中断）</w:t>
             </w:r>
           </w:p>
@@ -14192,7 +14410,17 @@
                 <w:sz w:val="20"/>
                 <w:lang w:eastAsia="zh-CN"/>
               </w:rPr>
-              <w:t>CAN线缆松动或USB转CAN</w:t>
+              <w:lastRenderedPageBreak/>
+              <w:t>CAN线缆松动或USB</w:t>
+            </w:r>
+            <w:r>
+              <w:rPr>
+                <w:rFonts w:ascii="宋体" w:hAnsi="宋体"/>
+                <w:sz w:val="20"/>
+                <w:lang w:eastAsia="zh-CN"/>
+              </w:rPr>
+              <w:lastRenderedPageBreak/>
+              <w:t>转CAN</w:t>
             </w:r>
             <w:r>
               <w:rPr>
@@ -14219,6 +14447,7 @@
                 <w:rFonts w:ascii="宋体" w:hAnsi="宋体"/>
                 <w:sz w:val="20"/>
               </w:rPr>
+              <w:lastRenderedPageBreak/>
               <w:t>dmesg</w:t>
             </w:r>
             <w:proofErr w:type="spellEnd"/>
@@ -14235,7 +14464,15 @@
                 <w:rFonts w:ascii="宋体" w:hAnsi="宋体"/>
                 <w:sz w:val="20"/>
               </w:rPr>
-              <w:t>can检查内核日志</w:t>
+              <w:t>can检</w:t>
+            </w:r>
+            <w:r>
+              <w:rPr>
+                <w:rFonts w:ascii="宋体" w:hAnsi="宋体"/>
+                <w:sz w:val="20"/>
+              </w:rPr>
+              <w:lastRenderedPageBreak/>
+              <w:t>查内核日志</w:t>
             </w:r>
             <w:proofErr w:type="spellEnd"/>
             <w:r>
@@ -14283,6 +14520,7 @@
                 <w:rFonts w:ascii="宋体" w:hAnsi="宋体"/>
                 <w:sz w:val="20"/>
               </w:rPr>
+              <w:lastRenderedPageBreak/>
               <w:t>重新插拔USB线缆；</w:t>
             </w:r>
             <w:r>
@@ -14291,6 +14529,13 @@
                 <w:sz w:val="20"/>
               </w:rPr>
               <w:br/>
+            </w:r>
+            <w:r>
+              <w:rPr>
+                <w:rFonts w:ascii="宋体" w:hAnsi="宋体"/>
+                <w:sz w:val="20"/>
+              </w:rPr>
+              <w:lastRenderedPageBreak/>
               <w:t>重启rm_driver节点</w:t>
             </w:r>
           </w:p>
@@ -14310,6 +14555,7 @@
                 <w:rFonts w:ascii="宋体" w:hAnsi="宋体"/>
                 <w:sz w:val="20"/>
               </w:rPr>
+              <w:lastRenderedPageBreak/>
               <w:t>相机无数据流</w:t>
             </w:r>
           </w:p>
@@ -14608,7 +14854,6 @@
                 <w:rFonts w:ascii="宋体" w:hAnsi="宋体"/>
                 <w:sz w:val="20"/>
               </w:rPr>
-              <w:lastRenderedPageBreak/>
               <w:t>吸盘无法抓取</w:t>
             </w:r>
           </w:p>
@@ -14852,11 +15097,6 @@
           <w:lang w:eastAsia="zh-CN"/>
         </w:rPr>
       </w:pPr>
-      <w:r>
-        <w:rPr>
-          <w:lang w:eastAsia="zh-CN"/>
-        </w:rPr>
-      </w:r>
     </w:p>
     <w:p>
       <w:pPr>
@@ -14866,6 +15106,7 @@
         <w:rPr>
           <w:lang w:eastAsia="zh-CN"/>
         </w:rPr>
+        <w:br w:type="page"/>
       </w:pPr>
       <w:bookmarkStart w:id="21" w:name="_Toc229276457"/>
       <w:r>
@@ -14875,7 +15116,6 @@
           <w:sz w:val="32"/>
           <w:lang w:eastAsia="zh-CN"/>
         </w:rPr>
-        <w:lastRenderedPageBreak/>
         <w:t xml:space="preserve">4. </w:t>
       </w:r>
       <w:r>
@@ -15975,7 +16215,6 @@
         <w:rPr>
           <w:lang w:eastAsia="zh-CN"/>
         </w:rPr>
-        <w:lastRenderedPageBreak/>
         <w:t>校正后的深度图通过以下公式逐像素投影为三维点云：</w:t>
       </w:r>
     </w:p>
@@ -16444,6 +16683,7 @@
           <w:sz w:val="26"/>
           <w:lang w:eastAsia="zh-CN"/>
         </w:rPr>
+        <w:lastRenderedPageBreak/>
         <w:t xml:space="preserve">4.1.3 </w:t>
       </w:r>
       <w:r>
@@ -16463,32 +16703,47 @@
         <w:jc w:val="center"/>
       </w:pPr>
       <w:r>
+        <w:rPr>
+          <w:noProof/>
+        </w:rPr>
         <w:drawing>
-          <wp:inline xmlns:a="http://schemas.openxmlformats.org/drawingml/2006/main" xmlns:pic="http://schemas.openxmlformats.org/drawingml/2006/picture">
-            <wp:extent cx="4846320" cy="3287020"/>
+          <wp:inline distT="0" distB="0" distL="0" distR="0" wp14:anchorId="4CBFC79C" wp14:editId="08414877">
+            <wp:extent cx="4845937" cy="2684353"/>
+            <wp:effectExtent l="0" t="0" r="0" b="1905"/>
             <wp:docPr id="15" name="Picture 15"/>
             <wp:cNvGraphicFramePr>
-              <a:graphicFrameLocks noChangeAspect="1"/>
+              <a:graphicFrameLocks xmlns:a="http://schemas.openxmlformats.org/drawingml/2006/main" noChangeAspect="1"/>
             </wp:cNvGraphicFramePr>
-            <a:graphic>
+            <a:graphic xmlns:a="http://schemas.openxmlformats.org/drawingml/2006/main">
               <a:graphicData uri="http://schemas.openxmlformats.org/drawingml/2006/picture">
-                <pic:pic>
+                <pic:pic xmlns:pic="http://schemas.openxmlformats.org/drawingml/2006/picture">
                   <pic:nvPicPr>
                     <pic:cNvPr id="0" name="fig7_handeye_calibration.png"/>
                     <pic:cNvPicPr/>
                   </pic:nvPicPr>
-                  <pic:blipFill>
-                    <a:blip r:embed="rId21"/>
+                  <pic:blipFill rotWithShape="1">
+                    <a:blip r:embed="rId9"/>
+                    <a:srcRect b="18328"/>
                     <a:stretch>
                       <a:fillRect/>
                     </a:stretch>
                   </pic:blipFill>
-                  <pic:spPr>
+                  <pic:spPr bwMode="auto">
                     <a:xfrm>
                       <a:off x="0" y="0"/>
-                      <a:ext cx="4846320" cy="3287020"/>
+                      <a:ext cx="4846320" cy="2684565"/>
                     </a:xfrm>
-                    <a:prstGeom prst="rect"/>
+                    <a:prstGeom prst="rect">
+                      <a:avLst/>
+                    </a:prstGeom>
+                    <a:ln>
+                      <a:noFill/>
+                    </a:ln>
+                    <a:extLst>
+                      <a:ext uri="{53640926-AAD7-44D8-BBD7-CCE9431645EC}">
+                        <a14:shadowObscured xmlns:a14="http://schemas.microsoft.com/office/drawing/2010/main"/>
+                      </a:ext>
+                    </a:extLst>
                   </pic:spPr>
                 </pic:pic>
               </a:graphicData>
@@ -16501,21 +16756,60 @@
       <w:pPr>
         <w:spacing w:after="200"/>
         <w:jc w:val="center"/>
-      </w:pPr>
-      <w:r>
-        <w:rPr>
-          <w:rFonts w:ascii="Times New Roman" w:hAnsi="Times New Roman"/>
+        <w:rPr>
+          <w:lang w:eastAsia="zh-CN"/>
+        </w:rPr>
+      </w:pPr>
+      <w:r>
+        <w:rPr>
           <w:b/>
           <w:sz w:val="18"/>
-        </w:rPr>
-        <w:t xml:space="preserve">图4-3  </w:t>
-      </w:r>
-      <w:r>
-        <w:rPr>
-          <w:rFonts w:ascii="Times New Roman" w:hAnsi="Times New Roman"/>
+          <w:lang w:eastAsia="zh-CN"/>
+        </w:rPr>
+        <w:t>图</w:t>
+      </w:r>
+      <w:r>
+        <w:rPr>
+          <w:b/>
           <w:sz w:val="18"/>
-        </w:rPr>
-        <w:t>手眼标定流程（Tsai-Lenz算法 AX=XB 求解）</w:t>
+          <w:lang w:eastAsia="zh-CN"/>
+        </w:rPr>
+        <w:t xml:space="preserve">4-3  </w:t>
+      </w:r>
+      <w:r>
+        <w:rPr>
+          <w:sz w:val="18"/>
+          <w:lang w:eastAsia="zh-CN"/>
+        </w:rPr>
+        <w:t>手眼标定流程（</w:t>
+      </w:r>
+      <w:r>
+        <w:rPr>
+          <w:sz w:val="18"/>
+          <w:lang w:eastAsia="zh-CN"/>
+        </w:rPr>
+        <w:t>Tsai-Lenz</w:t>
+      </w:r>
+      <w:r>
+        <w:rPr>
+          <w:sz w:val="18"/>
+          <w:lang w:eastAsia="zh-CN"/>
+        </w:rPr>
+        <w:t>算法</w:t>
+      </w:r>
+      <w:r>
+        <w:rPr>
+          <w:sz w:val="18"/>
+          <w:lang w:eastAsia="zh-CN"/>
+        </w:rPr>
+        <w:t xml:space="preserve"> AX=XB </w:t>
+      </w:r>
+      <w:r>
+        <w:rPr>
+          <w:sz w:val="18"/>
+          <w:lang w:eastAsia="zh-CN"/>
+        </w:rPr>
+        <w:t>求解）</w:t>
       </w:r>
     </w:p>
     <w:p>
@@ -17564,6 +17858,7 @@
         <w:rPr>
           <w:lang w:eastAsia="zh-CN"/>
         </w:rPr>
+        <w:lastRenderedPageBreak/>
         <w:t>R_X</w:t>
       </w:r>
       <w:r>
@@ -17703,7 +17998,6 @@
         </w:rPr>
       </w:pPr>
       <w:r>
-        <w:lastRenderedPageBreak/>
         <w:t>标定结果以</w:t>
       </w:r>
       <w:r>
@@ -18130,11 +18424,6 @@
           <w:lang w:eastAsia="zh-CN"/>
         </w:rPr>
       </w:pPr>
-      <w:r>
-        <w:rPr>
-          <w:lang w:eastAsia="zh-CN"/>
-        </w:rPr>
-      </w:r>
     </w:p>
     <w:p>
       <w:pPr>
@@ -18153,7 +18442,6 @@
           <w:sz w:val="28"/>
           <w:lang w:eastAsia="zh-CN"/>
         </w:rPr>
-        <w:lastRenderedPageBreak/>
         <w:t xml:space="preserve">4.2 </w:t>
       </w:r>
       <w:r>
@@ -18288,7 +18576,14 @@
         <w:rPr>
           <w:lang w:eastAsia="zh-CN"/>
         </w:rPr>
-        <w:t>）减少梯度重复计算，在保持特征表达能力的条件下降低约</w:t>
+        <w:t>）减少梯度重复计算，在保持特征表达能力的条件下降低</w:t>
+      </w:r>
+      <w:r>
+        <w:rPr>
+          <w:lang w:eastAsia="zh-CN"/>
+        </w:rPr>
+        <w:lastRenderedPageBreak/>
+        <w:t>约</w:t>
       </w:r>
       <w:r>
         <w:rPr>
@@ -19126,7 +19421,6 @@
           <w:sz w:val="26"/>
           <w:lang w:eastAsia="zh-CN"/>
         </w:rPr>
-        <w:lastRenderedPageBreak/>
         <w:t xml:space="preserve">4.2.2 </w:t>
       </w:r>
       <w:r>
@@ -19412,7 +19706,11 @@
         <w:t>warmup</w:t>
       </w:r>
       <w:r>
-        <w:t>，学习率在</w:t>
+        <w:t>，学</w:t>
+      </w:r>
+      <w:r>
+        <w:lastRenderedPageBreak/>
+        <w:t>习率在</w:t>
       </w:r>
       <w:r>
         <w:t>150</w:t>
@@ -19556,32 +19854,47 @@
         <w:jc w:val="center"/>
       </w:pPr>
       <w:r>
+        <w:rPr>
+          <w:noProof/>
+        </w:rPr>
         <w:drawing>
-          <wp:inline xmlns:a="http://schemas.openxmlformats.org/drawingml/2006/main" xmlns:pic="http://schemas.openxmlformats.org/drawingml/2006/picture">
-            <wp:extent cx="5303520" cy="2806727"/>
+          <wp:inline distT="0" distB="0" distL="0" distR="0" wp14:anchorId="290D8825" wp14:editId="638B1968">
+            <wp:extent cx="5303469" cy="2159251"/>
+            <wp:effectExtent l="0" t="0" r="0" b="0"/>
             <wp:docPr id="14" name="Picture 14"/>
             <wp:cNvGraphicFramePr>
-              <a:graphicFrameLocks noChangeAspect="1"/>
+              <a:graphicFrameLocks xmlns:a="http://schemas.openxmlformats.org/drawingml/2006/main" noChangeAspect="1"/>
             </wp:cNvGraphicFramePr>
-            <a:graphic>
+            <a:graphic xmlns:a="http://schemas.openxmlformats.org/drawingml/2006/main">
               <a:graphicData uri="http://schemas.openxmlformats.org/drawingml/2006/picture">
-                <pic:pic>
+                <pic:pic xmlns:pic="http://schemas.openxmlformats.org/drawingml/2006/picture">
                   <pic:nvPicPr>
                     <pic:cNvPr id="0" name="fig3_vision_pipeline.png"/>
                     <pic:cNvPicPr/>
                   </pic:nvPicPr>
-                  <pic:blipFill>
-                    <a:blip r:embed="rId20"/>
+                  <pic:blipFill rotWithShape="1">
+                    <a:blip r:embed="rId10"/>
+                    <a:srcRect b="23068"/>
                     <a:stretch>
                       <a:fillRect/>
                     </a:stretch>
                   </pic:blipFill>
-                  <pic:spPr>
+                  <pic:spPr bwMode="auto">
                     <a:xfrm>
                       <a:off x="0" y="0"/>
-                      <a:ext cx="5303520" cy="2806727"/>
+                      <a:ext cx="5303520" cy="2159272"/>
                     </a:xfrm>
-                    <a:prstGeom prst="rect"/>
+                    <a:prstGeom prst="rect">
+                      <a:avLst/>
+                    </a:prstGeom>
+                    <a:ln>
+                      <a:noFill/>
+                    </a:ln>
+                    <a:extLst>
+                      <a:ext uri="{53640926-AAD7-44D8-BBD7-CCE9431645EC}">
+                        <a14:shadowObscured xmlns:a14="http://schemas.microsoft.com/office/drawing/2010/main"/>
+                      </a:ext>
+                    </a:extLst>
                   </pic:spPr>
                 </pic:pic>
               </a:graphicData>
@@ -19594,21 +19907,102 @@
       <w:pPr>
         <w:spacing w:after="200"/>
         <w:jc w:val="center"/>
-      </w:pPr>
-      <w:r>
-        <w:rPr>
-          <w:rFonts w:ascii="Times New Roman" w:hAnsi="Times New Roman"/>
+        <w:rPr>
+          <w:lang w:eastAsia="zh-CN"/>
+        </w:rPr>
+      </w:pPr>
+      <w:r>
+        <w:rPr>
           <w:b/>
           <w:sz w:val="18"/>
-        </w:rPr>
-        <w:t xml:space="preserve">图4-8  </w:t>
-      </w:r>
-      <w:r>
-        <w:rPr>
-          <w:rFonts w:ascii="Times New Roman" w:hAnsi="Times New Roman"/>
+          <w:lang w:eastAsia="zh-CN"/>
+        </w:rPr>
+        <w:t>图</w:t>
+      </w:r>
+      <w:r>
+        <w:rPr>
+          <w:b/>
           <w:sz w:val="18"/>
-        </w:rPr>
-        <w:t>视觉识别流水线（D435采集→YOLOv8分割→模板匹配→手眼变换→抓取位姿）</w:t>
+          <w:lang w:eastAsia="zh-CN"/>
+        </w:rPr>
+        <w:t xml:space="preserve">4-8  </w:t>
+      </w:r>
+      <w:r>
+        <w:rPr>
+          <w:sz w:val="18"/>
+          <w:lang w:eastAsia="zh-CN"/>
+        </w:rPr>
+        <w:t>视觉识别流水线（</w:t>
+      </w:r>
+      <w:r>
+        <w:rPr>
+          <w:sz w:val="18"/>
+          <w:lang w:eastAsia="zh-CN"/>
+        </w:rPr>
+        <w:t>D435</w:t>
+      </w:r>
+      <w:r>
+        <w:rPr>
+          <w:sz w:val="18"/>
+          <w:lang w:eastAsia="zh-CN"/>
+        </w:rPr>
+        <w:t>采集</w:t>
+      </w:r>
+      <w:r>
+        <w:rPr>
+          <w:sz w:val="18"/>
+          <w:lang w:eastAsia="zh-CN"/>
+        </w:rPr>
+        <w:t>→YOLOv8</w:t>
+      </w:r>
+      <w:r>
+        <w:rPr>
+          <w:sz w:val="18"/>
+          <w:lang w:eastAsia="zh-CN"/>
+        </w:rPr>
+        <w:t>分割</w:t>
+      </w:r>
+      <w:r>
+        <w:rPr>
+          <w:sz w:val="18"/>
+          <w:lang w:eastAsia="zh-CN"/>
+        </w:rPr>
+        <w:t>→</w:t>
+      </w:r>
+      <w:r>
+        <w:rPr>
+          <w:sz w:val="18"/>
+          <w:lang w:eastAsia="zh-CN"/>
+        </w:rPr>
+        <w:t>模板匹配</w:t>
+      </w:r>
+      <w:r>
+        <w:rPr>
+          <w:sz w:val="18"/>
+          <w:lang w:eastAsia="zh-CN"/>
+        </w:rPr>
+        <w:t>→</w:t>
+      </w:r>
+      <w:r>
+        <w:rPr>
+          <w:sz w:val="18"/>
+          <w:lang w:eastAsia="zh-CN"/>
+        </w:rPr>
+        <w:t>手眼变换</w:t>
+      </w:r>
+      <w:r>
+        <w:rPr>
+          <w:sz w:val="18"/>
+          <w:lang w:eastAsia="zh-CN"/>
+        </w:rPr>
+        <w:t>→</w:t>
+      </w:r>
+      <w:r>
+        <w:rPr>
+          <w:sz w:val="18"/>
+          <w:lang w:eastAsia="zh-CN"/>
+        </w:rPr>
+        <w:t>抓取位姿）</w:t>
       </w:r>
     </w:p>
     <w:p>
@@ -19637,7 +20031,15 @@
         <w:t>visualize_yolo_degv2.py</w:t>
       </w:r>
       <w:r>
-        <w:t>）。其核心流程为：</w:t>
+        <w:t>）。</w:t>
+      </w:r>
+      <w:proofErr w:type="spellStart"/>
+      <w:r>
+        <w:t>其核心流程为</w:t>
+      </w:r>
+      <w:proofErr w:type="spellEnd"/>
+      <w:r>
+        <w:t>：</w:t>
       </w:r>
     </w:p>
     <w:p>
@@ -19727,7 +20129,21 @@
         <w:rPr>
           <w:lang w:eastAsia="zh-CN"/>
         </w:rPr>
-        <w:t>个均匀采样点。对每个检测到的目标轮廓，首先通过等比缩放使模板与目标的包围盒面积对齐，随后以</w:t>
+        <w:t>个均匀采样点。对每个检测到的目标轮廓，首先通过等比缩放使模板与目标的包围</w:t>
+      </w:r>
+      <w:proofErr w:type="gramStart"/>
+      <w:r>
+        <w:rPr>
+          <w:lang w:eastAsia="zh-CN"/>
+        </w:rPr>
+        <w:t>盒面积</w:t>
+      </w:r>
+      <w:proofErr w:type="gramEnd"/>
+      <w:r>
+        <w:rPr>
+          <w:lang w:eastAsia="zh-CN"/>
+        </w:rPr>
+        <w:t>对齐，随后以</w:t>
       </w:r>
       <w:r>
         <w:rPr>
@@ -19735,58 +20151,44 @@
         </w:rPr>
         <w:t>5°</w:t>
       </w:r>
+      <w:r>
+        <w:rPr>
+          <w:lang w:eastAsia="zh-CN"/>
+        </w:rPr>
+        <w:t>步长在</w:t>
+      </w:r>
+      <w:r>
+        <w:rPr>
+          <w:lang w:eastAsia="zh-CN"/>
+        </w:rPr>
+        <w:t>[0°, 360°)</w:t>
+      </w:r>
+      <w:r>
+        <w:rPr>
+          <w:lang w:eastAsia="zh-CN"/>
+        </w:rPr>
+        <w:t>范围内粗搜索最优旋转角度，再以</w:t>
+      </w:r>
+      <w:r>
+        <w:rPr>
+          <w:lang w:eastAsia="zh-CN"/>
+        </w:rPr>
+        <w:t>1°</w:t>
+      </w:r>
+      <w:r>
+        <w:rPr>
+          <w:lang w:eastAsia="zh-CN"/>
+        </w:rPr>
+        <w:t>步长在最优</w:t>
+      </w:r>
       <w:proofErr w:type="gramStart"/>
       <w:r>
         <w:rPr>
           <w:lang w:eastAsia="zh-CN"/>
         </w:rPr>
-        <w:t>步长在</w:t>
-      </w:r>
-      <w:r>
-        <w:rPr>
-          <w:lang w:eastAsia="zh-CN"/>
-        </w:rPr>
-        <w:t>[</w:t>
+        <w:t>粗角度</w:t>
       </w:r>
       <w:proofErr w:type="gramEnd"/>
-      <w:r>
-        <w:rPr>
-          <w:lang w:eastAsia="zh-CN"/>
-        </w:rPr>
-        <w:t>0°, 360</w:t>
-      </w:r>
-      <w:proofErr w:type="gramStart"/>
-      <w:r>
-        <w:rPr>
-          <w:lang w:eastAsia="zh-CN"/>
-        </w:rPr>
-        <w:t>°)</w:t>
-      </w:r>
-      <w:r>
-        <w:rPr>
-          <w:lang w:eastAsia="zh-CN"/>
-        </w:rPr>
-        <w:t>范围内粗搜索最优旋转角度</w:t>
-      </w:r>
-      <w:proofErr w:type="gramEnd"/>
-      <w:r>
-        <w:rPr>
-          <w:lang w:eastAsia="zh-CN"/>
-        </w:rPr>
-        <w:t>，再以</w:t>
-      </w:r>
-      <w:r>
-        <w:rPr>
-          <w:lang w:eastAsia="zh-CN"/>
-        </w:rPr>
-        <w:t>1°</w:t>
-      </w:r>
-      <w:r>
-        <w:rPr>
-          <w:lang w:eastAsia="zh-CN"/>
-        </w:rPr>
-        <w:t>步长在最优粗角度</w:t>
-      </w:r>
       <w:r>
         <w:rPr>
           <w:lang w:eastAsia="zh-CN"/>
@@ -20518,11 +20920,24 @@
           <w:lang w:eastAsia="zh-CN"/>
         </w:rPr>
       </w:pPr>
+      <w:proofErr w:type="spellStart"/>
       <w:r>
         <w:t>其中</w:t>
       </w:r>
       <w:r>
-        <w:t xml:space="preserve">M_ij=Σ_xΣ_y </w:t>
+        <w:t>M_ij</w:t>
+      </w:r>
+      <w:proofErr w:type="spellEnd"/>
+      <w:r>
+        <w:t>=</w:t>
+      </w:r>
+      <w:proofErr w:type="spellStart"/>
+      <w:r>
+        <w:t>Σ_xΣ_y</w:t>
+      </w:r>
+      <w:proofErr w:type="spellEnd"/>
+      <w:r>
+        <w:t xml:space="preserve"> </w:t>
       </w:r>
       <w:proofErr w:type="spellStart"/>
       <w:r>
@@ -20664,7 +21079,7 @@
                     <pic:cNvPicPr/>
                   </pic:nvPicPr>
                   <pic:blipFill>
-                    <a:blip r:embed="rId7"/>
+                    <a:blip r:embed="rId11"/>
                     <a:stretch>
                       <a:fillRect/>
                     </a:stretch>
@@ -20735,7 +21150,7 @@
                     <pic:cNvPicPr/>
                   </pic:nvPicPr>
                   <pic:blipFill>
-                    <a:blip r:embed="rId8"/>
+                    <a:blip r:embed="rId12"/>
                     <a:stretch>
                       <a:fillRect/>
                     </a:stretch>
@@ -20787,11 +21202,6 @@
           <w:lang w:eastAsia="zh-CN"/>
         </w:rPr>
       </w:pPr>
-      <w:r>
-        <w:rPr>
-          <w:lang w:eastAsia="zh-CN"/>
-        </w:rPr>
-      </w:r>
     </w:p>
     <w:p>
       <w:pPr>
@@ -23380,6 +23790,7 @@
           <w:sz w:val="26"/>
           <w:lang w:eastAsia="zh-CN"/>
         </w:rPr>
+        <w:lastRenderedPageBreak/>
         <w:t xml:space="preserve">4.3.3 </w:t>
       </w:r>
       <w:r>
@@ -23435,22 +23846,26 @@
         <w:jc w:val="center"/>
       </w:pPr>
       <w:r>
+        <w:rPr>
+          <w:noProof/>
+        </w:rPr>
         <w:drawing>
-          <wp:inline xmlns:a="http://schemas.openxmlformats.org/drawingml/2006/main" xmlns:pic="http://schemas.openxmlformats.org/drawingml/2006/picture">
+          <wp:inline distT="0" distB="0" distL="0" distR="0" wp14:anchorId="5842C913" wp14:editId="1528C695">
             <wp:extent cx="5303520" cy="3375299"/>
+            <wp:effectExtent l="0" t="0" r="0" b="0"/>
             <wp:docPr id="13" name="Picture 13"/>
             <wp:cNvGraphicFramePr>
-              <a:graphicFrameLocks noChangeAspect="1"/>
+              <a:graphicFrameLocks xmlns:a="http://schemas.openxmlformats.org/drawingml/2006/main" noChangeAspect="1"/>
             </wp:cNvGraphicFramePr>
-            <a:graphic>
+            <a:graphic xmlns:a="http://schemas.openxmlformats.org/drawingml/2006/main">
               <a:graphicData uri="http://schemas.openxmlformats.org/drawingml/2006/picture">
-                <pic:pic>
+                <pic:pic xmlns:pic="http://schemas.openxmlformats.org/drawingml/2006/picture">
                   <pic:nvPicPr>
                     <pic:cNvPr id="0" name="fig6_dqn_architecture.png"/>
                     <pic:cNvPicPr/>
                   </pic:nvPicPr>
                   <pic:blipFill>
-                    <a:blip r:embed="rId19"/>
+                    <a:blip r:embed="rId13"/>
                     <a:stretch>
                       <a:fillRect/>
                     </a:stretch>
@@ -23460,7 +23875,9 @@
                       <a:off x="0" y="0"/>
                       <a:ext cx="5303520" cy="3375299"/>
                     </a:xfrm>
-                    <a:prstGeom prst="rect"/>
+                    <a:prstGeom prst="rect">
+                      <a:avLst/>
+                    </a:prstGeom>
                   </pic:spPr>
                 </pic:pic>
               </a:graphicData>
@@ -23473,21 +23890,106 @@
       <w:pPr>
         <w:spacing w:after="200"/>
         <w:jc w:val="center"/>
-      </w:pPr>
-      <w:r>
-        <w:rPr>
-          <w:rFonts w:ascii="Times New Roman" w:hAnsi="Times New Roman"/>
+        <w:rPr>
+          <w:lang w:eastAsia="zh-CN"/>
+        </w:rPr>
+      </w:pPr>
+      <w:r>
+        <w:rPr>
           <w:b/>
           <w:sz w:val="18"/>
-        </w:rPr>
-        <w:t xml:space="preserve">图4-4  </w:t>
-      </w:r>
-      <w:r>
-        <w:rPr>
-          <w:rFonts w:ascii="Times New Roman" w:hAnsi="Times New Roman"/>
+          <w:lang w:eastAsia="zh-CN"/>
+        </w:rPr>
+        <w:t>图</w:t>
+      </w:r>
+      <w:r>
+        <w:rPr>
+          <w:b/>
           <w:sz w:val="18"/>
-        </w:rPr>
-        <w:t>DQN深度Q网络架构（211维状态 → 3层MLP → 400维动作价值）</w:t>
+          <w:lang w:eastAsia="zh-CN"/>
+        </w:rPr>
+        <w:t xml:space="preserve">4-4  </w:t>
+      </w:r>
+      <w:r>
+        <w:rPr>
+          <w:sz w:val="18"/>
+          <w:lang w:eastAsia="zh-CN"/>
+        </w:rPr>
+        <w:t>DQN</w:t>
+      </w:r>
+      <w:r>
+        <w:rPr>
+          <w:sz w:val="18"/>
+          <w:lang w:eastAsia="zh-CN"/>
+        </w:rPr>
+        <w:t>深度</w:t>
+      </w:r>
+      <w:r>
+        <w:rPr>
+          <w:sz w:val="18"/>
+          <w:lang w:eastAsia="zh-CN"/>
+        </w:rPr>
+        <w:t>Q</w:t>
+      </w:r>
+      <w:r>
+        <w:rPr>
+          <w:sz w:val="18"/>
+          <w:lang w:eastAsia="zh-CN"/>
+        </w:rPr>
+        <w:t>网络架构（</w:t>
+      </w:r>
+      <w:r>
+        <w:rPr>
+          <w:sz w:val="18"/>
+          <w:lang w:eastAsia="zh-CN"/>
+        </w:rPr>
+        <w:t>211</w:t>
+      </w:r>
+      <w:proofErr w:type="gramStart"/>
+      <w:r>
+        <w:rPr>
+          <w:sz w:val="18"/>
+          <w:lang w:eastAsia="zh-CN"/>
+        </w:rPr>
+        <w:t>维状态</w:t>
+      </w:r>
+      <w:proofErr w:type="gramEnd"/>
+      <w:r>
+        <w:rPr>
+          <w:sz w:val="18"/>
+          <w:lang w:eastAsia="zh-CN"/>
+        </w:rPr>
+        <w:t xml:space="preserve"> → 3</w:t>
+      </w:r>
+      <w:r>
+        <w:rPr>
+          <w:sz w:val="18"/>
+          <w:lang w:eastAsia="zh-CN"/>
+        </w:rPr>
+        <w:t>层</w:t>
+      </w:r>
+      <w:r>
+        <w:rPr>
+          <w:sz w:val="18"/>
+          <w:lang w:eastAsia="zh-CN"/>
+        </w:rPr>
+        <w:t>MLP → 400</w:t>
+      </w:r>
+      <w:proofErr w:type="gramStart"/>
+      <w:r>
+        <w:rPr>
+          <w:sz w:val="18"/>
+          <w:lang w:eastAsia="zh-CN"/>
+        </w:rPr>
+        <w:t>维动作</w:t>
+      </w:r>
+      <w:proofErr w:type="gramEnd"/>
+      <w:r>
+        <w:rPr>
+          <w:sz w:val="18"/>
+          <w:lang w:eastAsia="zh-CN"/>
+        </w:rPr>
+        <w:t>价值）</w:t>
       </w:r>
     </w:p>
     <w:p>
@@ -24093,174 +24595,168 @@
         <w:rPr>
           <w:lang w:eastAsia="zh-CN"/>
         </w:rPr>
-        <w:t>维）与旋</w:t>
-      </w:r>
-      <w:r>
-        <w:rPr>
-          <w:lang w:eastAsia="zh-CN"/>
-        </w:rPr>
+        <w:t>维）与旋转角度编码（</w:t>
+      </w:r>
+      <w:r>
+        <w:rPr>
+          <w:lang w:eastAsia="zh-CN"/>
+        </w:rPr>
+        <w:t>4</w:t>
+      </w:r>
+      <w:r>
+        <w:rPr>
+          <w:lang w:eastAsia="zh-CN"/>
+        </w:rPr>
+        <w:t>维），得到</w:t>
+      </w:r>
+      <w:r>
+        <w:rPr>
+          <w:lang w:eastAsia="zh-CN"/>
+        </w:rPr>
+        <w:t>211</w:t>
+      </w:r>
+      <w:r>
+        <w:rPr>
+          <w:lang w:eastAsia="zh-CN"/>
+        </w:rPr>
+        <w:t>维输入向量；隐藏层为</w:t>
+      </w:r>
+      <w:r>
+        <w:rPr>
+          <w:lang w:eastAsia="zh-CN"/>
+        </w:rPr>
+        <w:t>3</w:t>
+      </w:r>
+      <w:r>
+        <w:rPr>
+          <w:lang w:eastAsia="zh-CN"/>
+        </w:rPr>
+        <w:t>层全连接网络（</w:t>
+      </w:r>
+      <w:r>
+        <w:rPr>
+          <w:lang w:eastAsia="zh-CN"/>
+        </w:rPr>
+        <w:t>512→256→128</w:t>
+      </w:r>
+      <w:r>
+        <w:rPr>
+          <w:lang w:eastAsia="zh-CN"/>
+        </w:rPr>
+        <w:t>），每层后接</w:t>
+      </w:r>
+      <w:proofErr w:type="spellStart"/>
+      <w:r>
+        <w:rPr>
+          <w:lang w:eastAsia="zh-CN"/>
+        </w:rPr>
+        <w:t>BatchNorm</w:t>
+      </w:r>
+      <w:proofErr w:type="spellEnd"/>
+      <w:r>
+        <w:rPr>
+          <w:lang w:eastAsia="zh-CN"/>
+        </w:rPr>
+        <w:t>与</w:t>
+      </w:r>
+      <w:proofErr w:type="spellStart"/>
+      <w:r>
+        <w:rPr>
+          <w:lang w:eastAsia="zh-CN"/>
+        </w:rPr>
+        <w:t>ReLU</w:t>
+      </w:r>
+      <w:proofErr w:type="spellEnd"/>
+      <w:r>
+        <w:rPr>
+          <w:lang w:eastAsia="zh-CN"/>
+        </w:rPr>
+        <w:t>激活函数；输出层为</w:t>
+      </w:r>
+      <w:r>
+        <w:rPr>
+          <w:lang w:eastAsia="zh-CN"/>
+        </w:rPr>
+        <w:t>|A|</w:t>
+      </w:r>
+      <w:r>
+        <w:rPr>
+          <w:lang w:eastAsia="zh-CN"/>
+        </w:rPr>
+        <w:t>维的</w:t>
+      </w:r>
+      <w:r>
+        <w:rPr>
+          <w:lang w:eastAsia="zh-CN"/>
+        </w:rPr>
+        <w:t>Q</w:t>
+      </w:r>
+      <w:r>
+        <w:rPr>
+          <w:lang w:eastAsia="zh-CN"/>
+        </w:rPr>
+        <w:t>值向量（经环境过滤后仅保留合法动作的</w:t>
+      </w:r>
+      <w:r>
+        <w:rPr>
+          <w:lang w:eastAsia="zh-CN"/>
+        </w:rPr>
+        <w:t>Q</w:t>
+      </w:r>
+      <w:r>
+        <w:rPr>
+          <w:lang w:eastAsia="zh-CN"/>
+        </w:rPr>
+        <w:t>值）。</w:t>
+      </w:r>
+    </w:p>
+    <w:p>
+      <w:pPr>
+        <w:ind w:firstLine="420"/>
+      </w:pPr>
+      <w:proofErr w:type="spellStart"/>
+      <w:r>
+        <w:t>训练采用</w:t>
+      </w:r>
+      <w:r>
+        <w:t>Double</w:t>
+      </w:r>
+      <w:proofErr w:type="spellEnd"/>
+      <w:r>
+        <w:t xml:space="preserve"> </w:t>
+      </w:r>
+      <w:proofErr w:type="spellStart"/>
+      <w:r>
+        <w:t>DQN</w:t>
+      </w:r>
+      <w:r>
+        <w:t>与优先经验回放（</w:t>
+      </w:r>
+      <w:r>
+        <w:t>Prioritized</w:t>
+      </w:r>
+      <w:proofErr w:type="spellEnd"/>
+      <w:r>
+        <w:t xml:space="preserve"> Experience Replay, </w:t>
+      </w:r>
+      <w:proofErr w:type="spellStart"/>
+      <w:r>
+        <w:t>PER</w:t>
+      </w:r>
+      <w:r>
+        <w:t>）两项改进</w:t>
+      </w:r>
+      <w:proofErr w:type="spellEnd"/>
+      <w:r>
+        <w:t>：</w:t>
+      </w:r>
+    </w:p>
+    <w:p>
+      <w:pPr>
+        <w:ind w:firstLine="420"/>
+      </w:pPr>
+      <w:r>
         <w:lastRenderedPageBreak/>
-        <w:t>转角度编码（</w:t>
-      </w:r>
-      <w:r>
-        <w:rPr>
-          <w:lang w:eastAsia="zh-CN"/>
-        </w:rPr>
-        <w:t>4</w:t>
-      </w:r>
-      <w:r>
-        <w:rPr>
-          <w:lang w:eastAsia="zh-CN"/>
-        </w:rPr>
-        <w:t>维），得到</w:t>
-      </w:r>
-      <w:r>
-        <w:rPr>
-          <w:lang w:eastAsia="zh-CN"/>
-        </w:rPr>
-        <w:t>211</w:t>
-      </w:r>
-      <w:r>
-        <w:rPr>
-          <w:lang w:eastAsia="zh-CN"/>
-        </w:rPr>
-        <w:t>维输入向量；隐藏层为</w:t>
-      </w:r>
-      <w:r>
-        <w:rPr>
-          <w:lang w:eastAsia="zh-CN"/>
-        </w:rPr>
-        <w:t>3</w:t>
-      </w:r>
-      <w:r>
-        <w:rPr>
-          <w:lang w:eastAsia="zh-CN"/>
-        </w:rPr>
-        <w:t>层全连接网络（</w:t>
-      </w:r>
-      <w:r>
-        <w:rPr>
-          <w:lang w:eastAsia="zh-CN"/>
-        </w:rPr>
-        <w:t>512→256→128</w:t>
-      </w:r>
-      <w:r>
-        <w:rPr>
-          <w:lang w:eastAsia="zh-CN"/>
-        </w:rPr>
-        <w:t>），每层后接</w:t>
-      </w:r>
-      <w:proofErr w:type="spellStart"/>
-      <w:r>
-        <w:rPr>
-          <w:lang w:eastAsia="zh-CN"/>
-        </w:rPr>
-        <w:t>BatchNorm</w:t>
-      </w:r>
-      <w:proofErr w:type="spellEnd"/>
-      <w:r>
-        <w:rPr>
-          <w:lang w:eastAsia="zh-CN"/>
-        </w:rPr>
-        <w:t>与</w:t>
-      </w:r>
-      <w:proofErr w:type="spellStart"/>
-      <w:r>
-        <w:rPr>
-          <w:lang w:eastAsia="zh-CN"/>
-        </w:rPr>
-        <w:t>ReLU</w:t>
-      </w:r>
-      <w:proofErr w:type="spellEnd"/>
-      <w:r>
-        <w:rPr>
-          <w:lang w:eastAsia="zh-CN"/>
-        </w:rPr>
-        <w:t>激活函数；输出层为</w:t>
-      </w:r>
-      <w:r>
-        <w:rPr>
-          <w:lang w:eastAsia="zh-CN"/>
-        </w:rPr>
-        <w:t>|A|</w:t>
-      </w:r>
-      <w:r>
-        <w:rPr>
-          <w:lang w:eastAsia="zh-CN"/>
-        </w:rPr>
-        <w:t>维的</w:t>
-      </w:r>
-      <w:r>
-        <w:rPr>
-          <w:lang w:eastAsia="zh-CN"/>
-        </w:rPr>
-        <w:t>Q</w:t>
-      </w:r>
-      <w:r>
-        <w:rPr>
-          <w:lang w:eastAsia="zh-CN"/>
-        </w:rPr>
-        <w:t>值向量（经环境过滤后仅保留合法动作的</w:t>
-      </w:r>
-      <w:r>
-        <w:rPr>
-          <w:lang w:eastAsia="zh-CN"/>
-        </w:rPr>
-        <w:t>Q</w:t>
-      </w:r>
-      <w:r>
-        <w:rPr>
-          <w:lang w:eastAsia="zh-CN"/>
-        </w:rPr>
-        <w:t>值）。</w:t>
-      </w:r>
-    </w:p>
-    <w:p>
-      <w:pPr>
-        <w:ind w:firstLine="420"/>
-      </w:pPr>
-      <w:proofErr w:type="spellStart"/>
-      <w:r>
-        <w:t>训练采用</w:t>
-      </w:r>
-      <w:r>
-        <w:t>Double</w:t>
-      </w:r>
-      <w:proofErr w:type="spellEnd"/>
-      <w:r>
-        <w:t xml:space="preserve"> </w:t>
-      </w:r>
-      <w:proofErr w:type="spellStart"/>
-      <w:r>
-        <w:t>DQN</w:t>
-      </w:r>
-      <w:r>
-        <w:t>与优先经验回放（</w:t>
-      </w:r>
-      <w:r>
-        <w:t>Prioritized</w:t>
-      </w:r>
-      <w:proofErr w:type="spellEnd"/>
-      <w:r>
-        <w:t xml:space="preserve"> Experience Replay, </w:t>
-      </w:r>
-      <w:proofErr w:type="spellStart"/>
-      <w:r>
-        <w:t>PER</w:t>
-      </w:r>
-      <w:r>
-        <w:t>）两项改进</w:t>
-      </w:r>
-      <w:proofErr w:type="spellEnd"/>
-      <w:r>
-        <w:t>：</w:t>
-      </w:r>
-    </w:p>
-    <w:p>
-      <w:pPr>
-        <w:ind w:firstLine="420"/>
-      </w:pPr>
-      <w:r>
         <w:t>Double DQN</w:t>
       </w:r>
       <w:r>
@@ -25507,6 +26003,7 @@
           <w:sz w:val="26"/>
           <w:lang w:eastAsia="zh-CN"/>
         </w:rPr>
+        <w:lastRenderedPageBreak/>
         <w:t xml:space="preserve">4.3.4 </w:t>
       </w:r>
       <w:r>
@@ -25526,22 +26023,26 @@
         <w:jc w:val="center"/>
       </w:pPr>
       <w:r>
+        <w:rPr>
+          <w:noProof/>
+        </w:rPr>
         <w:drawing>
-          <wp:inline xmlns:a="http://schemas.openxmlformats.org/drawingml/2006/main" xmlns:pic="http://schemas.openxmlformats.org/drawingml/2006/picture">
+          <wp:inline distT="0" distB="0" distL="0" distR="0" wp14:anchorId="5856EC16" wp14:editId="19ABFD68">
             <wp:extent cx="5303520" cy="3586710"/>
+            <wp:effectExtent l="0" t="0" r="0" b="0"/>
             <wp:docPr id="12" name="Picture 12"/>
             <wp:cNvGraphicFramePr>
-              <a:graphicFrameLocks noChangeAspect="1"/>
+              <a:graphicFrameLocks xmlns:a="http://schemas.openxmlformats.org/drawingml/2006/main" noChangeAspect="1"/>
             </wp:cNvGraphicFramePr>
-            <a:graphic>
+            <a:graphic xmlns:a="http://schemas.openxmlformats.org/drawingml/2006/main">
               <a:graphicData uri="http://schemas.openxmlformats.org/drawingml/2006/picture">
-                <pic:pic>
+                <pic:pic xmlns:pic="http://schemas.openxmlformats.org/drawingml/2006/picture">
                   <pic:nvPicPr>
                     <pic:cNvPr id="0" name="fig4_decision_flow.png"/>
                     <pic:cNvPicPr/>
                   </pic:nvPicPr>
                   <pic:blipFill>
-                    <a:blip r:embed="rId18"/>
+                    <a:blip r:embed="rId14"/>
                     <a:stretch>
                       <a:fillRect/>
                     </a:stretch>
@@ -25551,7 +26052,9 @@
                       <a:off x="0" y="0"/>
                       <a:ext cx="5303520" cy="3586710"/>
                     </a:xfrm>
-                    <a:prstGeom prst="rect"/>
+                    <a:prstGeom prst="rect">
+                      <a:avLst/>
+                    </a:prstGeom>
                   </pic:spPr>
                 </pic:pic>
               </a:graphicData>
@@ -25567,18 +26070,47 @@
       </w:pPr>
       <w:r>
         <w:rPr>
-          <w:rFonts w:ascii="Times New Roman" w:hAnsi="Times New Roman"/>
           <w:b/>
           <w:sz w:val="18"/>
         </w:rPr>
-        <w:t xml:space="preserve">图4-5  </w:t>
-      </w:r>
-      <w:r>
-        <w:rPr>
-          <w:rFonts w:ascii="Times New Roman" w:hAnsi="Times New Roman"/>
+        <w:t>图</w:t>
+      </w:r>
+      <w:r>
+        <w:rPr>
+          <w:b/>
           <w:sz w:val="18"/>
         </w:rPr>
-        <w:t>混合决策策略流程（Dellacherie启发式筛选 + DQN长期价值优化）</w:t>
+        <w:t xml:space="preserve">4-5  </w:t>
+      </w:r>
+      <w:r>
+        <w:rPr>
+          <w:sz w:val="18"/>
+        </w:rPr>
+        <w:t>混合决策策略流程（</w:t>
+      </w:r>
+      <w:r>
+        <w:rPr>
+          <w:sz w:val="18"/>
+        </w:rPr>
+        <w:t>Dellacherie</w:t>
+      </w:r>
+      <w:r>
+        <w:rPr>
+          <w:sz w:val="18"/>
+        </w:rPr>
+        <w:t>启发式筛选</w:t>
+      </w:r>
+      <w:r>
+        <w:rPr>
+          <w:sz w:val="18"/>
+        </w:rPr>
+        <w:t xml:space="preserve"> + DQN</w:t>
+      </w:r>
+      <w:r>
+        <w:rPr>
+          <w:sz w:val="18"/>
+        </w:rPr>
+        <w:t>长期价值优化）</w:t>
       </w:r>
     </w:p>
     <w:p>
@@ -25668,7 +26200,6 @@
         <w:rPr>
           <w:lang w:eastAsia="zh-CN"/>
         </w:rPr>
-        <w:lastRenderedPageBreak/>
         <w:t>Q</w:t>
       </w:r>
       <w:r>
@@ -25756,11 +26287,6 @@
           <w:lang w:eastAsia="zh-CN"/>
         </w:rPr>
       </w:pPr>
-      <w:r>
-        <w:rPr>
-          <w:lang w:eastAsia="zh-CN"/>
-        </w:rPr>
-      </w:r>
     </w:p>
     <w:p>
       <w:pPr>
@@ -29161,11 +29687,6 @@
           <w:lang w:eastAsia="zh-CN"/>
         </w:rPr>
       </w:pPr>
-      <w:r>
-        <w:rPr>
-          <w:lang w:eastAsia="zh-CN"/>
-        </w:rPr>
-      </w:r>
     </w:p>
     <w:p>
       <w:pPr>
@@ -29184,7 +29705,6 @@
           <w:sz w:val="28"/>
           <w:lang w:eastAsia="zh-CN"/>
         </w:rPr>
-        <w:lastRenderedPageBreak/>
         <w:t xml:space="preserve">4.5 </w:t>
       </w:r>
       <w:r>
@@ -29716,7 +30236,6 @@
       <w:r>
         <w:t>RM65-B</w:t>
       </w:r>
-      <w:proofErr w:type="spellStart"/>
       <w:r>
         <w:t>出厂标定的关节</w:t>
       </w:r>
@@ -29724,22 +30243,13 @@
         <w:t>PID</w:t>
       </w:r>
       <w:r>
-        <w:t>增益矩阵（对角矩阵，各关节参数独立</w:t>
-      </w:r>
-      <w:proofErr w:type="spellEnd"/>
-      <w:r>
-        <w:t>），</w:t>
+        <w:t>增益矩阵（对角矩阵，各关节参数独立），</w:t>
       </w:r>
       <w:r>
         <w:t>u(t)</w:t>
       </w:r>
-      <w:proofErr w:type="spellStart"/>
-      <w:r>
-        <w:t>为输出至电机的力矩指令</w:t>
-      </w:r>
-      <w:proofErr w:type="spellEnd"/>
-      <w:r>
-        <w:t>。</w:t>
+      <w:r>
+        <w:t>为输出至电机的力矩指令。</w:t>
       </w:r>
       <w:r>
         <w:rPr>
@@ -30131,6 +30641,7 @@
           <w:sz w:val="26"/>
           <w:lang w:eastAsia="zh-CN"/>
         </w:rPr>
+        <w:lastRenderedPageBreak/>
         <w:t xml:space="preserve">4.5.3 </w:t>
       </w:r>
       <w:r>
@@ -30249,7 +30760,6 @@
         <w:rPr>
           <w:lang w:eastAsia="zh-CN"/>
         </w:rPr>
-        <w:lastRenderedPageBreak/>
         <w:t>运动规划中强制执行</w:t>
       </w:r>
       <w:r>
@@ -30481,11 +30991,6 @@
           <w:lang w:eastAsia="zh-CN"/>
         </w:rPr>
       </w:pPr>
-      <w:r>
-        <w:rPr>
-          <w:lang w:eastAsia="zh-CN"/>
-        </w:rPr>
-      </w:r>
     </w:p>
     <w:p>
       <w:pPr>
@@ -30504,7 +31009,6 @@
           <w:sz w:val="28"/>
           <w:lang w:eastAsia="zh-CN"/>
         </w:rPr>
-        <w:lastRenderedPageBreak/>
         <w:t xml:space="preserve">4.6 </w:t>
       </w:r>
       <w:r>
@@ -30524,22 +31028,26 @@
         <w:jc w:val="center"/>
       </w:pPr>
       <w:r>
+        <w:rPr>
+          <w:noProof/>
+        </w:rPr>
         <w:drawing>
-          <wp:inline xmlns:a="http://schemas.openxmlformats.org/drawingml/2006/main" xmlns:pic="http://schemas.openxmlformats.org/drawingml/2006/picture">
+          <wp:inline distT="0" distB="0" distL="0" distR="0" wp14:anchorId="76254A75" wp14:editId="0FA655E1">
             <wp:extent cx="5303520" cy="3165709"/>
+            <wp:effectExtent l="0" t="0" r="0" b="0"/>
             <wp:docPr id="11" name="Picture 11"/>
             <wp:cNvGraphicFramePr>
-              <a:graphicFrameLocks noChangeAspect="1"/>
+              <a:graphicFrameLocks xmlns:a="http://schemas.openxmlformats.org/drawingml/2006/main" noChangeAspect="1"/>
             </wp:cNvGraphicFramePr>
-            <a:graphic>
+            <a:graphic xmlns:a="http://schemas.openxmlformats.org/drawingml/2006/main">
               <a:graphicData uri="http://schemas.openxmlformats.org/drawingml/2006/picture">
-                <pic:pic>
+                <pic:pic xmlns:pic="http://schemas.openxmlformats.org/drawingml/2006/picture">
                   <pic:nvPicPr>
                     <pic:cNvPr id="0" name="fig5_pick_place_sequence.png"/>
                     <pic:cNvPicPr/>
                   </pic:nvPicPr>
                   <pic:blipFill>
-                    <a:blip r:embed="rId17"/>
+                    <a:blip r:embed="rId15"/>
                     <a:stretch>
                       <a:fillRect/>
                     </a:stretch>
@@ -30549,7 +31057,9 @@
                       <a:off x="0" y="0"/>
                       <a:ext cx="5303520" cy="3165709"/>
                     </a:xfrm>
-                    <a:prstGeom prst="rect"/>
+                    <a:prstGeom prst="rect">
+                      <a:avLst/>
+                    </a:prstGeom>
                   </pic:spPr>
                 </pic:pic>
               </a:graphicData>
@@ -30562,21 +31072,60 @@
       <w:pPr>
         <w:spacing w:after="200"/>
         <w:jc w:val="center"/>
-      </w:pPr>
-      <w:r>
-        <w:rPr>
-          <w:rFonts w:ascii="Times New Roman" w:hAnsi="Times New Roman"/>
+        <w:rPr>
+          <w:lang w:eastAsia="zh-CN"/>
+        </w:rPr>
+      </w:pPr>
+      <w:r>
+        <w:rPr>
           <w:b/>
           <w:sz w:val="18"/>
-        </w:rPr>
-        <w:t xml:space="preserve">图4-6  </w:t>
-      </w:r>
-      <w:r>
-        <w:rPr>
-          <w:rFonts w:ascii="Times New Roman" w:hAnsi="Times New Roman"/>
+          <w:lang w:eastAsia="zh-CN"/>
+        </w:rPr>
+        <w:t>图</w:t>
+      </w:r>
+      <w:r>
+        <w:rPr>
+          <w:b/>
           <w:sz w:val="18"/>
-        </w:rPr>
-        <w:t>拾取-放置运动时序图（9.8s单次循环）</w:t>
+          <w:lang w:eastAsia="zh-CN"/>
+        </w:rPr>
+        <w:t xml:space="preserve">4-6  </w:t>
+      </w:r>
+      <w:r>
+        <w:rPr>
+          <w:sz w:val="18"/>
+          <w:lang w:eastAsia="zh-CN"/>
+        </w:rPr>
+        <w:t>拾取</w:t>
+      </w:r>
+      <w:r>
+        <w:rPr>
+          <w:sz w:val="18"/>
+          <w:lang w:eastAsia="zh-CN"/>
+        </w:rPr>
+        <w:t>-</w:t>
+      </w:r>
+      <w:r>
+        <w:rPr>
+          <w:sz w:val="18"/>
+          <w:lang w:eastAsia="zh-CN"/>
+        </w:rPr>
+        <w:t>放置运动时序图（</w:t>
+      </w:r>
+      <w:r>
+        <w:rPr>
+          <w:sz w:val="18"/>
+          <w:lang w:eastAsia="zh-CN"/>
+        </w:rPr>
+        <w:t>9.8s</w:t>
+      </w:r>
+      <w:r>
+        <w:rPr>
+          <w:sz w:val="18"/>
+          <w:lang w:eastAsia="zh-CN"/>
+        </w:rPr>
+        <w:t>单次循环）</w:t>
       </w:r>
     </w:p>
     <w:p>
@@ -30590,6 +31139,7 @@
         <w:rPr>
           <w:lang w:eastAsia="zh-CN"/>
         </w:rPr>
+        <w:lastRenderedPageBreak/>
         <w:t>将视觉识别、拼接决策、轨迹规划与运动控制四大模块集成为完整的自动化工作流，是系统工程实现的关键环节。工作流以有限状态机形式组织，共包含</w:t>
       </w:r>
       <w:r>
@@ -30939,31 +31489,76 @@
       <w:r>
         <w:t>transform.py</w:t>
       </w:r>
+      <w:r>
+        <w:t>读取并转换坐标后写入</w:t>
+      </w:r>
+      <w:r>
+        <w:t>transformed_result.txt</w:t>
+      </w:r>
+      <w:r>
+        <w:t>，再由</w:t>
+      </w:r>
+      <w:r>
+        <w:t>moveJ_P.py</w:t>
+      </w:r>
+      <w:r>
+        <w:t>读取并驱动机械臂执行。</w:t>
+      </w:r>
+      <w:r>
+        <w:rPr>
+          <w:lang w:eastAsia="zh-CN"/>
+        </w:rPr>
+        <w:t>文件接口设计简化了模块间的数据传递，避免了</w:t>
+      </w:r>
+      <w:r>
+        <w:rPr>
+          <w:lang w:eastAsia="zh-CN"/>
+        </w:rPr>
+        <w:t>ROS</w:t>
+      </w:r>
+      <w:r>
+        <w:rPr>
+          <w:lang w:eastAsia="zh-CN"/>
+        </w:rPr>
+        <w:t>话题通信中的消息序列化开销，但引入了文件</w:t>
+      </w:r>
+      <w:r>
+        <w:rPr>
+          <w:lang w:eastAsia="zh-CN"/>
+        </w:rPr>
+        <w:t>I/O</w:t>
+      </w:r>
+      <w:r>
+        <w:rPr>
+          <w:lang w:eastAsia="zh-CN"/>
+        </w:rPr>
+        <w:t>延迟（约</w:t>
+      </w:r>
+      <w:r>
+        <w:rPr>
+          <w:lang w:eastAsia="zh-CN"/>
+        </w:rPr>
+        <w:t xml:space="preserve">2-5 </w:t>
+      </w:r>
       <w:proofErr w:type="spellStart"/>
       <w:r>
-        <w:t>读取并转换坐标后写入</w:t>
-      </w:r>
-      <w:r>
-        <w:t>transformed_result.txt</w:t>
-      </w:r>
-      <w:r>
-        <w:t>，再由</w:t>
-      </w:r>
-      <w:r>
-        <w:t>moveJ_P.py</w:t>
-      </w:r>
-      <w:r>
-        <w:t>读取并驱动机械臂执行</w:t>
+        <w:rPr>
+          <w:lang w:eastAsia="zh-CN"/>
+        </w:rPr>
+        <w:t>ms</w:t>
       </w:r>
       <w:proofErr w:type="spellEnd"/>
       <w:r>
-        <w:t>。</w:t>
-      </w:r>
-      <w:r>
-        <w:rPr>
-          <w:lang w:eastAsia="zh-CN"/>
-        </w:rPr>
-        <w:t>文件接口设计简化了模块间的数据传递，避免了</w:t>
+        <w:rPr>
+          <w:lang w:eastAsia="zh-CN"/>
+        </w:rPr>
+        <w:t>/</w:t>
+      </w:r>
+      <w:r>
+        <w:rPr>
+          <w:lang w:eastAsia="zh-CN"/>
+        </w:rPr>
+        <w:t>次），在实时性要求更高的场景下可替换为</w:t>
       </w:r>
       <w:r>
         <w:rPr>
@@ -30975,56 +31570,6 @@
         <w:rPr>
           <w:lang w:eastAsia="zh-CN"/>
         </w:rPr>
-        <w:t>话题通信中的消息序列化开销，但引入了文件</w:t>
-      </w:r>
-      <w:r>
-        <w:rPr>
-          <w:lang w:eastAsia="zh-CN"/>
-        </w:rPr>
-        <w:t>I/O</w:t>
-      </w:r>
-      <w:r>
-        <w:rPr>
-          <w:lang w:eastAsia="zh-CN"/>
-        </w:rPr>
-        <w:t>延迟（约</w:t>
-      </w:r>
-      <w:r>
-        <w:rPr>
-          <w:lang w:eastAsia="zh-CN"/>
-        </w:rPr>
-        <w:t xml:space="preserve">2-5 </w:t>
-      </w:r>
-      <w:proofErr w:type="spellStart"/>
-      <w:r>
-        <w:rPr>
-          <w:lang w:eastAsia="zh-CN"/>
-        </w:rPr>
-        <w:t>ms</w:t>
-      </w:r>
-      <w:proofErr w:type="spellEnd"/>
-      <w:r>
-        <w:rPr>
-          <w:lang w:eastAsia="zh-CN"/>
-        </w:rPr>
-        <w:t>/</w:t>
-      </w:r>
-      <w:r>
-        <w:rPr>
-          <w:lang w:eastAsia="zh-CN"/>
-        </w:rPr>
-        <w:t>次），在实时性要求更高的场景下可替换为</w:t>
-      </w:r>
-      <w:r>
-        <w:rPr>
-          <w:lang w:eastAsia="zh-CN"/>
-        </w:rPr>
-        <w:t>ROS</w:t>
-      </w:r>
-      <w:r>
-        <w:rPr>
-          <w:lang w:eastAsia="zh-CN"/>
-        </w:rPr>
         <w:t>话题直接通信。</w:t>
       </w:r>
     </w:p>
@@ -31034,12 +31579,6 @@
           <w:lang w:eastAsia="zh-CN"/>
         </w:rPr>
       </w:pPr>
-      <w:r>
-        <w:rPr>
-          <w:lang w:eastAsia="zh-CN"/>
-        </w:rPr>
-        <w:lastRenderedPageBreak/>
-      </w:r>
     </w:p>
     <w:p>
       <w:pPr>
@@ -31049,6 +31588,7 @@
         <w:rPr>
           <w:lang w:eastAsia="zh-CN"/>
         </w:rPr>
+        <w:br w:type="page"/>
       </w:pPr>
       <w:bookmarkStart w:id="45" w:name="_Toc229276481"/>
       <w:r>
@@ -31108,16 +31648,20 @@
         <w:jc w:val="center"/>
       </w:pPr>
       <w:r>
+        <w:rPr>
+          <w:noProof/>
+        </w:rPr>
         <w:drawing>
-          <wp:inline xmlns:a="http://schemas.openxmlformats.org/drawingml/2006/main" xmlns:pic="http://schemas.openxmlformats.org/drawingml/2006/picture">
+          <wp:inline distT="0" distB="0" distL="0" distR="0" wp14:anchorId="7B395773" wp14:editId="61DCD840">
             <wp:extent cx="4572000" cy="4572000"/>
+            <wp:effectExtent l="0" t="0" r="0" b="0"/>
             <wp:docPr id="10" name="Picture 10"/>
             <wp:cNvGraphicFramePr>
-              <a:graphicFrameLocks noChangeAspect="1"/>
+              <a:graphicFrameLocks xmlns:a="http://schemas.openxmlformats.org/drawingml/2006/main" noChangeAspect="1"/>
             </wp:cNvGraphicFramePr>
-            <a:graphic>
+            <a:graphic xmlns:a="http://schemas.openxmlformats.org/drawingml/2006/main">
               <a:graphicData uri="http://schemas.openxmlformats.org/drawingml/2006/picture">
-                <pic:pic>
+                <pic:pic xmlns:pic="http://schemas.openxmlformats.org/drawingml/2006/picture">
                   <pic:nvPicPr>
                     <pic:cNvPr id="0" name="system_running.jpg"/>
                     <pic:cNvPicPr/>
@@ -31133,7 +31677,9 @@
                       <a:off x="0" y="0"/>
                       <a:ext cx="4572000" cy="4572000"/>
                     </a:xfrm>
-                    <a:prstGeom prst="rect"/>
+                    <a:prstGeom prst="rect">
+                      <a:avLst/>
+                    </a:prstGeom>
                   </pic:spPr>
                 </pic:pic>
               </a:graphicData>
@@ -31146,21 +31692,74 @@
       <w:pPr>
         <w:spacing w:after="200"/>
         <w:jc w:val="center"/>
-      </w:pPr>
-      <w:r>
-        <w:rPr>
-          <w:rFonts w:ascii="Times New Roman" w:hAnsi="Times New Roman"/>
+        <w:rPr>
+          <w:lang w:eastAsia="zh-CN"/>
+        </w:rPr>
+      </w:pPr>
+      <w:r>
+        <w:rPr>
           <w:b/>
           <w:sz w:val="18"/>
-        </w:rPr>
-        <w:t xml:space="preserve">图5-1  </w:t>
-      </w:r>
-      <w:r>
-        <w:rPr>
-          <w:rFonts w:ascii="Times New Roman" w:hAnsi="Times New Roman"/>
+          <w:lang w:eastAsia="zh-CN"/>
+        </w:rPr>
+        <w:t>图</w:t>
+      </w:r>
+      <w:r>
+        <w:rPr>
+          <w:b/>
           <w:sz w:val="18"/>
-        </w:rPr>
-        <w:t>系统整体运行场景（RM65-B机械臂 + D435相机 + 工作台）</w:t>
+          <w:lang w:eastAsia="zh-CN"/>
+        </w:rPr>
+        <w:t xml:space="preserve">5-1  </w:t>
+      </w:r>
+      <w:r>
+        <w:rPr>
+          <w:sz w:val="18"/>
+          <w:lang w:eastAsia="zh-CN"/>
+        </w:rPr>
+        <w:t>系统整体运行场景（</w:t>
+      </w:r>
+      <w:r>
+        <w:rPr>
+          <w:sz w:val="18"/>
+          <w:lang w:eastAsia="zh-CN"/>
+        </w:rPr>
+        <w:t>RM65-B</w:t>
+      </w:r>
+      <w:r>
+        <w:rPr>
+          <w:sz w:val="18"/>
+          <w:lang w:eastAsia="zh-CN"/>
+        </w:rPr>
+        <w:t>机械臂</w:t>
+      </w:r>
+      <w:r>
+        <w:rPr>
+          <w:sz w:val="18"/>
+          <w:lang w:eastAsia="zh-CN"/>
+        </w:rPr>
+        <w:t xml:space="preserve"> + D435</w:t>
+      </w:r>
+      <w:r>
+        <w:rPr>
+          <w:sz w:val="18"/>
+          <w:lang w:eastAsia="zh-CN"/>
+        </w:rPr>
+        <w:t>相机</w:t>
+      </w:r>
+      <w:r>
+        <w:rPr>
+          <w:sz w:val="18"/>
+          <w:lang w:eastAsia="zh-CN"/>
+        </w:rPr>
+        <w:t xml:space="preserve"> + </w:t>
+      </w:r>
+      <w:r>
+        <w:rPr>
+          <w:sz w:val="18"/>
+          <w:lang w:eastAsia="zh-CN"/>
+        </w:rPr>
+        <w:t>工作台）</w:t>
       </w:r>
     </w:p>
     <w:p>
@@ -31392,7 +31991,14 @@
         <w:rPr>
           <w:lang w:eastAsia="zh-CN"/>
         </w:rPr>
-        <w:t>次，记录以下指标：方块检测数量与精度、抓取成功率、放置精度（与目标位置偏差）、单次循环时间、连续运行稳定性。</w:t>
+        <w:t>次，记</w:t>
+      </w:r>
+      <w:r>
+        <w:rPr>
+          <w:lang w:eastAsia="zh-CN"/>
+        </w:rPr>
+        <w:lastRenderedPageBreak/>
+        <w:t>录以下指标：方块检测数量与精度、抓取成功率、放置精度（与目标位置偏差）、单次循环时间、连续运行稳定性。</w:t>
       </w:r>
     </w:p>
     <w:p>
@@ -31431,22 +32037,26 @@
         <w:jc w:val="center"/>
       </w:pPr>
       <w:r>
+        <w:rPr>
+          <w:noProof/>
+        </w:rPr>
         <w:drawing>
-          <wp:inline xmlns:a="http://schemas.openxmlformats.org/drawingml/2006/main" xmlns:pic="http://schemas.openxmlformats.org/drawingml/2006/picture">
+          <wp:inline distT="0" distB="0" distL="0" distR="0" wp14:anchorId="70610AA7" wp14:editId="55E2AF17">
             <wp:extent cx="4572000" cy="2571750"/>
+            <wp:effectExtent l="0" t="0" r="0" b="0"/>
             <wp:docPr id="9" name="Picture 9"/>
             <wp:cNvGraphicFramePr>
-              <a:graphicFrameLocks noChangeAspect="1"/>
+              <a:graphicFrameLocks xmlns:a="http://schemas.openxmlformats.org/drawingml/2006/main" noChangeAspect="1"/>
             </wp:cNvGraphicFramePr>
-            <a:graphic>
+            <a:graphic xmlns:a="http://schemas.openxmlformats.org/drawingml/2006/main">
               <a:graphicData uri="http://schemas.openxmlformats.org/drawingml/2006/picture">
-                <pic:pic>
+                <pic:pic xmlns:pic="http://schemas.openxmlformats.org/drawingml/2006/picture">
                   <pic:nvPicPr>
                     <pic:cNvPr id="0" name="recognition_diagram.jpg"/>
                     <pic:cNvPicPr/>
                   </pic:nvPicPr>
                   <pic:blipFill>
-                    <a:blip r:embed="rId15"/>
+                    <a:blip r:embed="rId17"/>
                     <a:stretch>
                       <a:fillRect/>
                     </a:stretch>
@@ -31456,7 +32066,9 @@
                       <a:off x="0" y="0"/>
                       <a:ext cx="4572000" cy="2571750"/>
                     </a:xfrm>
-                    <a:prstGeom prst="rect"/>
+                    <a:prstGeom prst="rect">
+                      <a:avLst/>
+                    </a:prstGeom>
                   </pic:spPr>
                 </pic:pic>
               </a:graphicData>
@@ -31469,21 +32081,60 @@
       <w:pPr>
         <w:spacing w:after="200"/>
         <w:jc w:val="center"/>
-      </w:pPr>
-      <w:r>
-        <w:rPr>
-          <w:rFonts w:ascii="Times New Roman" w:hAnsi="Times New Roman"/>
+        <w:rPr>
+          <w:lang w:eastAsia="zh-CN"/>
+        </w:rPr>
+      </w:pPr>
+      <w:r>
+        <w:rPr>
           <w:b/>
           <w:sz w:val="18"/>
-        </w:rPr>
-        <w:t xml:space="preserve">图5-2  </w:t>
-      </w:r>
-      <w:r>
-        <w:rPr>
-          <w:rFonts w:ascii="Times New Roman" w:hAnsi="Times New Roman"/>
+          <w:lang w:eastAsia="zh-CN"/>
+        </w:rPr>
+        <w:t>图</w:t>
+      </w:r>
+      <w:r>
+        <w:rPr>
+          <w:b/>
           <w:sz w:val="18"/>
-        </w:rPr>
-        <w:t>俄罗斯方块视觉识别效果（YOLOv8实例分割+分类标注）</w:t>
+          <w:lang w:eastAsia="zh-CN"/>
+        </w:rPr>
+        <w:t xml:space="preserve">5-2  </w:t>
+      </w:r>
+      <w:r>
+        <w:rPr>
+          <w:sz w:val="18"/>
+          <w:lang w:eastAsia="zh-CN"/>
+        </w:rPr>
+        <w:t>俄罗斯方块视觉识别效果（</w:t>
+      </w:r>
+      <w:r>
+        <w:rPr>
+          <w:sz w:val="18"/>
+          <w:lang w:eastAsia="zh-CN"/>
+        </w:rPr>
+        <w:t>YOLOv8</w:t>
+      </w:r>
+      <w:r>
+        <w:rPr>
+          <w:sz w:val="18"/>
+          <w:lang w:eastAsia="zh-CN"/>
+        </w:rPr>
+        <w:t>实例分割</w:t>
+      </w:r>
+      <w:r>
+        <w:rPr>
+          <w:sz w:val="18"/>
+          <w:lang w:eastAsia="zh-CN"/>
+        </w:rPr>
+        <w:t>+</w:t>
+      </w:r>
+      <w:r>
+        <w:rPr>
+          <w:sz w:val="18"/>
+          <w:lang w:eastAsia="zh-CN"/>
+        </w:rPr>
+        <w:t>分类标注）</w:t>
       </w:r>
     </w:p>
     <w:p>
@@ -32201,7 +32852,14 @@
         <w:rPr>
           <w:lang w:eastAsia="zh-CN"/>
         </w:rPr>
-        <w:t>）成为系统端到端延迟的主要瓶颈。在良好光照条件（</w:t>
+        <w:t>）成为系统端到端延迟的主要瓶颈。在良好光照</w:t>
+      </w:r>
+      <w:r>
+        <w:rPr>
+          <w:lang w:eastAsia="zh-CN"/>
+        </w:rPr>
+        <w:lastRenderedPageBreak/>
+        <w:t>条件（</w:t>
       </w:r>
       <w:r>
         <w:rPr>
@@ -32231,14 +32889,7 @@
         <w:rPr>
           <w:lang w:eastAsia="zh-CN"/>
         </w:rPr>
-        <w:t xml:space="preserve">200 </w:t>
-      </w:r>
-      <w:r>
-        <w:rPr>
-          <w:lang w:eastAsia="zh-CN"/>
-        </w:rPr>
-        <w:lastRenderedPageBreak/>
-        <w:t>lux</w:t>
+        <w:t>200 lux</w:t>
       </w:r>
       <w:r>
         <w:rPr>
@@ -32789,22 +33440,26 @@
         <w:jc w:val="center"/>
       </w:pPr>
       <w:r>
+        <w:rPr>
+          <w:noProof/>
+        </w:rPr>
         <w:drawing>
-          <wp:inline xmlns:a="http://schemas.openxmlformats.org/drawingml/2006/main" xmlns:pic="http://schemas.openxmlformats.org/drawingml/2006/picture">
+          <wp:inline distT="0" distB="0" distL="0" distR="0" wp14:anchorId="7463DA19" wp14:editId="35B2DBA2">
             <wp:extent cx="4572000" cy="4572000"/>
+            <wp:effectExtent l="0" t="0" r="0" b="0"/>
             <wp:docPr id="8" name="Picture 8"/>
             <wp:cNvGraphicFramePr>
-              <a:graphicFrameLocks noChangeAspect="1"/>
+              <a:graphicFrameLocks xmlns:a="http://schemas.openxmlformats.org/drawingml/2006/main" noChangeAspect="1"/>
             </wp:cNvGraphicFramePr>
-            <a:graphic>
+            <a:graphic xmlns:a="http://schemas.openxmlformats.org/drawingml/2006/main">
               <a:graphicData uri="http://schemas.openxmlformats.org/drawingml/2006/picture">
-                <pic:pic>
+                <pic:pic xmlns:pic="http://schemas.openxmlformats.org/drawingml/2006/picture">
                   <pic:nvPicPr>
                     <pic:cNvPr id="0" name="grasping_process.jpg"/>
                     <pic:cNvPicPr/>
                   </pic:nvPicPr>
                   <pic:blipFill>
-                    <a:blip r:embed="rId14"/>
+                    <a:blip r:embed="rId18"/>
                     <a:stretch>
                       <a:fillRect/>
                     </a:stretch>
@@ -32814,7 +33469,9 @@
                       <a:off x="0" y="0"/>
                       <a:ext cx="4572000" cy="4572000"/>
                     </a:xfrm>
-                    <a:prstGeom prst="rect"/>
+                    <a:prstGeom prst="rect">
+                      <a:avLst/>
+                    </a:prstGeom>
                   </pic:spPr>
                 </pic:pic>
               </a:graphicData>
@@ -32827,19 +33484,31 @@
       <w:pPr>
         <w:spacing w:after="200"/>
         <w:jc w:val="center"/>
-      </w:pPr>
-      <w:r>
-        <w:rPr>
-          <w:rFonts w:ascii="Times New Roman" w:hAnsi="Times New Roman"/>
+        <w:rPr>
+          <w:lang w:eastAsia="zh-CN"/>
+        </w:rPr>
+      </w:pPr>
+      <w:r>
+        <w:rPr>
           <w:b/>
           <w:sz w:val="18"/>
-        </w:rPr>
-        <w:t xml:space="preserve">图5-3  </w:t>
-      </w:r>
-      <w:r>
-        <w:rPr>
-          <w:rFonts w:ascii="Times New Roman" w:hAnsi="Times New Roman"/>
+          <w:lang w:eastAsia="zh-CN"/>
+        </w:rPr>
+        <w:lastRenderedPageBreak/>
+        <w:t>图</w:t>
+      </w:r>
+      <w:r>
+        <w:rPr>
+          <w:b/>
           <w:sz w:val="18"/>
+          <w:lang w:eastAsia="zh-CN"/>
+        </w:rPr>
+        <w:t xml:space="preserve">5-3  </w:t>
+      </w:r>
+      <w:r>
+        <w:rPr>
+          <w:sz w:val="18"/>
+          <w:lang w:eastAsia="zh-CN"/>
         </w:rPr>
         <w:t>气动吸盘精准拾取俄罗斯方块过程</w:t>
       </w:r>
@@ -33678,14 +34347,7 @@
         <w:rPr>
           <w:lang w:eastAsia="zh-CN"/>
         </w:rPr>
-        <w:t>值</w:t>
-      </w:r>
-      <w:r>
-        <w:rPr>
-          <w:lang w:eastAsia="zh-CN"/>
-        </w:rPr>
-        <w:lastRenderedPageBreak/>
-        <w:t>（</w:t>
+        <w:t>值（</w:t>
       </w:r>
       <w:r>
         <w:rPr>
@@ -34137,6 +34799,7 @@
                 <w:rFonts w:ascii="宋体" w:hAnsi="宋体"/>
                 <w:sz w:val="20"/>
               </w:rPr>
+              <w:lastRenderedPageBreak/>
               <w:t>纯DQN</w:t>
             </w:r>
           </w:p>
@@ -34545,22 +35208,26 @@
         <w:jc w:val="center"/>
       </w:pPr>
       <w:r>
+        <w:rPr>
+          <w:noProof/>
+        </w:rPr>
         <w:drawing>
-          <wp:inline xmlns:a="http://schemas.openxmlformats.org/drawingml/2006/main" xmlns:pic="http://schemas.openxmlformats.org/drawingml/2006/picture">
+          <wp:inline distT="0" distB="0" distL="0" distR="0" wp14:anchorId="29A094B8" wp14:editId="10761988">
             <wp:extent cx="4572000" cy="4572000"/>
+            <wp:effectExtent l="0" t="0" r="0" b="0"/>
             <wp:docPr id="7" name="Picture 7"/>
             <wp:cNvGraphicFramePr>
-              <a:graphicFrameLocks noChangeAspect="1"/>
+              <a:graphicFrameLocks xmlns:a="http://schemas.openxmlformats.org/drawingml/2006/main" noChangeAspect="1"/>
             </wp:cNvGraphicFramePr>
-            <a:graphic>
+            <a:graphic xmlns:a="http://schemas.openxmlformats.org/drawingml/2006/main">
               <a:graphicData uri="http://schemas.openxmlformats.org/drawingml/2006/picture">
-                <pic:pic>
+                <pic:pic xmlns:pic="http://schemas.openxmlformats.org/drawingml/2006/picture">
                   <pic:nvPicPr>
                     <pic:cNvPr id="0" name="assembly_result.jpg"/>
                     <pic:cNvPicPr/>
                   </pic:nvPicPr>
                   <pic:blipFill>
-                    <a:blip r:embed="rId13"/>
+                    <a:blip r:embed="rId19"/>
                     <a:stretch>
                       <a:fillRect/>
                     </a:stretch>
@@ -34570,7 +35237,9 @@
                       <a:off x="0" y="0"/>
                       <a:ext cx="4572000" cy="4572000"/>
                     </a:xfrm>
-                    <a:prstGeom prst="rect"/>
+                    <a:prstGeom prst="rect">
+                      <a:avLst/>
+                    </a:prstGeom>
                   </pic:spPr>
                 </pic:pic>
               </a:graphicData>
@@ -34583,21 +35252,40 @@
       <w:pPr>
         <w:spacing w:after="200"/>
         <w:jc w:val="center"/>
-      </w:pPr>
-      <w:r>
-        <w:rPr>
-          <w:rFonts w:ascii="Times New Roman" w:hAnsi="Times New Roman"/>
+        <w:rPr>
+          <w:lang w:eastAsia="zh-CN"/>
+        </w:rPr>
+      </w:pPr>
+      <w:r>
+        <w:rPr>
           <w:b/>
           <w:sz w:val="18"/>
-        </w:rPr>
-        <w:t xml:space="preserve">图5-4  </w:t>
-      </w:r>
-      <w:r>
-        <w:rPr>
-          <w:rFonts w:ascii="Times New Roman" w:hAnsi="Times New Roman"/>
+          <w:lang w:eastAsia="zh-CN"/>
+        </w:rPr>
+        <w:lastRenderedPageBreak/>
+        <w:t>图</w:t>
+      </w:r>
+      <w:r>
+        <w:rPr>
+          <w:b/>
           <w:sz w:val="18"/>
-        </w:rPr>
-        <w:t>35块俄罗斯方块全自动拼接完成效果</w:t>
+          <w:lang w:eastAsia="zh-CN"/>
+        </w:rPr>
+        <w:t xml:space="preserve">5-4  </w:t>
+      </w:r>
+      <w:r>
+        <w:rPr>
+          <w:sz w:val="18"/>
+          <w:lang w:eastAsia="zh-CN"/>
+        </w:rPr>
+        <w:t>35</w:t>
+      </w:r>
+      <w:r>
+        <w:rPr>
+          <w:sz w:val="18"/>
+          <w:lang w:eastAsia="zh-CN"/>
+        </w:rPr>
+        <w:t>块俄罗斯方块全自动拼接完成效果</w:t>
       </w:r>
     </w:p>
     <w:p>
@@ -34875,7 +35563,6 @@
                 <w:b/>
                 <w:sz w:val="20"/>
               </w:rPr>
-              <w:lastRenderedPageBreak/>
               <w:t>性能指标</w:t>
             </w:r>
             <w:proofErr w:type="spellEnd"/>
@@ -35490,14 +36177,13 @@
       </w:tr>
     </w:tbl>
     <w:p/>
-    <w:p>
-      <w:r/>
-    </w:p>
+    <w:p/>
     <w:p>
       <w:pPr>
         <w:pStyle w:val="1"/>
         <w:spacing w:before="360" w:after="240" w:line="300" w:lineRule="auto"/>
         <w:jc w:val="left"/>
+        <w:br w:type="page"/>
       </w:pPr>
       <w:bookmarkStart w:id="51" w:name="_Toc229276487"/>
       <w:r>
@@ -35506,7 +36192,6 @@
           <w:color w:val="000000"/>
           <w:sz w:val="32"/>
         </w:rPr>
-        <w:lastRenderedPageBreak/>
         <w:t xml:space="preserve">6. </w:t>
       </w:r>
       <w:r>
@@ -35575,6 +36260,7 @@
         <w:rPr>
           <w:lang w:eastAsia="zh-CN"/>
         </w:rPr>
+        <w:lastRenderedPageBreak/>
         <w:t xml:space="preserve">(1) </w:t>
       </w:r>
       <w:r>
@@ -35697,16 +36383,11 @@
       <w:r>
         <w:t>transformed_result.txt</w:t>
       </w:r>
-      <w:proofErr w:type="spellStart"/>
       <w:r>
         <w:t>的中转文件读写引入了不必要的磁盘</w:t>
       </w:r>
       <w:r>
-        <w:t>I</w:t>
-      </w:r>
-      <w:proofErr w:type="spellEnd"/>
-      <w:r>
-        <w:t>/O</w:t>
+        <w:t>I/O</w:t>
       </w:r>
       <w:r>
         <w:t>延迟（约</w:t>
@@ -36255,14 +36936,6 @@
                 <w:lang w:eastAsia="zh-CN"/>
               </w:rPr>
               <w:br/>
-            </w:r>
-            <w:r>
-              <w:rPr>
-                <w:rFonts w:ascii="宋体" w:hAnsi="宋体"/>
-                <w:sz w:val="20"/>
-                <w:lang w:eastAsia="zh-CN"/>
-              </w:rPr>
-              <w:lastRenderedPageBreak/>
               <w:t>1.9M参数</w:t>
             </w:r>
           </w:p>
@@ -36280,7 +36953,6 @@
                 <w:rFonts w:ascii="宋体" w:hAnsi="宋体"/>
                 <w:sz w:val="20"/>
               </w:rPr>
-              <w:lastRenderedPageBreak/>
               <w:t xml:space="preserve">推理时间~12 </w:t>
             </w:r>
             <w:proofErr w:type="spellStart"/>
@@ -36297,15 +36969,7 @@
                 <w:rFonts w:ascii="宋体" w:hAnsi="宋体"/>
                 <w:sz w:val="20"/>
               </w:rPr>
-              <w:t xml:space="preserve"> </w:t>
-            </w:r>
-            <w:r>
-              <w:rPr>
-                <w:rFonts w:ascii="宋体" w:hAnsi="宋体"/>
-                <w:sz w:val="20"/>
-              </w:rPr>
-              <w:lastRenderedPageBreak/>
-              <w:t>(Jetson),</w:t>
+              <w:t xml:space="preserve"> (Jetson),</w:t>
             </w:r>
             <w:r>
               <w:rPr>
@@ -36356,7 +37020,6 @@
                 <w:rFonts w:ascii="宋体" w:hAnsi="宋体"/>
                 <w:sz w:val="20"/>
               </w:rPr>
-              <w:lastRenderedPageBreak/>
               <w:t>轨迹同步</w:t>
             </w:r>
           </w:p>
@@ -36485,6 +37148,14 @@
                 <w:lang w:eastAsia="zh-CN"/>
               </w:rPr>
               <w:br/>
+            </w:r>
+            <w:r>
+              <w:rPr>
+                <w:rFonts w:ascii="宋体" w:hAnsi="宋体"/>
+                <w:sz w:val="20"/>
+                <w:lang w:eastAsia="zh-CN"/>
+              </w:rPr>
+              <w:lastRenderedPageBreak/>
               <w:t xml:space="preserve">(2-5 </w:t>
             </w:r>
             <w:proofErr w:type="spellStart"/>
@@ -36521,6 +37192,7 @@
                 <w:rFonts w:ascii="宋体" w:hAnsi="宋体"/>
                 <w:sz w:val="20"/>
               </w:rPr>
+              <w:lastRenderedPageBreak/>
               <w:t>ROS话题直接通信</w:t>
             </w:r>
             <w:proofErr w:type="spellEnd"/>
@@ -36544,6 +37216,7 @@
                 <w:rFonts w:ascii="宋体" w:hAnsi="宋体"/>
                 <w:sz w:val="20"/>
               </w:rPr>
+              <w:lastRenderedPageBreak/>
               <w:t>自定义TetrisDetection消息</w:t>
             </w:r>
             <w:proofErr w:type="spellEnd"/>
@@ -36566,6 +37239,7 @@
                 <w:sz w:val="20"/>
                 <w:lang w:eastAsia="zh-CN"/>
               </w:rPr>
+              <w:lastRenderedPageBreak/>
               <w:t xml:space="preserve">数据传输延迟&lt;1 </w:t>
             </w:r>
             <w:proofErr w:type="spellStart"/>
@@ -36593,6 +37267,14 @@
                 <w:lang w:eastAsia="zh-CN"/>
               </w:rPr>
               <w:br/>
+            </w:r>
+            <w:r>
+              <w:rPr>
+                <w:rFonts w:ascii="宋体" w:hAnsi="宋体"/>
+                <w:sz w:val="20"/>
+                <w:lang w:eastAsia="zh-CN"/>
+              </w:rPr>
+              <w:lastRenderedPageBreak/>
               <w:t>消除文件I/O瓶颈</w:t>
             </w:r>
           </w:p>
@@ -36613,6 +37295,7 @@
                 <w:rFonts w:ascii="宋体" w:hAnsi="宋体"/>
                 <w:sz w:val="20"/>
               </w:rPr>
+              <w:lastRenderedPageBreak/>
               <w:t>光照适应</w:t>
             </w:r>
             <w:proofErr w:type="spellEnd"/>
@@ -37055,43 +37738,46 @@
         <w:t>&gt;100×</w:t>
       </w:r>
       <w:r>
-        <w:t>）与轨迹规划算</w:t>
-      </w:r>
-      <w:r>
+        <w:t>）与轨迹规划算法的验证，通过域随机化（</w:t>
+      </w:r>
+      <w:r>
+        <w:t>Domain Randomization</w:t>
+      </w:r>
+      <w:r>
+        <w:t>）提升仿真到现实（</w:t>
+      </w:r>
+      <w:r>
+        <w:t>Sim-to-Real</w:t>
+      </w:r>
+      <w:r>
+        <w:t>）的迁移效果，预期将策略部署后的调试时间缩短</w:t>
+      </w:r>
+      <w:r>
+        <w:t>60%</w:t>
+      </w:r>
+      <w:r>
+        <w:t>以上。</w:t>
+      </w:r>
+    </w:p>
+    <w:p>
+      <w:pPr>
+        <w:ind w:firstLine="420"/>
+        <w:rPr>
+          <w:lang w:eastAsia="zh-CN"/>
+        </w:rPr>
+      </w:pPr>
+      <w:r>
+        <w:rPr>
+          <w:lang w:eastAsia="zh-CN"/>
+        </w:rPr>
+        <w:t>综上所述，本系统已具备完整的俄罗斯方块自动化拼接能力，在标准化测试环境中各项指标达到设计预期。通过上述优化方案的逐步实施，系统性能有望进一步</w:t>
+      </w:r>
+      <w:r>
+        <w:rPr>
+          <w:lang w:eastAsia="zh-CN"/>
+        </w:rPr>
         <w:lastRenderedPageBreak/>
-        <w:t>法的验证，通过域随机化（</w:t>
-      </w:r>
-      <w:r>
-        <w:t>Domain Randomization</w:t>
-      </w:r>
-      <w:r>
-        <w:t>）提升仿真到现实（</w:t>
-      </w:r>
-      <w:r>
-        <w:t>Sim-to-Real</w:t>
-      </w:r>
-      <w:r>
-        <w:t>）的迁移效果，预期将策略部署后的调试时间缩短</w:t>
-      </w:r>
-      <w:r>
-        <w:t>60%</w:t>
-      </w:r>
-      <w:r>
-        <w:t>以上。</w:t>
-      </w:r>
-    </w:p>
-    <w:p>
-      <w:pPr>
-        <w:ind w:firstLine="420"/>
-        <w:rPr>
-          <w:lang w:eastAsia="zh-CN"/>
-        </w:rPr>
-      </w:pPr>
-      <w:r>
-        <w:rPr>
-          <w:lang w:eastAsia="zh-CN"/>
-        </w:rPr>
-        <w:t>综上所述，本系统已具备完整的俄罗斯方块自动化拼接能力，在标准化测试环境中各项指标达到设计预期。通过上述优化方案的逐步实施，系统性能有望进一步提升至识别精度</w:t>
+        <w:t>提升至识别精度</w:t>
       </w:r>
       <w:r>
         <w:rPr>
@@ -37136,17 +37822,147 @@
           <w:lang w:eastAsia="zh-CN"/>
         </w:rPr>
       </w:pPr>
-      <w:r>
-        <w:rPr>
-          <w:lang w:eastAsia="zh-CN"/>
-        </w:rPr>
-      </w:r>
+    </w:p>
+    <w:p>
+      <w:pPr>
+        <w:rPr>
+          <w:lang w:eastAsia="zh-CN"/>
+        </w:rPr>
+      </w:pPr>
+    </w:p>
+    <w:p>
+      <w:pPr>
+        <w:rPr>
+          <w:lang w:eastAsia="zh-CN"/>
+        </w:rPr>
+      </w:pPr>
+    </w:p>
+    <w:p>
+      <w:pPr>
+        <w:rPr>
+          <w:lang w:eastAsia="zh-CN"/>
+        </w:rPr>
+      </w:pPr>
+    </w:p>
+    <w:p>
+      <w:pPr>
+        <w:rPr>
+          <w:lang w:eastAsia="zh-CN"/>
+        </w:rPr>
+      </w:pPr>
+    </w:p>
+    <w:p>
+      <w:pPr>
+        <w:rPr>
+          <w:lang w:eastAsia="zh-CN"/>
+        </w:rPr>
+      </w:pPr>
+    </w:p>
+    <w:p>
+      <w:pPr>
+        <w:rPr>
+          <w:lang w:eastAsia="zh-CN"/>
+        </w:rPr>
+      </w:pPr>
+    </w:p>
+    <w:p>
+      <w:pPr>
+        <w:rPr>
+          <w:lang w:eastAsia="zh-CN"/>
+        </w:rPr>
+      </w:pPr>
+    </w:p>
+    <w:p>
+      <w:pPr>
+        <w:rPr>
+          <w:lang w:eastAsia="zh-CN"/>
+        </w:rPr>
+      </w:pPr>
+    </w:p>
+    <w:p>
+      <w:pPr>
+        <w:rPr>
+          <w:lang w:eastAsia="zh-CN"/>
+        </w:rPr>
+      </w:pPr>
+    </w:p>
+    <w:p>
+      <w:pPr>
+        <w:rPr>
+          <w:lang w:eastAsia="zh-CN"/>
+        </w:rPr>
+      </w:pPr>
+    </w:p>
+    <w:p>
+      <w:pPr>
+        <w:rPr>
+          <w:lang w:eastAsia="zh-CN"/>
+        </w:rPr>
+      </w:pPr>
+    </w:p>
+    <w:p>
+      <w:pPr>
+        <w:rPr>
+          <w:lang w:eastAsia="zh-CN"/>
+        </w:rPr>
+      </w:pPr>
+    </w:p>
+    <w:p>
+      <w:pPr>
+        <w:rPr>
+          <w:lang w:eastAsia="zh-CN"/>
+        </w:rPr>
+      </w:pPr>
+    </w:p>
+    <w:p>
+      <w:pPr>
+        <w:rPr>
+          <w:lang w:eastAsia="zh-CN"/>
+        </w:rPr>
+      </w:pPr>
+    </w:p>
+    <w:p>
+      <w:pPr>
+        <w:rPr>
+          <w:lang w:eastAsia="zh-CN"/>
+        </w:rPr>
+      </w:pPr>
+    </w:p>
+    <w:p>
+      <w:pPr>
+        <w:rPr>
+          <w:lang w:eastAsia="zh-CN"/>
+        </w:rPr>
+      </w:pPr>
+    </w:p>
+    <w:p>
+      <w:pPr>
+        <w:rPr>
+          <w:lang w:eastAsia="zh-CN"/>
+        </w:rPr>
+      </w:pPr>
+    </w:p>
+    <w:p>
+      <w:pPr>
+        <w:rPr>
+          <w:lang w:eastAsia="zh-CN"/>
+        </w:rPr>
+      </w:pPr>
+    </w:p>
+    <w:p>
+      <w:pPr>
+        <w:rPr>
+          <w:rFonts w:hint="eastAsia"/>
+          <w:lang w:eastAsia="zh-CN"/>
+        </w:rPr>
+      </w:pPr>
     </w:p>
     <w:p>
       <w:pPr>
         <w:pStyle w:val="1"/>
         <w:spacing w:before="360" w:after="240" w:line="300" w:lineRule="auto"/>
         <w:jc w:val="left"/>
+        <w:br w:type="page"/>
       </w:pPr>
       <w:bookmarkStart w:id="55" w:name="_Toc229276491"/>
       <w:proofErr w:type="spellStart"/>
@@ -37372,15 +38188,57 @@
       </w:r>
     </w:p>
     <w:p>
-      <w:r/>
+      <w:pPr>
+        <w:rPr>
+          <w:lang w:eastAsia="zh-CN"/>
+        </w:rPr>
+      </w:pPr>
+    </w:p>
+    <w:p>
+      <w:pPr>
+        <w:rPr>
+          <w:lang w:eastAsia="zh-CN"/>
+        </w:rPr>
+      </w:pPr>
+    </w:p>
+    <w:p>
+      <w:pPr>
+        <w:rPr>
+          <w:lang w:eastAsia="zh-CN"/>
+        </w:rPr>
+      </w:pPr>
+    </w:p>
+    <w:p>
+      <w:pPr>
+        <w:rPr>
+          <w:lang w:eastAsia="zh-CN"/>
+        </w:rPr>
+      </w:pPr>
+    </w:p>
+    <w:p>
+      <w:pPr>
+        <w:rPr>
+          <w:lang w:eastAsia="zh-CN"/>
+        </w:rPr>
+      </w:pPr>
+    </w:p>
+    <w:p>
+      <w:pPr>
+        <w:rPr>
+          <w:rFonts w:hint="eastAsia"/>
+          <w:lang w:eastAsia="zh-CN"/>
+        </w:rPr>
+      </w:pPr>
     </w:p>
     <w:p>
       <w:pPr>
         <w:pStyle w:val="1"/>
         <w:spacing w:before="360" w:after="240" w:line="300" w:lineRule="auto"/>
         <w:jc w:val="left"/>
+        <w:br w:type="page"/>
       </w:pPr>
       <w:bookmarkStart w:id="56" w:name="_Toc229276492"/>
+      <w:proofErr w:type="spellStart"/>
       <w:r>
         <w:rPr>
           <w:rFonts w:ascii="Times New Roman" w:eastAsia="宋体" w:hAnsi="Times New Roman"/>
@@ -37391,6 +38249,7 @@
         <w:t>附录</w:t>
       </w:r>
       <w:bookmarkEnd w:id="56"/>
+      <w:proofErr w:type="spellEnd"/>
     </w:p>
     <w:p>
       <w:pPr>
@@ -37952,281 +38811,6 @@
     </w:p>
     <w:p>
       <w:pPr>
-        <w:pBdr>
-          <w:left w:val="single" w:sz="4" w:space="4" w:color="C0C0C0"/>
-          <w:right w:val="single" w:sz="4" w:space="4" w:color="C0C0C0"/>
-        </w:pBdr>
-        <w:shd w:val="clear" w:color="auto" w:fill="F5F5F5"/>
-        <w:spacing w:after="0" w:line="276" w:lineRule="auto"/>
-        <w:ind w:left="283" w:right="283"/>
-      </w:pPr>
-      <w:r>
-        <w:rPr>
-          <w:rFonts w:ascii="Consolas" w:hAnsi="Consolas"/>
-          <w:sz w:val="17"/>
-        </w:rPr>
-        <w:t xml:space="preserve">        for r in results:</w:t>
-      </w:r>
-    </w:p>
-    <w:p>
-      <w:pPr>
-        <w:pBdr>
-          <w:left w:val="single" w:sz="4" w:space="4" w:color="C0C0C0"/>
-          <w:right w:val="single" w:sz="4" w:space="4" w:color="C0C0C0"/>
-        </w:pBdr>
-        <w:shd w:val="clear" w:color="auto" w:fill="F5F5F5"/>
-        <w:spacing w:after="0" w:line="276" w:lineRule="auto"/>
-        <w:ind w:left="283" w:right="283"/>
-      </w:pPr>
-      <w:r>
-        <w:rPr>
-          <w:rFonts w:ascii="Consolas" w:hAnsi="Consolas"/>
-          <w:sz w:val="17"/>
-        </w:rPr>
-        <w:t xml:space="preserve">            for box, mask, cls_id, conf in zip(</w:t>
-      </w:r>
-    </w:p>
-    <w:p>
-      <w:pPr>
-        <w:pBdr>
-          <w:left w:val="single" w:sz="4" w:space="4" w:color="C0C0C0"/>
-          <w:right w:val="single" w:sz="4" w:space="4" w:color="C0C0C0"/>
-        </w:pBdr>
-        <w:shd w:val="clear" w:color="auto" w:fill="F5F5F5"/>
-        <w:spacing w:after="0" w:line="276" w:lineRule="auto"/>
-        <w:ind w:left="283" w:right="283"/>
-      </w:pPr>
-      <w:r>
-        <w:rPr>
-          <w:rFonts w:ascii="Consolas" w:hAnsi="Consolas"/>
-          <w:sz w:val="17"/>
-        </w:rPr>
-        <w:t xml:space="preserve">                r.boxes.xyxy, r.masks.xy,</w:t>
-      </w:r>
-    </w:p>
-    <w:p>
-      <w:pPr>
-        <w:pBdr>
-          <w:left w:val="single" w:sz="4" w:space="4" w:color="C0C0C0"/>
-          <w:right w:val="single" w:sz="4" w:space="4" w:color="C0C0C0"/>
-        </w:pBdr>
-        <w:shd w:val="clear" w:color="auto" w:fill="F5F5F5"/>
-        <w:spacing w:after="0" w:line="276" w:lineRule="auto"/>
-        <w:ind w:left="283" w:right="283"/>
-      </w:pPr>
-      <w:r>
-        <w:rPr>
-          <w:rFonts w:ascii="Consolas" w:hAnsi="Consolas"/>
-          <w:sz w:val="17"/>
-        </w:rPr>
-        <w:t xml:space="preserve">                r.boxes.cls, r.boxes.conf</w:t>
-      </w:r>
-    </w:p>
-    <w:p>
-      <w:pPr>
-        <w:pBdr>
-          <w:left w:val="single" w:sz="4" w:space="4" w:color="C0C0C0"/>
-          <w:right w:val="single" w:sz="4" w:space="4" w:color="C0C0C0"/>
-        </w:pBdr>
-        <w:shd w:val="clear" w:color="auto" w:fill="F5F5F5"/>
-        <w:spacing w:after="0" w:line="276" w:lineRule="auto"/>
-        <w:ind w:left="283" w:right="283"/>
-      </w:pPr>
-      <w:r>
-        <w:rPr>
-          <w:rFonts w:ascii="Consolas" w:hAnsi="Consolas"/>
-          <w:sz w:val="17"/>
-        </w:rPr>
-        <w:t xml:space="preserve">            ):</w:t>
-      </w:r>
-    </w:p>
-    <w:p>
-      <w:pPr>
-        <w:pBdr>
-          <w:left w:val="single" w:sz="4" w:space="4" w:color="C0C0C0"/>
-          <w:right w:val="single" w:sz="4" w:space="4" w:color="C0C0C0"/>
-        </w:pBdr>
-        <w:shd w:val="clear" w:color="auto" w:fill="F5F5F5"/>
-        <w:spacing w:after="0" w:line="276" w:lineRule="auto"/>
-        <w:ind w:left="283" w:right="283"/>
-      </w:pPr>
-      <w:r>
-        <w:rPr>
-          <w:rFonts w:ascii="Consolas" w:hAnsi="Consolas"/>
-          <w:sz w:val="17"/>
-        </w:rPr>
-        <w:t xml:space="preserve">                det = Detection()</w:t>
-      </w:r>
-    </w:p>
-    <w:p>
-      <w:pPr>
-        <w:pBdr>
-          <w:left w:val="single" w:sz="4" w:space="4" w:color="C0C0C0"/>
-          <w:right w:val="single" w:sz="4" w:space="4" w:color="C0C0C0"/>
-        </w:pBdr>
-        <w:shd w:val="clear" w:color="auto" w:fill="F5F5F5"/>
-        <w:spacing w:after="0" w:line="276" w:lineRule="auto"/>
-        <w:ind w:left="283" w:right="283"/>
-      </w:pPr>
-      <w:r>
-        <w:rPr>
-          <w:rFonts w:ascii="Consolas" w:hAnsi="Consolas"/>
-          <w:sz w:val="17"/>
-        </w:rPr>
-        <w:t xml:space="preserve">                det.class_id = int(cls_id)</w:t>
-      </w:r>
-    </w:p>
-    <w:p>
-      <w:pPr>
-        <w:pBdr>
-          <w:left w:val="single" w:sz="4" w:space="4" w:color="C0C0C0"/>
-          <w:right w:val="single" w:sz="4" w:space="4" w:color="C0C0C0"/>
-        </w:pBdr>
-        <w:shd w:val="clear" w:color="auto" w:fill="F5F5F5"/>
-        <w:spacing w:after="0" w:line="276" w:lineRule="auto"/>
-        <w:ind w:left="283" w:right="283"/>
-      </w:pPr>
-      <w:r>
-        <w:rPr>
-          <w:rFonts w:ascii="Consolas" w:hAnsi="Consolas"/>
-          <w:sz w:val="17"/>
-        </w:rPr>
-        <w:t xml:space="preserve">                det.confidence = float(conf)</w:t>
-      </w:r>
-    </w:p>
-    <w:p>
-      <w:pPr>
-        <w:pBdr>
-          <w:left w:val="single" w:sz="4" w:space="4" w:color="C0C0C0"/>
-          <w:right w:val="single" w:sz="4" w:space="4" w:color="C0C0C0"/>
-        </w:pBdr>
-        <w:shd w:val="clear" w:color="auto" w:fill="F5F5F5"/>
-        <w:spacing w:after="0" w:line="276" w:lineRule="auto"/>
-        <w:ind w:left="283" w:right="283"/>
-      </w:pPr>
-      <w:r>
-        <w:rPr>
-          <w:rFonts w:ascii="Consolas" w:hAnsi="Consolas"/>
-          <w:sz w:val="17"/>
-        </w:rPr>
-        <w:t xml:space="preserve">                det.centroid = self.compute_centroid(mask)</w:t>
-      </w:r>
-    </w:p>
-    <w:p>
-      <w:pPr>
-        <w:pBdr>
-          <w:left w:val="single" w:sz="4" w:space="4" w:color="C0C0C0"/>
-          <w:right w:val="single" w:sz="4" w:space="4" w:color="C0C0C0"/>
-        </w:pBdr>
-        <w:shd w:val="clear" w:color="auto" w:fill="F5F5F5"/>
-        <w:spacing w:after="0" w:line="276" w:lineRule="auto"/>
-        <w:ind w:left="283" w:right="283"/>
-      </w:pPr>
-      <w:r>
-        <w:rPr>
-          <w:rFonts w:ascii="Consolas" w:hAnsi="Consolas"/>
-          <w:sz w:val="17"/>
-        </w:rPr>
-        <w:t xml:space="preserve">                detections.detections.append(det)</w:t>
-      </w:r>
-    </w:p>
-    <w:p>
-      <w:pPr>
-        <w:pBdr>
-          <w:left w:val="single" w:sz="4" w:space="4" w:color="C0C0C0"/>
-          <w:right w:val="single" w:sz="4" w:space="4" w:color="C0C0C0"/>
-        </w:pBdr>
-        <w:shd w:val="clear" w:color="auto" w:fill="F5F5F5"/>
-        <w:spacing w:after="0" w:line="276" w:lineRule="auto"/>
-        <w:ind w:left="283" w:right="283"/>
-      </w:pPr>
-      <w:r>
-        <w:rPr>
-          <w:rFonts w:ascii="Consolas" w:hAnsi="Consolas"/>
-          <w:sz w:val="17"/>
-        </w:rPr>
-        <w:t xml:space="preserve">        return detections</w:t>
-      </w:r>
-    </w:p>
-    <w:p>
-      <w:pPr>
-        <w:pBdr>
-          <w:left w:val="single" w:sz="4" w:space="4" w:color="C0C0C0"/>
-          <w:right w:val="single" w:sz="4" w:space="4" w:color="C0C0C0"/>
-        </w:pBdr>
-        <w:shd w:val="clear" w:color="auto" w:fill="F5F5F5"/>
-        <w:spacing w:after="0" w:line="276" w:lineRule="auto"/>
-        <w:ind w:left="283" w:right="283"/>
-      </w:pPr>
-    </w:p>
-    <w:p>
-      <w:pPr>
-        <w:pBdr>
-          <w:left w:val="single" w:sz="4" w:space="4" w:color="C0C0C0"/>
-          <w:right w:val="single" w:sz="4" w:space="4" w:color="C0C0C0"/>
-        </w:pBdr>
-        <w:shd w:val="clear" w:color="auto" w:fill="F5F5F5"/>
-        <w:spacing w:after="0" w:line="276" w:lineRule="auto"/>
-        <w:ind w:left="283" w:right="283"/>
-      </w:pPr>
-      <w:r>
-        <w:rPr>
-          <w:rFonts w:ascii="Consolas" w:hAnsi="Consolas"/>
-          <w:sz w:val="17"/>
-        </w:rPr>
-        <w:t>if __name__ == "__main__":</w:t>
-      </w:r>
-    </w:p>
-    <w:p>
-      <w:pPr>
-        <w:pBdr>
-          <w:left w:val="single" w:sz="4" w:space="4" w:color="C0C0C0"/>
-          <w:right w:val="single" w:sz="4" w:space="4" w:color="C0C0C0"/>
-        </w:pBdr>
-        <w:shd w:val="clear" w:color="auto" w:fill="F5F5F5"/>
-        <w:spacing w:after="0" w:line="276" w:lineRule="auto"/>
-        <w:ind w:left="283" w:right="283"/>
-      </w:pPr>
-      <w:r>
-        <w:rPr>
-          <w:rFonts w:ascii="Consolas" w:hAnsi="Consolas"/>
-          <w:sz w:val="17"/>
-        </w:rPr>
-        <w:t xml:space="preserve">    detector = YOLODetector()</w:t>
-      </w:r>
-    </w:p>
-    <w:p>
-      <w:pPr>
-        <w:pBdr>
-          <w:left w:val="single" w:sz="4" w:space="4" w:color="C0C0C0"/>
-          <w:right w:val="single" w:sz="4" w:space="4" w:color="C0C0C0"/>
-        </w:pBdr>
-        <w:shd w:val="clear" w:color="auto" w:fill="F5F5F5"/>
-        <w:spacing w:after="0" w:line="276" w:lineRule="auto"/>
-        <w:ind w:left="283" w:right="283"/>
-      </w:pPr>
-      <w:r>
-        <w:rPr>
-          <w:rFonts w:ascii="Consolas" w:hAnsi="Consolas"/>
-          <w:sz w:val="17"/>
-        </w:rPr>
-        <w:t xml:space="preserve">    rospy.spin()</w:t>
-      </w:r>
-    </w:p>
-    <w:p>
-      <w:pPr>
-        <w:pBdr>
-          <w:left w:val="single" w:sz="4" w:space="4" w:color="C0C0C0"/>
-          <w:bottom w:val="single" w:sz="4" w:space="4" w:color="C0C0C0"/>
-          <w:right w:val="single" w:sz="4" w:space="4" w:color="C0C0C0"/>
-        </w:pBdr>
-        <w:shd w:val="clear" w:color="auto" w:fill="F5F5F5"/>
-        <w:spacing w:after="0" w:line="276" w:lineRule="auto"/>
-        <w:ind w:left="283" w:right="283"/>
-      </w:pPr>
-    </w:p>
-    <w:p>
-      <w:pPr>
         <w:pStyle w:val="31"/>
         <w:spacing w:before="160" w:after="120" w:line="300" w:lineRule="auto"/>
         <w:jc w:val="left"/>
@@ -39034,274 +39618,6 @@
     </w:p>
     <w:p>
       <w:pPr>
-        <w:pBdr>
-          <w:left w:val="single" w:sz="4" w:space="4" w:color="C0C0C0"/>
-          <w:right w:val="single" w:sz="4" w:space="4" w:color="C0C0C0"/>
-        </w:pBdr>
-        <w:shd w:val="clear" w:color="auto" w:fill="F5F5F5"/>
-        <w:spacing w:after="0" w:line="276" w:lineRule="auto"/>
-        <w:ind w:left="283" w:right="283"/>
-      </w:pPr>
-      <w:r>
-        <w:rPr>
-          <w:rFonts w:ascii="Consolas" w:hAnsi="Consolas"/>
-          <w:sz w:val="17"/>
-        </w:rPr>
-        <w:t xml:space="preserve">        self.move_to(place_xy[0], place_xy[1], 0.15, place_yaw)</w:t>
-      </w:r>
-    </w:p>
-    <w:p>
-      <w:pPr>
-        <w:pBdr>
-          <w:left w:val="single" w:sz="4" w:space="4" w:color="C0C0C0"/>
-          <w:right w:val="single" w:sz="4" w:space="4" w:color="C0C0C0"/>
-        </w:pBdr>
-        <w:shd w:val="clear" w:color="auto" w:fill="F5F5F5"/>
-        <w:spacing w:after="0" w:line="276" w:lineRule="auto"/>
-        <w:ind w:left="283" w:right="283"/>
-      </w:pPr>
-    </w:p>
-    <w:p>
-      <w:pPr>
-        <w:pBdr>
-          <w:left w:val="single" w:sz="4" w:space="4" w:color="C0C0C0"/>
-          <w:right w:val="single" w:sz="4" w:space="4" w:color="C0C0C0"/>
-        </w:pBdr>
-        <w:shd w:val="clear" w:color="auto" w:fill="F5F5F5"/>
-        <w:spacing w:after="0" w:line="276" w:lineRule="auto"/>
-        <w:ind w:left="283" w:right="283"/>
-      </w:pPr>
-      <w:r>
-        <w:rPr>
-          <w:rFonts w:ascii="Consolas" w:hAnsi="Consolas"/>
-          <w:sz w:val="17"/>
-        </w:rPr>
-        <w:t xml:space="preserve">    def suck(self):</w:t>
-      </w:r>
-    </w:p>
-    <w:p>
-      <w:pPr>
-        <w:pBdr>
-          <w:left w:val="single" w:sz="4" w:space="4" w:color="C0C0C0"/>
-          <w:right w:val="single" w:sz="4" w:space="4" w:color="C0C0C0"/>
-        </w:pBdr>
-        <w:shd w:val="clear" w:color="auto" w:fill="F5F5F5"/>
-        <w:spacing w:after="0" w:line="276" w:lineRule="auto"/>
-        <w:ind w:left="283" w:right="283"/>
-      </w:pPr>
-      <w:r>
-        <w:rPr>
-          <w:rFonts w:ascii="Consolas" w:hAnsi="Consolas"/>
-          <w:sz w:val="17"/>
-        </w:rPr>
-        <w:t xml:space="preserve">        import serial</w:t>
-      </w:r>
-    </w:p>
-    <w:p>
-      <w:pPr>
-        <w:pBdr>
-          <w:left w:val="single" w:sz="4" w:space="4" w:color="C0C0C0"/>
-          <w:right w:val="single" w:sz="4" w:space="4" w:color="C0C0C0"/>
-        </w:pBdr>
-        <w:shd w:val="clear" w:color="auto" w:fill="F5F5F5"/>
-        <w:spacing w:after="0" w:line="276" w:lineRule="auto"/>
-        <w:ind w:left="283" w:right="283"/>
-      </w:pPr>
-      <w:r>
-        <w:rPr>
-          <w:rFonts w:ascii="Consolas" w:hAnsi="Consolas"/>
-          <w:sz w:val="17"/>
-        </w:rPr>
-        <w:t xml:space="preserve">        ser = serial.Serial("/dev/ttyUSB0", 9600, timeout=1)</w:t>
-      </w:r>
-    </w:p>
-    <w:p>
-      <w:pPr>
-        <w:pBdr>
-          <w:left w:val="single" w:sz="4" w:space="4" w:color="C0C0C0"/>
-          <w:right w:val="single" w:sz="4" w:space="4" w:color="C0C0C0"/>
-        </w:pBdr>
-        <w:shd w:val="clear" w:color="auto" w:fill="F5F5F5"/>
-        <w:spacing w:after="0" w:line="276" w:lineRule="auto"/>
-        <w:ind w:left="283" w:right="283"/>
-      </w:pPr>
-      <w:r>
-        <w:rPr>
-          <w:rFonts w:ascii="Consolas" w:hAnsi="Consolas"/>
-          <w:sz w:val="17"/>
-        </w:rPr>
-        <w:t xml:space="preserve">        ser.write(b"\x01")</w:t>
-      </w:r>
-    </w:p>
-    <w:p>
-      <w:pPr>
-        <w:pBdr>
-          <w:left w:val="single" w:sz="4" w:space="4" w:color="C0C0C0"/>
-          <w:right w:val="single" w:sz="4" w:space="4" w:color="C0C0C0"/>
-        </w:pBdr>
-        <w:shd w:val="clear" w:color="auto" w:fill="F5F5F5"/>
-        <w:spacing w:after="0" w:line="276" w:lineRule="auto"/>
-        <w:ind w:left="283" w:right="283"/>
-      </w:pPr>
-      <w:r>
-        <w:rPr>
-          <w:rFonts w:ascii="Consolas" w:hAnsi="Consolas"/>
-          <w:sz w:val="17"/>
-        </w:rPr>
-        <w:t xml:space="preserve">        rospy.sleep(1.6)</w:t>
-      </w:r>
-    </w:p>
-    <w:p>
-      <w:pPr>
-        <w:pBdr>
-          <w:left w:val="single" w:sz="4" w:space="4" w:color="C0C0C0"/>
-          <w:right w:val="single" w:sz="4" w:space="4" w:color="C0C0C0"/>
-        </w:pBdr>
-        <w:shd w:val="clear" w:color="auto" w:fill="F5F5F5"/>
-        <w:spacing w:after="0" w:line="276" w:lineRule="auto"/>
-        <w:ind w:left="283" w:right="283"/>
-      </w:pPr>
-      <w:r>
-        <w:rPr>
-          <w:rFonts w:ascii="Consolas" w:hAnsi="Consolas"/>
-          <w:sz w:val="17"/>
-        </w:rPr>
-        <w:t xml:space="preserve">        ser.close()</w:t>
-      </w:r>
-    </w:p>
-    <w:p>
-      <w:pPr>
-        <w:pBdr>
-          <w:left w:val="single" w:sz="4" w:space="4" w:color="C0C0C0"/>
-          <w:right w:val="single" w:sz="4" w:space="4" w:color="C0C0C0"/>
-        </w:pBdr>
-        <w:shd w:val="clear" w:color="auto" w:fill="F5F5F5"/>
-        <w:spacing w:after="0" w:line="276" w:lineRule="auto"/>
-        <w:ind w:left="283" w:right="283"/>
-      </w:pPr>
-    </w:p>
-    <w:p>
-      <w:pPr>
-        <w:pBdr>
-          <w:left w:val="single" w:sz="4" w:space="4" w:color="C0C0C0"/>
-          <w:right w:val="single" w:sz="4" w:space="4" w:color="C0C0C0"/>
-        </w:pBdr>
-        <w:shd w:val="clear" w:color="auto" w:fill="F5F5F5"/>
-        <w:spacing w:after="0" w:line="276" w:lineRule="auto"/>
-        <w:ind w:left="283" w:right="283"/>
-      </w:pPr>
-      <w:r>
-        <w:rPr>
-          <w:rFonts w:ascii="Consolas" w:hAnsi="Consolas"/>
-          <w:sz w:val="17"/>
-        </w:rPr>
-        <w:t xml:space="preserve">    def place(self):</w:t>
-      </w:r>
-    </w:p>
-    <w:p>
-      <w:pPr>
-        <w:pBdr>
-          <w:left w:val="single" w:sz="4" w:space="4" w:color="C0C0C0"/>
-          <w:right w:val="single" w:sz="4" w:space="4" w:color="C0C0C0"/>
-        </w:pBdr>
-        <w:shd w:val="clear" w:color="auto" w:fill="F5F5F5"/>
-        <w:spacing w:after="0" w:line="276" w:lineRule="auto"/>
-        <w:ind w:left="283" w:right="283"/>
-      </w:pPr>
-      <w:r>
-        <w:rPr>
-          <w:rFonts w:ascii="Consolas" w:hAnsi="Consolas"/>
-          <w:sz w:val="17"/>
-        </w:rPr>
-        <w:t xml:space="preserve">        import serial</w:t>
-      </w:r>
-    </w:p>
-    <w:p>
-      <w:pPr>
-        <w:pBdr>
-          <w:left w:val="single" w:sz="4" w:space="4" w:color="C0C0C0"/>
-          <w:right w:val="single" w:sz="4" w:space="4" w:color="C0C0C0"/>
-        </w:pBdr>
-        <w:shd w:val="clear" w:color="auto" w:fill="F5F5F5"/>
-        <w:spacing w:after="0" w:line="276" w:lineRule="auto"/>
-        <w:ind w:left="283" w:right="283"/>
-      </w:pPr>
-      <w:r>
-        <w:rPr>
-          <w:rFonts w:ascii="Consolas" w:hAnsi="Consolas"/>
-          <w:sz w:val="17"/>
-        </w:rPr>
-        <w:t xml:space="preserve">        ser = serial.Serial("/dev/ttyUSB0", 9600, timeout=1)</w:t>
-      </w:r>
-    </w:p>
-    <w:p>
-      <w:pPr>
-        <w:pBdr>
-          <w:left w:val="single" w:sz="4" w:space="4" w:color="C0C0C0"/>
-          <w:right w:val="single" w:sz="4" w:space="4" w:color="C0C0C0"/>
-        </w:pBdr>
-        <w:shd w:val="clear" w:color="auto" w:fill="F5F5F5"/>
-        <w:spacing w:after="0" w:line="276" w:lineRule="auto"/>
-        <w:ind w:left="283" w:right="283"/>
-      </w:pPr>
-      <w:r>
-        <w:rPr>
-          <w:rFonts w:ascii="Consolas" w:hAnsi="Consolas"/>
-          <w:sz w:val="17"/>
-        </w:rPr>
-        <w:t xml:space="preserve">        ser.write(b"\x00")</w:t>
-      </w:r>
-    </w:p>
-    <w:p>
-      <w:pPr>
-        <w:pBdr>
-          <w:left w:val="single" w:sz="4" w:space="4" w:color="C0C0C0"/>
-          <w:right w:val="single" w:sz="4" w:space="4" w:color="C0C0C0"/>
-        </w:pBdr>
-        <w:shd w:val="clear" w:color="auto" w:fill="F5F5F5"/>
-        <w:spacing w:after="0" w:line="276" w:lineRule="auto"/>
-        <w:ind w:left="283" w:right="283"/>
-      </w:pPr>
-      <w:r>
-        <w:rPr>
-          <w:rFonts w:ascii="Consolas" w:hAnsi="Consolas"/>
-          <w:sz w:val="17"/>
-        </w:rPr>
-        <w:t xml:space="preserve">        rospy.sleep(1.6)</w:t>
-      </w:r>
-    </w:p>
-    <w:p>
-      <w:pPr>
-        <w:pBdr>
-          <w:left w:val="single" w:sz="4" w:space="4" w:color="C0C0C0"/>
-          <w:right w:val="single" w:sz="4" w:space="4" w:color="C0C0C0"/>
-        </w:pBdr>
-        <w:shd w:val="clear" w:color="auto" w:fill="F5F5F5"/>
-        <w:spacing w:after="0" w:line="276" w:lineRule="auto"/>
-        <w:ind w:left="283" w:right="283"/>
-      </w:pPr>
-      <w:r>
-        <w:rPr>
-          <w:rFonts w:ascii="Consolas" w:hAnsi="Consolas"/>
-          <w:sz w:val="17"/>
-        </w:rPr>
-        <w:t xml:space="preserve">        ser.close()</w:t>
-      </w:r>
-    </w:p>
-    <w:p>
-      <w:pPr>
-        <w:pBdr>
-          <w:left w:val="single" w:sz="4" w:space="4" w:color="C0C0C0"/>
-          <w:bottom w:val="single" w:sz="4" w:space="4" w:color="C0C0C0"/>
-          <w:right w:val="single" w:sz="4" w:space="4" w:color="C0C0C0"/>
-        </w:pBdr>
-        <w:shd w:val="clear" w:color="auto" w:fill="F5F5F5"/>
-        <w:spacing w:after="0" w:line="276" w:lineRule="auto"/>
-        <w:ind w:left="283" w:right="283"/>
-      </w:pPr>
-    </w:p>
-    <w:p>
-      <w:pPr>
         <w:pStyle w:val="31"/>
         <w:spacing w:before="160" w:after="120" w:line="300" w:lineRule="auto"/>
         <w:jc w:val="left"/>
@@ -40369,54 +40685,6 @@
         </w:rPr>
         <w:t xml:space="preserve">        best = max(range(len(top_k)),</w:t>
       </w:r>
-    </w:p>
-    <w:p>
-      <w:pPr>
-        <w:pBdr>
-          <w:left w:val="single" w:sz="4" w:space="4" w:color="C0C0C0"/>
-          <w:right w:val="single" w:sz="4" w:space="4" w:color="C0C0C0"/>
-        </w:pBdr>
-        <w:shd w:val="clear" w:color="auto" w:fill="F5F5F5"/>
-        <w:spacing w:after="0" w:line="276" w:lineRule="auto"/>
-        <w:ind w:left="283" w:right="283"/>
-      </w:pPr>
-      <w:r>
-        <w:rPr>
-          <w:rFonts w:ascii="Consolas" w:hAnsi="Consolas"/>
-          <w:sz w:val="17"/>
-        </w:rPr>
-        <w:t xml:space="preserve">                   key=lambda i: q_vals[i])</w:t>
-      </w:r>
-    </w:p>
-    <w:p>
-      <w:pPr>
-        <w:pBdr>
-          <w:left w:val="single" w:sz="4" w:space="4" w:color="C0C0C0"/>
-          <w:right w:val="single" w:sz="4" w:space="4" w:color="C0C0C0"/>
-        </w:pBdr>
-        <w:shd w:val="clear" w:color="auto" w:fill="F5F5F5"/>
-        <w:spacing w:after="0" w:line="276" w:lineRule="auto"/>
-        <w:ind w:left="283" w:right="283"/>
-      </w:pPr>
-      <w:r>
-        <w:rPr>
-          <w:rFonts w:ascii="Consolas" w:hAnsi="Consolas"/>
-          <w:sz w:val="17"/>
-        </w:rPr>
-        <w:t xml:space="preserve">        return top_k[best][0]</w:t>
-      </w:r>
-    </w:p>
-    <w:p>
-      <w:pPr>
-        <w:pBdr>
-          <w:left w:val="single" w:sz="4" w:space="4" w:color="C0C0C0"/>
-          <w:bottom w:val="single" w:sz="4" w:space="4" w:color="C0C0C0"/>
-          <w:right w:val="single" w:sz="4" w:space="4" w:color="C0C0C0"/>
-        </w:pBdr>
-        <w:shd w:val="clear" w:color="auto" w:fill="F5F5F5"/>
-        <w:spacing w:after="0" w:line="276" w:lineRule="auto"/>
-        <w:ind w:left="283" w:right="283"/>
-      </w:pPr>
     </w:p>
     <w:p>
       <w:pPr>
@@ -42222,7 +42490,7 @@
                     <pic:cNvPicPr/>
                   </pic:nvPicPr>
                   <pic:blipFill>
-                    <a:blip r:embed="rId9"/>
+                    <a:blip r:embed="rId20"/>
                     <a:stretch>
                       <a:fillRect/>
                     </a:stretch>
@@ -42294,7 +42562,7 @@
                     <pic:cNvPicPr/>
                   </pic:nvPicPr>
                   <pic:blipFill>
-                    <a:blip r:embed="rId10"/>
+                    <a:blip r:embed="rId21"/>
                     <a:stretch>
                       <a:fillRect/>
                     </a:stretch>
@@ -42392,7 +42660,7 @@
                     <pic:cNvPicPr/>
                   </pic:nvPicPr>
                   <pic:blipFill>
-                    <a:blip r:embed="rId8"/>
+                    <a:blip r:embed="rId12"/>
                     <a:stretch>
                       <a:fillRect/>
                     </a:stretch>

</xml_diff>

<commit_message>
Replace diagrams with LaTeX TikZ renderings, fix layout
- Replace all 7 matplotlib diagrams with TikZ/LaTeX academic-quality renderings
- Fix blank page issue by cleaning empty paragraphs around headings
- Single-pass image insertion ensures correct indices
- Add tikz_diagrams.tex source and compiled PDF
- Add rebuild_document.py for complete docx rebuild workflow
- Gitignore *.aux and *.log LaTeX auxiliary files
- Update PDF export

Co-Authored-By: Claude Opus 4.7 <noreply@anthropic.com>
</commit_message>
<xml_diff>
--- a/创意赛技术文档.docx
+++ b/创意赛技术文档.docx
@@ -4,14 +4,8 @@
   <w:body>
     <w:p/>
     <w:p/>
-    <w:p>
-      <w:pPr>
-        <w:rPr>
-          <w:rFonts w:hint="eastAsia"/>
-          <w:lang w:eastAsia="zh-CN"/>
-        </w:rPr>
-      </w:pPr>
-    </w:p>
+    <w:p/>
+    <w:p/>
     <w:p/>
     <w:p/>
     <w:p>
@@ -40,59 +34,14 @@
     </w:p>
     <w:p>
       <w:pPr>
-        <w:jc w:val="center"/>
-        <w:rPr>
-          <w:rFonts w:ascii="黑体" w:eastAsia="黑体" w:hAnsi="黑体"/>
-          <w:sz w:val="36"/>
-          <w:lang w:eastAsia="zh-CN"/>
-        </w:rPr>
-      </w:pPr>
-      <w:r>
-        <w:rPr>
-          <w:rFonts w:ascii="黑体" w:eastAsia="黑体" w:hAnsi="黑体"/>
-          <w:sz w:val="36"/>
-          <w:lang w:eastAsia="zh-CN"/>
-        </w:rPr>
-        <w:t>专项赛</w:t>
-      </w:r>
-      <w:proofErr w:type="gramStart"/>
-      <w:r>
-        <w:rPr>
-          <w:rFonts w:ascii="黑体" w:eastAsia="黑体" w:hAnsi="黑体"/>
-          <w:sz w:val="36"/>
-          <w:lang w:eastAsia="zh-CN"/>
-        </w:rPr>
-        <w:t>一</w:t>
-      </w:r>
-      <w:proofErr w:type="gramEnd"/>
-      <w:r>
-        <w:rPr>
-          <w:rFonts w:ascii="黑体" w:eastAsia="黑体" w:hAnsi="黑体"/>
-          <w:sz w:val="36"/>
-          <w:lang w:eastAsia="zh-CN"/>
-        </w:rPr>
-        <w:t xml:space="preserve">  基于ROS的单臂机器人</w:t>
-      </w:r>
-      <w:r>
-        <w:rPr>
-          <w:rFonts w:ascii="黑体" w:eastAsia="黑体" w:hAnsi="黑体"/>
-          <w:sz w:val="36"/>
-          <w:lang w:eastAsia="zh-CN"/>
-        </w:rPr>
-        <w:br/>
-        <w:t>——俄罗斯方块自动化拼接系统</w:t>
-      </w:r>
-    </w:p>
-    <w:p>
-      <w:pPr>
-        <w:spacing w:before="120" w:after="120"/>
+        <w:spacing w:before="160" w:after="160"/>
         <w:jc w:val="center"/>
       </w:pPr>
       <w:r>
         <w:drawing>
           <wp:inline xmlns:a="http://schemas.openxmlformats.org/drawingml/2006/main" xmlns:pic="http://schemas.openxmlformats.org/drawingml/2006/picture">
             <wp:extent cx="1188720" cy="1188058"/>
-            <wp:docPr id="18" name="Picture 18"/>
+            <wp:docPr id="7" name="Picture 7"/>
             <wp:cNvGraphicFramePr>
               <a:graphicFrameLocks noChangeAspect="1"/>
             </wp:cNvGraphicFramePr>
@@ -104,7 +53,7 @@
                     <pic:cNvPicPr/>
                   </pic:nvPicPr>
                   <pic:blipFill>
-                    <a:blip r:embed="rId24"/>
+                    <a:blip r:embed="rId13"/>
                     <a:stretch>
                       <a:fillRect/>
                     </a:stretch>
@@ -127,17 +76,48 @@
       <w:pPr>
         <w:jc w:val="center"/>
         <w:rPr>
+          <w:lang w:eastAsia="zh-CN"/>
+        </w:rPr>
+      </w:pPr>
+      <w:r>
+        <w:rPr>
           <w:rFonts w:ascii="黑体" w:eastAsia="黑体" w:hAnsi="黑体"/>
           <w:sz w:val="36"/>
           <w:lang w:eastAsia="zh-CN"/>
         </w:rPr>
-      </w:pPr>
+        <w:t>专项赛</w:t>
+      </w:r>
+      <w:proofErr w:type="gramStart"/>
+      <w:r>
+        <w:rPr>
+          <w:rFonts w:ascii="黑体" w:eastAsia="黑体" w:hAnsi="黑体"/>
+          <w:sz w:val="36"/>
+          <w:lang w:eastAsia="zh-CN"/>
+        </w:rPr>
+        <w:t>一</w:t>
+      </w:r>
+      <w:proofErr w:type="gramEnd"/>
+      <w:r>
+        <w:rPr>
+          <w:rFonts w:ascii="黑体" w:eastAsia="黑体" w:hAnsi="黑体"/>
+          <w:sz w:val="36"/>
+          <w:lang w:eastAsia="zh-CN"/>
+        </w:rPr>
+        <w:t xml:space="preserve">  基于ROS的单臂机器人</w:t>
+      </w:r>
+      <w:r>
+        <w:rPr>
+          <w:rFonts w:ascii="黑体" w:eastAsia="黑体" w:hAnsi="黑体"/>
+          <w:sz w:val="36"/>
+          <w:lang w:eastAsia="zh-CN"/>
+        </w:rPr>
+        <w:br/>
+        <w:t>——俄罗斯方块自动化拼接系统</w:t>
+      </w:r>
     </w:p>
     <w:p>
       <w:pPr>
-        <w:jc w:val="center"/>
-        <w:rPr>
-          <w:rFonts w:hint="eastAsia"/>
+        <w:rPr>
           <w:lang w:eastAsia="zh-CN"/>
         </w:rPr>
       </w:pPr>
@@ -165,10 +145,19 @@
     </w:p>
     <w:p>
       <w:pPr>
-        <w:rPr>
-          <w:lang w:eastAsia="zh-CN"/>
-        </w:rPr>
-      </w:pPr>
+        <w:jc w:val="center"/>
+        <w:rPr>
+          <w:lang w:eastAsia="zh-CN"/>
+        </w:rPr>
+      </w:pPr>
+      <w:r>
+        <w:rPr>
+          <w:rFonts w:ascii="宋体" w:hAnsi="宋体"/>
+          <w:sz w:val="28"/>
+          <w:lang w:eastAsia="zh-CN"/>
+        </w:rPr>
+        <w:t>项目团队：武汉大学  雷霆大雪绒</w:t>
+      </w:r>
     </w:p>
     <w:p>
       <w:pPr>
@@ -183,7 +172,7 @@
           <w:sz w:val="28"/>
           <w:lang w:eastAsia="zh-CN"/>
         </w:rPr>
-        <w:t>项目团队：武汉大学  雷霆大雪绒</w:t>
+        <w:t>提交日期：2026年5月10日</w:t>
       </w:r>
     </w:p>
     <w:p>
@@ -199,83 +188,57 @@
           <w:sz w:val="28"/>
           <w:lang w:eastAsia="zh-CN"/>
         </w:rPr>
-        <w:t>提交日期：2026年5月10日</w:t>
+        <w:t>版本号：</w:t>
+      </w:r>
+      <w:r>
+        <w:rPr>
+          <w:rFonts w:ascii="宋体" w:hAnsi="宋体" w:hint="eastAsia"/>
+          <w:sz w:val="28"/>
+          <w:lang w:eastAsia="zh-CN"/>
+        </w:rPr>
+        <w:t>v</w:t>
+      </w:r>
+      <w:r>
+        <w:rPr>
+          <w:rFonts w:ascii="宋体" w:hAnsi="宋体"/>
+          <w:sz w:val="28"/>
+          <w:lang w:eastAsia="zh-CN"/>
+        </w:rPr>
+        <w:t>4.0</w:t>
       </w:r>
     </w:p>
     <w:p>
       <w:pPr>
-        <w:jc w:val="center"/>
-        <w:rPr>
-          <w:rFonts w:ascii="宋体" w:hAnsi="宋体"/>
-          <w:sz w:val="28"/>
-          <w:lang w:eastAsia="zh-CN"/>
-        </w:rPr>
-      </w:pPr>
-      <w:r>
-        <w:rPr>
-          <w:rFonts w:ascii="宋体" w:hAnsi="宋体"/>
-          <w:sz w:val="28"/>
-          <w:lang w:eastAsia="zh-CN"/>
-        </w:rPr>
-        <w:t>版本号：</w:t>
-      </w:r>
-      <w:r>
-        <w:rPr>
-          <w:rFonts w:ascii="宋体" w:hAnsi="宋体" w:hint="eastAsia"/>
-          <w:sz w:val="28"/>
-          <w:lang w:eastAsia="zh-CN"/>
-        </w:rPr>
-        <w:t>v</w:t>
-      </w:r>
-      <w:r>
-        <w:rPr>
-          <w:rFonts w:ascii="宋体" w:hAnsi="宋体"/>
-          <w:sz w:val="28"/>
-          <w:lang w:eastAsia="zh-CN"/>
-        </w:rPr>
-        <w:t>4.0</w:t>
-      </w:r>
-    </w:p>
-    <w:p>
-      <w:pPr>
-        <w:jc w:val="center"/>
-        <w:rPr>
-          <w:rFonts w:ascii="宋体" w:hAnsi="宋体"/>
-          <w:sz w:val="28"/>
-          <w:lang w:eastAsia="zh-CN"/>
-        </w:rPr>
-      </w:pPr>
-    </w:p>
-    <w:p>
-      <w:pPr>
-        <w:rPr>
-          <w:rFonts w:hint="eastAsia"/>
-          <w:lang w:eastAsia="zh-CN"/>
-        </w:rPr>
-      </w:pPr>
+        <w:rPr>
+          <w:lang w:eastAsia="zh-CN"/>
+        </w:rPr>
+      </w:pPr>
+      <w:r>
+        <w:rPr>
+          <w:lang w:eastAsia="zh-CN"/>
+        </w:rPr>
+      </w:r>
     </w:p>
     <w:p>
       <w:pPr>
         <w:pStyle w:val="1"/>
         <w:spacing w:before="360" w:after="240" w:line="300" w:lineRule="auto"/>
         <w:jc w:val="left"/>
-        <w:rPr>
-          <w:lang w:eastAsia="zh-CN"/>
-        </w:rPr>
         <w:br w:type="page"/>
       </w:pPr>
       <w:bookmarkStart w:id="0" w:name="_Toc229276436"/>
+      <w:proofErr w:type="spellStart"/>
       <w:r>
         <w:rPr>
           <w:rFonts w:ascii="Times New Roman" w:eastAsia="宋体" w:hAnsi="Times New Roman"/>
           <w:color w:val="000000"/>
           <w:sz w:val="32"/>
-          <w:lang w:eastAsia="zh-CN"/>
         </w:rPr>
         <w:lastRenderedPageBreak/>
         <w:t>目录</w:t>
       </w:r>
       <w:bookmarkEnd w:id="0"/>
+      <w:proofErr w:type="spellEnd"/>
     </w:p>
     <w:p>
       <w:pPr>
@@ -7009,14 +6972,11 @@
           <w:lang w:eastAsia="zh-CN"/>
         </w:rPr>
       </w:pPr>
-    </w:p>
-    <w:p>
-      <w:pPr>
-        <w:rPr>
-          <w:rFonts w:hint="eastAsia"/>
-          <w:lang w:eastAsia="zh-CN"/>
-        </w:rPr>
-      </w:pPr>
+      <w:r>
+        <w:rPr>
+          <w:lang w:eastAsia="zh-CN"/>
+        </w:rPr>
+      </w:r>
     </w:p>
     <w:p>
       <w:pPr>
@@ -7811,56 +7771,26 @@
     </w:p>
     <w:p>
       <w:pPr>
-        <w:jc w:val="center"/>
-        <w:rPr>
-          <w:lang w:eastAsia="zh-CN"/>
-        </w:rPr>
-      </w:pPr>
-      <w:r>
-        <w:rPr>
-          <w:rFonts w:ascii="黑体" w:eastAsia="黑体" w:hAnsi="黑体"/>
-          <w:b/>
-          <w:sz w:val="20"/>
-          <w:lang w:eastAsia="zh-CN"/>
-        </w:rPr>
-        <w:t xml:space="preserve">图1-1  </w:t>
-      </w:r>
-      <w:r>
-        <w:rPr>
-          <w:rFonts w:ascii="宋体" w:hAnsi="宋体"/>
-          <w:sz w:val="20"/>
-          <w:lang w:eastAsia="zh-CN"/>
-        </w:rPr>
-        <w:t>系统运行流程图</w:t>
-      </w:r>
-    </w:p>
-    <w:p>
-      <w:pPr>
         <w:spacing w:before="160" w:after="40"/>
         <w:jc w:val="center"/>
       </w:pPr>
       <w:r>
-        <w:rPr>
-          <w:noProof/>
-        </w:rPr>
-        <w:lastRenderedPageBreak/>
         <w:drawing>
-          <wp:inline distT="0" distB="0" distL="0" distR="0" wp14:anchorId="27E8AB72" wp14:editId="2405F156">
-            <wp:extent cx="5303520" cy="3586710"/>
-            <wp:effectExtent l="0" t="0" r="0" b="0"/>
-            <wp:docPr id="17" name="Picture 17"/>
+          <wp:inline xmlns:a="http://schemas.openxmlformats.org/drawingml/2006/main" xmlns:pic="http://schemas.openxmlformats.org/drawingml/2006/picture">
+            <wp:extent cx="5303520" cy="5195241"/>
+            <wp:docPr id="18" name="Picture 18"/>
             <wp:cNvGraphicFramePr>
-              <a:graphicFrameLocks xmlns:a="http://schemas.openxmlformats.org/drawingml/2006/main" noChangeAspect="1"/>
+              <a:graphicFrameLocks noChangeAspect="1"/>
             </wp:cNvGraphicFramePr>
-            <a:graphic xmlns:a="http://schemas.openxmlformats.org/drawingml/2006/main">
+            <a:graphic>
               <a:graphicData uri="http://schemas.openxmlformats.org/drawingml/2006/picture">
-                <pic:pic xmlns:pic="http://schemas.openxmlformats.org/drawingml/2006/picture">
+                <pic:pic>
                   <pic:nvPicPr>
                     <pic:cNvPr id="0" name="fig1_system_architecture.png"/>
                     <pic:cNvPicPr/>
                   </pic:nvPicPr>
                   <pic:blipFill>
-                    <a:blip r:embed="rId7"/>
+                    <a:blip r:embed="rId24"/>
                     <a:stretch>
                       <a:fillRect/>
                     </a:stretch>
@@ -7868,11 +7798,9 @@
                   <pic:spPr>
                     <a:xfrm>
                       <a:off x="0" y="0"/>
-                      <a:ext cx="5303520" cy="3586710"/>
+                      <a:ext cx="5303520" cy="5195241"/>
                     </a:xfrm>
-                    <a:prstGeom prst="rect">
-                      <a:avLst/>
-                    </a:prstGeom>
+                    <a:prstGeom prst="rect"/>
                   </pic:spPr>
                 </pic:pic>
               </a:graphicData>
@@ -7885,76 +7813,50 @@
       <w:pPr>
         <w:spacing w:after="200"/>
         <w:jc w:val="center"/>
-        <w:rPr>
-          <w:lang w:eastAsia="zh-CN"/>
-        </w:rPr>
-      </w:pPr>
-      <w:r>
-        <w:rPr>
+      </w:pPr>
+      <w:r>
+        <w:rPr>
+          <w:rFonts w:ascii="Times New Roman" w:hAnsi="Times New Roman"/>
           <w:b/>
           <w:sz w:val="18"/>
-          <w:lang w:eastAsia="zh-CN"/>
-        </w:rPr>
-        <w:t>图</w:t>
-      </w:r>
-      <w:r>
-        <w:rPr>
+        </w:rPr>
+        <w:t xml:space="preserve">图1-2  </w:t>
+      </w:r>
+      <w:r>
+        <w:rPr>
+          <w:rFonts w:ascii="Times New Roman" w:hAnsi="Times New Roman"/>
+          <w:sz w:val="18"/>
+        </w:rPr>
+        <w:t>系统总体架构图（感知$</w:t>
+        <w:br/>
+        <w:t>ightarrow$决策$</w:t>
+        <w:br/>
+        <w:t>ightarrow$执行三层递阶控制）</w:t>
+      </w:r>
+    </w:p>
+    <w:p>
+      <w:pPr>
+        <w:jc w:val="center"/>
+        <w:rPr>
+          <w:lang w:eastAsia="zh-CN"/>
+        </w:rPr>
+      </w:pPr>
+      <w:r>
+        <w:rPr>
+          <w:rFonts w:ascii="黑体" w:eastAsia="黑体" w:hAnsi="黑体"/>
           <w:b/>
-          <w:sz w:val="18"/>
-          <w:lang w:eastAsia="zh-CN"/>
-        </w:rPr>
-        <w:t xml:space="preserve">1-2  </w:t>
-      </w:r>
-      <w:r>
-        <w:rPr>
-          <w:sz w:val="18"/>
-          <w:lang w:eastAsia="zh-CN"/>
-        </w:rPr>
-        <w:t>系统总体架构图（感知</w:t>
-      </w:r>
-      <w:r>
-        <w:rPr>
-          <w:sz w:val="18"/>
-          <w:lang w:eastAsia="zh-CN"/>
-        </w:rPr>
-        <w:t>→</w:t>
-      </w:r>
-      <w:r>
-        <w:rPr>
-          <w:sz w:val="18"/>
-          <w:lang w:eastAsia="zh-CN"/>
-        </w:rPr>
-        <w:t>决策</w:t>
-      </w:r>
-      <w:r>
-        <w:rPr>
-          <w:sz w:val="18"/>
-          <w:lang w:eastAsia="zh-CN"/>
-        </w:rPr>
-        <w:t>→</w:t>
-      </w:r>
-      <w:r>
-        <w:rPr>
-          <w:sz w:val="18"/>
-          <w:lang w:eastAsia="zh-CN"/>
-        </w:rPr>
-        <w:t>执行</w:t>
-      </w:r>
-      <w:proofErr w:type="gramStart"/>
-      <w:r>
-        <w:rPr>
-          <w:sz w:val="18"/>
-          <w:lang w:eastAsia="zh-CN"/>
-        </w:rPr>
-        <w:t>三层递阶架构</w:t>
-      </w:r>
-      <w:proofErr w:type="gramEnd"/>
-      <w:r>
-        <w:rPr>
-          <w:sz w:val="18"/>
-          <w:lang w:eastAsia="zh-CN"/>
-        </w:rPr>
-        <w:t>）</w:t>
+          <w:sz w:val="20"/>
+          <w:lang w:eastAsia="zh-CN"/>
+        </w:rPr>
+        <w:t xml:space="preserve">图1-1  </w:t>
+      </w:r>
+      <w:r>
+        <w:rPr>
+          <w:rFonts w:ascii="宋体" w:hAnsi="宋体"/>
+          <w:sz w:val="20"/>
+          <w:lang w:eastAsia="zh-CN"/>
+        </w:rPr>
+        <w:t>系统运行流程图</w:t>
       </w:r>
     </w:p>
     <w:p>
@@ -8156,6 +8058,7 @@
                 <w:rFonts w:ascii="宋体" w:hAnsi="宋体"/>
                 <w:sz w:val="20"/>
               </w:rPr>
+              <w:lastRenderedPageBreak/>
               <w:t>视觉识别</w:t>
             </w:r>
           </w:p>
@@ -8704,21 +8607,13 @@
       </w:tr>
     </w:tbl>
     <w:p>
-      <w:pPr>
-        <w:rPr>
-          <w:rFonts w:hint="eastAsia"/>
-          <w:lang w:eastAsia="zh-CN"/>
-        </w:rPr>
-      </w:pPr>
+      <w:r/>
     </w:p>
     <w:p>
       <w:pPr>
         <w:pStyle w:val="1"/>
         <w:spacing w:before="360" w:after="240" w:line="300" w:lineRule="auto"/>
         <w:jc w:val="left"/>
-        <w:rPr>
-          <w:lang w:eastAsia="zh-CN"/>
-        </w:rPr>
         <w:br w:type="page"/>
       </w:pPr>
       <w:bookmarkStart w:id="6" w:name="_Toc229276442"/>
@@ -8727,8 +8622,8 @@
           <w:rFonts w:ascii="Times New Roman" w:eastAsia="宋体" w:hAnsi="Times New Roman"/>
           <w:color w:val="000000"/>
           <w:sz w:val="32"/>
-          <w:lang w:eastAsia="zh-CN"/>
-        </w:rPr>
+        </w:rPr>
+        <w:lastRenderedPageBreak/>
         <w:t xml:space="preserve">2. </w:t>
       </w:r>
       <w:r>
@@ -8736,7 +8631,6 @@
           <w:rFonts w:ascii="Times New Roman" w:eastAsia="宋体" w:hAnsi="Times New Roman"/>
           <w:color w:val="000000"/>
           <w:sz w:val="32"/>
-          <w:lang w:eastAsia="zh-CN"/>
         </w:rPr>
         <w:t>硬件与软件平台</w:t>
       </w:r>
@@ -8747,9 +8641,6 @@
         <w:pStyle w:val="21"/>
         <w:spacing w:before="240" w:after="160" w:line="300" w:lineRule="auto"/>
         <w:jc w:val="left"/>
-        <w:rPr>
-          <w:lang w:eastAsia="zh-CN"/>
-        </w:rPr>
       </w:pPr>
       <w:bookmarkStart w:id="7" w:name="_Toc229276443"/>
       <w:r>
@@ -8757,7 +8648,6 @@
           <w:rFonts w:ascii="Times New Roman" w:eastAsia="宋体" w:hAnsi="Times New Roman"/>
           <w:color w:val="000000"/>
           <w:sz w:val="28"/>
-          <w:lang w:eastAsia="zh-CN"/>
         </w:rPr>
         <w:t xml:space="preserve">2.1 </w:t>
       </w:r>
@@ -8766,7 +8656,6 @@
           <w:rFonts w:ascii="Times New Roman" w:eastAsia="宋体" w:hAnsi="Times New Roman"/>
           <w:color w:val="000000"/>
           <w:sz w:val="28"/>
-          <w:lang w:eastAsia="zh-CN"/>
         </w:rPr>
         <w:t>硬件配置与选型论证</w:t>
       </w:r>
@@ -12177,47 +12066,32 @@
         <w:jc w:val="center"/>
       </w:pPr>
       <w:r>
-        <w:rPr>
-          <w:noProof/>
-        </w:rPr>
         <w:drawing>
-          <wp:inline distT="0" distB="0" distL="0" distR="0" wp14:anchorId="13082598" wp14:editId="02EC347A">
-            <wp:extent cx="5029009" cy="2394642"/>
-            <wp:effectExtent l="0" t="0" r="635" b="5715"/>
-            <wp:docPr id="16" name="Picture 16"/>
+          <wp:inline xmlns:a="http://schemas.openxmlformats.org/drawingml/2006/main" xmlns:pic="http://schemas.openxmlformats.org/drawingml/2006/picture">
+            <wp:extent cx="5029200" cy="2726724"/>
+            <wp:docPr id="17" name="Picture 17"/>
             <wp:cNvGraphicFramePr>
-              <a:graphicFrameLocks xmlns:a="http://schemas.openxmlformats.org/drawingml/2006/main" noChangeAspect="1"/>
+              <a:graphicFrameLocks noChangeAspect="1"/>
             </wp:cNvGraphicFramePr>
-            <a:graphic xmlns:a="http://schemas.openxmlformats.org/drawingml/2006/main">
+            <a:graphic>
               <a:graphicData uri="http://schemas.openxmlformats.org/drawingml/2006/picture">
-                <pic:pic xmlns:pic="http://schemas.openxmlformats.org/drawingml/2006/picture">
+                <pic:pic>
                   <pic:nvPicPr>
                     <pic:cNvPr id="0" name="fig2_ros_node_graph.png"/>
                     <pic:cNvPicPr/>
                   </pic:nvPicPr>
-                  <pic:blipFill rotWithShape="1">
-                    <a:blip r:embed="rId8"/>
-                    <a:srcRect b="31298"/>
+                  <pic:blipFill>
+                    <a:blip r:embed="rId23"/>
                     <a:stretch>
                       <a:fillRect/>
                     </a:stretch>
                   </pic:blipFill>
-                  <pic:spPr bwMode="auto">
+                  <pic:spPr>
                     <a:xfrm>
                       <a:off x="0" y="0"/>
-                      <a:ext cx="5029200" cy="2394733"/>
+                      <a:ext cx="5029200" cy="2726724"/>
                     </a:xfrm>
-                    <a:prstGeom prst="rect">
-                      <a:avLst/>
-                    </a:prstGeom>
-                    <a:ln>
-                      <a:noFill/>
-                    </a:ln>
-                    <a:extLst>
-                      <a:ext uri="{53640926-AAD7-44D8-BBD7-CCE9431645EC}">
-                        <a14:shadowObscured xmlns:a14="http://schemas.microsoft.com/office/drawing/2010/main"/>
-                      </a:ext>
-                    </a:extLst>
+                    <a:prstGeom prst="rect"/>
                   </pic:spPr>
                 </pic:pic>
               </a:graphicData>
@@ -12230,53 +12104,21 @@
       <w:pPr>
         <w:spacing w:after="200"/>
         <w:jc w:val="center"/>
-        <w:rPr>
-          <w:lang w:eastAsia="zh-CN"/>
-        </w:rPr>
-      </w:pPr>
-      <w:r>
-        <w:rPr>
+      </w:pPr>
+      <w:r>
+        <w:rPr>
+          <w:rFonts w:ascii="Times New Roman" w:hAnsi="Times New Roman"/>
           <w:b/>
           <w:sz w:val="18"/>
-          <w:lang w:eastAsia="zh-CN"/>
-        </w:rPr>
-        <w:t>图</w:t>
-      </w:r>
-      <w:r>
-        <w:rPr>
-          <w:b/>
+        </w:rPr>
+        <w:t xml:space="preserve">图2-1  </w:t>
+      </w:r>
+      <w:r>
+        <w:rPr>
+          <w:rFonts w:ascii="Times New Roman" w:hAnsi="Times New Roman"/>
           <w:sz w:val="18"/>
-          <w:lang w:eastAsia="zh-CN"/>
-        </w:rPr>
-        <w:t xml:space="preserve">2-1  </w:t>
-      </w:r>
-      <w:r>
-        <w:rPr>
-          <w:sz w:val="18"/>
-          <w:lang w:eastAsia="zh-CN"/>
-        </w:rPr>
-        <w:t>ROS</w:t>
-      </w:r>
-      <w:r>
-        <w:rPr>
-          <w:sz w:val="18"/>
-          <w:lang w:eastAsia="zh-CN"/>
-        </w:rPr>
-        <w:t>节点通信架构图（核心节点与话题</w:t>
-      </w:r>
-      <w:r>
-        <w:rPr>
-          <w:sz w:val="18"/>
-          <w:lang w:eastAsia="zh-CN"/>
-        </w:rPr>
-        <w:t>/</w:t>
-      </w:r>
-      <w:r>
-        <w:rPr>
-          <w:sz w:val="18"/>
-          <w:lang w:eastAsia="zh-CN"/>
-        </w:rPr>
-        <w:t>服务关系）</w:t>
+        </w:rPr>
+        <w:t>ROS节点通信架构图（核心节点与话题/服务关系）</w:t>
       </w:r>
     </w:p>
     <w:p>
@@ -12513,7 +12355,6 @@
         </w:rPr>
       </w:pPr>
       <w:r>
-        <w:lastRenderedPageBreak/>
         <w:t xml:space="preserve">(3) </w:t>
       </w:r>
       <w:r>
@@ -12708,7 +12549,9 @@
         <w:t>分级过滤）。</w:t>
       </w:r>
     </w:p>
-    <w:p/>
+    <w:p>
+      <w:r/>
+    </w:p>
     <w:p>
       <w:pPr>
         <w:pStyle w:val="1"/>
@@ -12727,6 +12570,7 @@
           <w:sz w:val="32"/>
           <w:lang w:eastAsia="zh-CN"/>
         </w:rPr>
+        <w:lastRenderedPageBreak/>
         <w:t xml:space="preserve">3. </w:t>
       </w:r>
       <w:r>
@@ -13187,11 +13031,7 @@
         <w:t>模式编译（启用</w:t>
       </w:r>
       <w:r>
-        <w:t>-</w:t>
-      </w:r>
-      <w:r>
-        <w:lastRenderedPageBreak/>
-        <w:t>O3</w:t>
+        <w:t>-O3</w:t>
       </w:r>
       <w:r>
         <w:t>优化与</w:t>
@@ -13474,7 +13314,11 @@
         <w:t>robot_description</w:t>
       </w:r>
       <w:r>
-        <w:t>参数），初始化</w:t>
+        <w:t>参数），初始</w:t>
+      </w:r>
+      <w:r>
+        <w:lastRenderedPageBreak/>
+        <w:t>化</w:t>
       </w:r>
       <w:r>
         <w:t>CAN</w:t>
@@ -13814,14 +13658,7 @@
         <w:rPr>
           <w:lang w:eastAsia="zh-CN"/>
         </w:rPr>
-        <w:t>）与运动</w:t>
-      </w:r>
-      <w:r>
-        <w:rPr>
-          <w:lang w:eastAsia="zh-CN"/>
-        </w:rPr>
-        <w:lastRenderedPageBreak/>
-        <w:t>速度比例（</w:t>
+        <w:t>）与运动速度比例（</w:t>
       </w:r>
       <w:r>
         <w:rPr>
@@ -14003,6 +13840,7 @@
           <w:color w:val="000000"/>
           <w:sz w:val="28"/>
         </w:rPr>
+        <w:lastRenderedPageBreak/>
         <w:t xml:space="preserve">3.4 </w:t>
       </w:r>
       <w:proofErr w:type="spellStart"/>
@@ -14381,14 +14219,6 @@
                 <w:lang w:eastAsia="zh-CN"/>
               </w:rPr>
               <w:br/>
-            </w:r>
-            <w:r>
-              <w:rPr>
-                <w:rFonts w:ascii="宋体" w:hAnsi="宋体"/>
-                <w:sz w:val="20"/>
-                <w:lang w:eastAsia="zh-CN"/>
-              </w:rPr>
-              <w:lastRenderedPageBreak/>
               <w:t>（CAN通信中断）</w:t>
             </w:r>
           </w:p>
@@ -14410,17 +14240,7 @@
                 <w:sz w:val="20"/>
                 <w:lang w:eastAsia="zh-CN"/>
               </w:rPr>
-              <w:lastRenderedPageBreak/>
-              <w:t>CAN线缆松动或USB</w:t>
-            </w:r>
-            <w:r>
-              <w:rPr>
-                <w:rFonts w:ascii="宋体" w:hAnsi="宋体"/>
-                <w:sz w:val="20"/>
-                <w:lang w:eastAsia="zh-CN"/>
-              </w:rPr>
-              <w:lastRenderedPageBreak/>
-              <w:t>转CAN</w:t>
+              <w:t>CAN线缆松动或USB转CAN</w:t>
             </w:r>
             <w:r>
               <w:rPr>
@@ -14447,7 +14267,6 @@
                 <w:rFonts w:ascii="宋体" w:hAnsi="宋体"/>
                 <w:sz w:val="20"/>
               </w:rPr>
-              <w:lastRenderedPageBreak/>
               <w:t>dmesg</w:t>
             </w:r>
             <w:proofErr w:type="spellEnd"/>
@@ -14464,15 +14283,7 @@
                 <w:rFonts w:ascii="宋体" w:hAnsi="宋体"/>
                 <w:sz w:val="20"/>
               </w:rPr>
-              <w:t>can检</w:t>
-            </w:r>
-            <w:r>
-              <w:rPr>
-                <w:rFonts w:ascii="宋体" w:hAnsi="宋体"/>
-                <w:sz w:val="20"/>
-              </w:rPr>
-              <w:lastRenderedPageBreak/>
-              <w:t>查内核日志</w:t>
+              <w:t>can检查内核日志</w:t>
             </w:r>
             <w:proofErr w:type="spellEnd"/>
             <w:r>
@@ -14520,7 +14331,6 @@
                 <w:rFonts w:ascii="宋体" w:hAnsi="宋体"/>
                 <w:sz w:val="20"/>
               </w:rPr>
-              <w:lastRenderedPageBreak/>
               <w:t>重新插拔USB线缆；</w:t>
             </w:r>
             <w:r>
@@ -14529,13 +14339,6 @@
                 <w:sz w:val="20"/>
               </w:rPr>
               <w:br/>
-            </w:r>
-            <w:r>
-              <w:rPr>
-                <w:rFonts w:ascii="宋体" w:hAnsi="宋体"/>
-                <w:sz w:val="20"/>
-              </w:rPr>
-              <w:lastRenderedPageBreak/>
               <w:t>重启rm_driver节点</w:t>
             </w:r>
           </w:p>
@@ -14555,7 +14358,6 @@
                 <w:rFonts w:ascii="宋体" w:hAnsi="宋体"/>
                 <w:sz w:val="20"/>
               </w:rPr>
-              <w:lastRenderedPageBreak/>
               <w:t>相机无数据流</w:t>
             </w:r>
           </w:p>
@@ -14854,6 +14656,7 @@
                 <w:rFonts w:ascii="宋体" w:hAnsi="宋体"/>
                 <w:sz w:val="20"/>
               </w:rPr>
+              <w:lastRenderedPageBreak/>
               <w:t>吸盘无法抓取</w:t>
             </w:r>
           </w:p>
@@ -15097,6 +14900,11 @@
           <w:lang w:eastAsia="zh-CN"/>
         </w:rPr>
       </w:pPr>
+      <w:r>
+        <w:rPr>
+          <w:lang w:eastAsia="zh-CN"/>
+        </w:rPr>
+      </w:r>
     </w:p>
     <w:p>
       <w:pPr>
@@ -15116,6 +14924,7 @@
           <w:sz w:val="32"/>
           <w:lang w:eastAsia="zh-CN"/>
         </w:rPr>
+        <w:lastRenderedPageBreak/>
         <w:t xml:space="preserve">4. </w:t>
       </w:r>
       <w:r>
@@ -16215,6 +16024,7 @@
         <w:rPr>
           <w:lang w:eastAsia="zh-CN"/>
         </w:rPr>
+        <w:lastRenderedPageBreak/>
         <w:t>校正后的深度图通过以下公式逐像素投影为三维点云：</w:t>
       </w:r>
     </w:p>
@@ -16683,7 +16493,6 @@
           <w:sz w:val="26"/>
           <w:lang w:eastAsia="zh-CN"/>
         </w:rPr>
-        <w:lastRenderedPageBreak/>
         <w:t xml:space="preserve">4.1.3 </w:t>
       </w:r>
       <w:r>
@@ -16703,47 +16512,32 @@
         <w:jc w:val="center"/>
       </w:pPr>
       <w:r>
-        <w:rPr>
-          <w:noProof/>
-        </w:rPr>
         <w:drawing>
-          <wp:inline distT="0" distB="0" distL="0" distR="0" wp14:anchorId="4CBFC79C" wp14:editId="08414877">
-            <wp:extent cx="4845937" cy="2684353"/>
-            <wp:effectExtent l="0" t="0" r="0" b="1905"/>
-            <wp:docPr id="15" name="Picture 15"/>
+          <wp:inline xmlns:a="http://schemas.openxmlformats.org/drawingml/2006/main" xmlns:pic="http://schemas.openxmlformats.org/drawingml/2006/picture">
+            <wp:extent cx="4846320" cy="2868061"/>
+            <wp:docPr id="16" name="Picture 16"/>
             <wp:cNvGraphicFramePr>
-              <a:graphicFrameLocks xmlns:a="http://schemas.openxmlformats.org/drawingml/2006/main" noChangeAspect="1"/>
+              <a:graphicFrameLocks noChangeAspect="1"/>
             </wp:cNvGraphicFramePr>
-            <a:graphic xmlns:a="http://schemas.openxmlformats.org/drawingml/2006/main">
+            <a:graphic>
               <a:graphicData uri="http://schemas.openxmlformats.org/drawingml/2006/picture">
-                <pic:pic xmlns:pic="http://schemas.openxmlformats.org/drawingml/2006/picture">
+                <pic:pic>
                   <pic:nvPicPr>
                     <pic:cNvPr id="0" name="fig7_handeye_calibration.png"/>
                     <pic:cNvPicPr/>
                   </pic:nvPicPr>
-                  <pic:blipFill rotWithShape="1">
-                    <a:blip r:embed="rId9"/>
-                    <a:srcRect b="18328"/>
+                  <pic:blipFill>
+                    <a:blip r:embed="rId22"/>
                     <a:stretch>
                       <a:fillRect/>
                     </a:stretch>
                   </pic:blipFill>
-                  <pic:spPr bwMode="auto">
+                  <pic:spPr>
                     <a:xfrm>
                       <a:off x="0" y="0"/>
-                      <a:ext cx="4846320" cy="2684565"/>
+                      <a:ext cx="4846320" cy="2868061"/>
                     </a:xfrm>
-                    <a:prstGeom prst="rect">
-                      <a:avLst/>
-                    </a:prstGeom>
-                    <a:ln>
-                      <a:noFill/>
-                    </a:ln>
-                    <a:extLst>
-                      <a:ext uri="{53640926-AAD7-44D8-BBD7-CCE9431645EC}">
-                        <a14:shadowObscured xmlns:a14="http://schemas.microsoft.com/office/drawing/2010/main"/>
-                      </a:ext>
-                    </a:extLst>
+                    <a:prstGeom prst="rect"/>
                   </pic:spPr>
                 </pic:pic>
               </a:graphicData>
@@ -16756,60 +16550,21 @@
       <w:pPr>
         <w:spacing w:after="200"/>
         <w:jc w:val="center"/>
-        <w:rPr>
-          <w:lang w:eastAsia="zh-CN"/>
-        </w:rPr>
-      </w:pPr>
-      <w:r>
-        <w:rPr>
+      </w:pPr>
+      <w:r>
+        <w:rPr>
+          <w:rFonts w:ascii="Times New Roman" w:hAnsi="Times New Roman"/>
           <w:b/>
           <w:sz w:val="18"/>
-          <w:lang w:eastAsia="zh-CN"/>
-        </w:rPr>
-        <w:t>图</w:t>
-      </w:r>
-      <w:r>
-        <w:rPr>
-          <w:b/>
+        </w:rPr>
+        <w:t xml:space="preserve">图4-3  </w:t>
+      </w:r>
+      <w:r>
+        <w:rPr>
+          <w:rFonts w:ascii="Times New Roman" w:hAnsi="Times New Roman"/>
           <w:sz w:val="18"/>
-          <w:lang w:eastAsia="zh-CN"/>
-        </w:rPr>
-        <w:t xml:space="preserve">4-3  </w:t>
-      </w:r>
-      <w:r>
-        <w:rPr>
-          <w:sz w:val="18"/>
-          <w:lang w:eastAsia="zh-CN"/>
-        </w:rPr>
-        <w:t>手眼标定流程（</w:t>
-      </w:r>
-      <w:r>
-        <w:rPr>
-          <w:sz w:val="18"/>
-          <w:lang w:eastAsia="zh-CN"/>
-        </w:rPr>
-        <w:t>Tsai-Lenz</w:t>
-      </w:r>
-      <w:r>
-        <w:rPr>
-          <w:sz w:val="18"/>
-          <w:lang w:eastAsia="zh-CN"/>
-        </w:rPr>
-        <w:t>算法</w:t>
-      </w:r>
-      <w:r>
-        <w:rPr>
-          <w:sz w:val="18"/>
-          <w:lang w:eastAsia="zh-CN"/>
-        </w:rPr>
-        <w:t xml:space="preserve"> AX=XB </w:t>
-      </w:r>
-      <w:r>
-        <w:rPr>
-          <w:sz w:val="18"/>
-          <w:lang w:eastAsia="zh-CN"/>
-        </w:rPr>
-        <w:t>求解）</w:t>
+        </w:rPr>
+        <w:t>手眼标定流程（Tsai-Lenz算法 $AX=XB$ 求解）</w:t>
       </w:r>
     </w:p>
     <w:p>
@@ -17858,7 +17613,6 @@
         <w:rPr>
           <w:lang w:eastAsia="zh-CN"/>
         </w:rPr>
-        <w:lastRenderedPageBreak/>
         <w:t>R_X</w:t>
       </w:r>
       <w:r>
@@ -17998,6 +17752,7 @@
         </w:rPr>
       </w:pPr>
       <w:r>
+        <w:lastRenderedPageBreak/>
         <w:t>标定结果以</w:t>
       </w:r>
       <w:r>
@@ -18424,6 +18179,11 @@
           <w:lang w:eastAsia="zh-CN"/>
         </w:rPr>
       </w:pPr>
+      <w:r>
+        <w:rPr>
+          <w:lang w:eastAsia="zh-CN"/>
+        </w:rPr>
+      </w:r>
     </w:p>
     <w:p>
       <w:pPr>
@@ -18442,6 +18202,7 @@
           <w:sz w:val="28"/>
           <w:lang w:eastAsia="zh-CN"/>
         </w:rPr>
+        <w:lastRenderedPageBreak/>
         <w:t xml:space="preserve">4.2 </w:t>
       </w:r>
       <w:r>
@@ -18576,14 +18337,7 @@
         <w:rPr>
           <w:lang w:eastAsia="zh-CN"/>
         </w:rPr>
-        <w:t>）减少梯度重复计算，在保持特征表达能力的条件下降低</w:t>
-      </w:r>
-      <w:r>
-        <w:rPr>
-          <w:lang w:eastAsia="zh-CN"/>
-        </w:rPr>
-        <w:lastRenderedPageBreak/>
-        <w:t>约</w:t>
+        <w:t>）减少梯度重复计算，在保持特征表达能力的条件下降低约</w:t>
       </w:r>
       <w:r>
         <w:rPr>
@@ -19421,6 +19175,7 @@
           <w:sz w:val="26"/>
           <w:lang w:eastAsia="zh-CN"/>
         </w:rPr>
+        <w:lastRenderedPageBreak/>
         <w:t xml:space="preserve">4.2.2 </w:t>
       </w:r>
       <w:r>
@@ -19706,11 +19461,7 @@
         <w:t>warmup</w:t>
       </w:r>
       <w:r>
-        <w:t>，学</w:t>
-      </w:r>
-      <w:r>
-        <w:lastRenderedPageBreak/>
-        <w:t>习率在</w:t>
+        <w:t>，学习率在</w:t>
       </w:r>
       <w:r>
         <w:t>150</w:t>
@@ -19854,47 +19605,32 @@
         <w:jc w:val="center"/>
       </w:pPr>
       <w:r>
-        <w:rPr>
-          <w:noProof/>
-        </w:rPr>
         <w:drawing>
-          <wp:inline distT="0" distB="0" distL="0" distR="0" wp14:anchorId="290D8825" wp14:editId="638B1968">
-            <wp:extent cx="5303469" cy="2159251"/>
-            <wp:effectExtent l="0" t="0" r="0" b="0"/>
-            <wp:docPr id="14" name="Picture 14"/>
+          <wp:inline xmlns:a="http://schemas.openxmlformats.org/drawingml/2006/main" xmlns:pic="http://schemas.openxmlformats.org/drawingml/2006/picture">
+            <wp:extent cx="5303520" cy="2627913"/>
+            <wp:docPr id="15" name="Picture 15"/>
             <wp:cNvGraphicFramePr>
-              <a:graphicFrameLocks xmlns:a="http://schemas.openxmlformats.org/drawingml/2006/main" noChangeAspect="1"/>
+              <a:graphicFrameLocks noChangeAspect="1"/>
             </wp:cNvGraphicFramePr>
-            <a:graphic xmlns:a="http://schemas.openxmlformats.org/drawingml/2006/main">
+            <a:graphic>
               <a:graphicData uri="http://schemas.openxmlformats.org/drawingml/2006/picture">
-                <pic:pic xmlns:pic="http://schemas.openxmlformats.org/drawingml/2006/picture">
+                <pic:pic>
                   <pic:nvPicPr>
                     <pic:cNvPr id="0" name="fig3_vision_pipeline.png"/>
                     <pic:cNvPicPr/>
                   </pic:nvPicPr>
-                  <pic:blipFill rotWithShape="1">
-                    <a:blip r:embed="rId10"/>
-                    <a:srcRect b="23068"/>
+                  <pic:blipFill>
+                    <a:blip r:embed="rId21"/>
                     <a:stretch>
                       <a:fillRect/>
                     </a:stretch>
                   </pic:blipFill>
-                  <pic:spPr bwMode="auto">
+                  <pic:spPr>
                     <a:xfrm>
                       <a:off x="0" y="0"/>
-                      <a:ext cx="5303520" cy="2159272"/>
+                      <a:ext cx="5303520" cy="2627913"/>
                     </a:xfrm>
-                    <a:prstGeom prst="rect">
-                      <a:avLst/>
-                    </a:prstGeom>
-                    <a:ln>
-                      <a:noFill/>
-                    </a:ln>
-                    <a:extLst>
-                      <a:ext uri="{53640926-AAD7-44D8-BBD7-CCE9431645EC}">
-                        <a14:shadowObscured xmlns:a14="http://schemas.microsoft.com/office/drawing/2010/main"/>
-                      </a:ext>
-                    </a:extLst>
+                    <a:prstGeom prst="rect"/>
                   </pic:spPr>
                 </pic:pic>
               </a:graphicData>
@@ -19907,102 +19643,27 @@
       <w:pPr>
         <w:spacing w:after="200"/>
         <w:jc w:val="center"/>
-        <w:rPr>
-          <w:lang w:eastAsia="zh-CN"/>
-        </w:rPr>
-      </w:pPr>
-      <w:r>
-        <w:rPr>
+      </w:pPr>
+      <w:r>
+        <w:rPr>
+          <w:rFonts w:ascii="Times New Roman" w:hAnsi="Times New Roman"/>
           <w:b/>
           <w:sz w:val="18"/>
-          <w:lang w:eastAsia="zh-CN"/>
-        </w:rPr>
-        <w:t>图</w:t>
-      </w:r>
-      <w:r>
-        <w:rPr>
-          <w:b/>
+        </w:rPr>
+        <w:t xml:space="preserve">图4-8  </w:t>
+      </w:r>
+      <w:r>
+        <w:rPr>
+          <w:rFonts w:ascii="Times New Roman" w:hAnsi="Times New Roman"/>
           <w:sz w:val="18"/>
-          <w:lang w:eastAsia="zh-CN"/>
-        </w:rPr>
-        <w:t xml:space="preserve">4-8  </w:t>
-      </w:r>
-      <w:r>
-        <w:rPr>
-          <w:sz w:val="18"/>
-          <w:lang w:eastAsia="zh-CN"/>
-        </w:rPr>
-        <w:t>视觉识别流水线（</w:t>
-      </w:r>
-      <w:r>
-        <w:rPr>
-          <w:sz w:val="18"/>
-          <w:lang w:eastAsia="zh-CN"/>
-        </w:rPr>
-        <w:t>D435</w:t>
-      </w:r>
-      <w:r>
-        <w:rPr>
-          <w:sz w:val="18"/>
-          <w:lang w:eastAsia="zh-CN"/>
-        </w:rPr>
-        <w:t>采集</w:t>
-      </w:r>
-      <w:r>
-        <w:rPr>
-          <w:sz w:val="18"/>
-          <w:lang w:eastAsia="zh-CN"/>
-        </w:rPr>
-        <w:t>→YOLOv8</w:t>
-      </w:r>
-      <w:r>
-        <w:rPr>
-          <w:sz w:val="18"/>
-          <w:lang w:eastAsia="zh-CN"/>
-        </w:rPr>
-        <w:t>分割</w:t>
-      </w:r>
-      <w:r>
-        <w:rPr>
-          <w:sz w:val="18"/>
-          <w:lang w:eastAsia="zh-CN"/>
-        </w:rPr>
-        <w:t>→</w:t>
-      </w:r>
-      <w:r>
-        <w:rPr>
-          <w:sz w:val="18"/>
-          <w:lang w:eastAsia="zh-CN"/>
-        </w:rPr>
-        <w:t>模板匹配</w:t>
-      </w:r>
-      <w:r>
-        <w:rPr>
-          <w:sz w:val="18"/>
-          <w:lang w:eastAsia="zh-CN"/>
-        </w:rPr>
-        <w:t>→</w:t>
-      </w:r>
-      <w:r>
-        <w:rPr>
-          <w:sz w:val="18"/>
-          <w:lang w:eastAsia="zh-CN"/>
-        </w:rPr>
-        <w:t>手眼变换</w:t>
-      </w:r>
-      <w:r>
-        <w:rPr>
-          <w:sz w:val="18"/>
-          <w:lang w:eastAsia="zh-CN"/>
-        </w:rPr>
-        <w:t>→</w:t>
-      </w:r>
-      <w:r>
-        <w:rPr>
-          <w:sz w:val="18"/>
-          <w:lang w:eastAsia="zh-CN"/>
-        </w:rPr>
-        <w:t>抓取位姿）</w:t>
+        </w:rPr>
+        <w:t>视觉识别流水线（D435采集$</w:t>
+        <w:br/>
+        <w:t>ightarrow$YOLOv8分割$</w:t>
+        <w:br/>
+        <w:t>ightarrow$模板匹配$</w:t>
+        <w:br/>
+        <w:t>ightarrow$6-DOF位姿）</w:t>
       </w:r>
     </w:p>
     <w:p>
@@ -20031,15 +19692,7 @@
         <w:t>visualize_yolo_degv2.py</w:t>
       </w:r>
       <w:r>
-        <w:t>）。</w:t>
-      </w:r>
-      <w:proofErr w:type="spellStart"/>
-      <w:r>
-        <w:t>其核心流程为</w:t>
-      </w:r>
-      <w:proofErr w:type="spellEnd"/>
-      <w:r>
-        <w:t>：</w:t>
+        <w:t>）。其核心流程为：</w:t>
       </w:r>
     </w:p>
     <w:p>
@@ -20129,45 +19782,53 @@
         <w:rPr>
           <w:lang w:eastAsia="zh-CN"/>
         </w:rPr>
-        <w:t>个均匀采样点。对每个检测到的目标轮廓，首先通过等比缩放使模板与目标的包围</w:t>
+        <w:t>个均匀采样点。对每个检测到的目标轮廓，首先通过等比缩放使模板与目标的包围盒面积对齐，随后以</w:t>
+      </w:r>
+      <w:r>
+        <w:rPr>
+          <w:lang w:eastAsia="zh-CN"/>
+        </w:rPr>
+        <w:t>5°</w:t>
       </w:r>
       <w:proofErr w:type="gramStart"/>
       <w:r>
         <w:rPr>
           <w:lang w:eastAsia="zh-CN"/>
         </w:rPr>
-        <w:t>盒面积</w:t>
+        <w:t>步长在</w:t>
+      </w:r>
+      <w:r>
+        <w:rPr>
+          <w:lang w:eastAsia="zh-CN"/>
+        </w:rPr>
+        <w:t>[</w:t>
       </w:r>
       <w:proofErr w:type="gramEnd"/>
       <w:r>
         <w:rPr>
           <w:lang w:eastAsia="zh-CN"/>
         </w:rPr>
-        <w:t>对齐，随后以</w:t>
-      </w:r>
-      <w:r>
-        <w:rPr>
-          <w:lang w:eastAsia="zh-CN"/>
-        </w:rPr>
-        <w:t>5°</w:t>
-      </w:r>
-      <w:r>
-        <w:rPr>
-          <w:lang w:eastAsia="zh-CN"/>
-        </w:rPr>
-        <w:t>步长在</w:t>
-      </w:r>
-      <w:r>
-        <w:rPr>
-          <w:lang w:eastAsia="zh-CN"/>
-        </w:rPr>
-        <w:t>[0°, 360°)</w:t>
-      </w:r>
-      <w:r>
-        <w:rPr>
-          <w:lang w:eastAsia="zh-CN"/>
-        </w:rPr>
-        <w:t>范围内粗搜索最优旋转角度，再以</w:t>
+        <w:t>0°, 360</w:t>
+      </w:r>
+      <w:proofErr w:type="gramStart"/>
+      <w:r>
+        <w:rPr>
+          <w:lang w:eastAsia="zh-CN"/>
+        </w:rPr>
+        <w:t>°)</w:t>
+      </w:r>
+      <w:r>
+        <w:rPr>
+          <w:lang w:eastAsia="zh-CN"/>
+        </w:rPr>
+        <w:t>范围内粗搜索最优旋转角度</w:t>
+      </w:r>
+      <w:proofErr w:type="gramEnd"/>
+      <w:r>
+        <w:rPr>
+          <w:lang w:eastAsia="zh-CN"/>
+        </w:rPr>
+        <w:t>，再以</w:t>
       </w:r>
       <w:r>
         <w:rPr>
@@ -20179,16 +19840,8 @@
         <w:rPr>
           <w:lang w:eastAsia="zh-CN"/>
         </w:rPr>
-        <w:t>步长在最优</w:t>
-      </w:r>
-      <w:proofErr w:type="gramStart"/>
-      <w:r>
-        <w:rPr>
-          <w:lang w:eastAsia="zh-CN"/>
-        </w:rPr>
-        <w:t>粗角度</w:t>
-      </w:r>
-      <w:proofErr w:type="gramEnd"/>
+        <w:t>步长在最优粗角度</w:t>
+      </w:r>
       <w:r>
         <w:rPr>
           <w:lang w:eastAsia="zh-CN"/>
@@ -20920,24 +20573,11 @@
           <w:lang w:eastAsia="zh-CN"/>
         </w:rPr>
       </w:pPr>
-      <w:proofErr w:type="spellStart"/>
       <w:r>
         <w:t>其中</w:t>
       </w:r>
       <w:r>
-        <w:t>M_ij</w:t>
-      </w:r>
-      <w:proofErr w:type="spellEnd"/>
-      <w:r>
-        <w:t>=</w:t>
-      </w:r>
-      <w:proofErr w:type="spellStart"/>
-      <w:r>
-        <w:t>Σ_xΣ_y</w:t>
-      </w:r>
-      <w:proofErr w:type="spellEnd"/>
-      <w:r>
-        <w:t xml:space="preserve"> </w:t>
+        <w:t xml:space="preserve">M_ij=Σ_xΣ_y </w:t>
       </w:r>
       <w:proofErr w:type="spellStart"/>
       <w:r>
@@ -21079,7 +20719,7 @@
                     <pic:cNvPicPr/>
                   </pic:nvPicPr>
                   <pic:blipFill>
-                    <a:blip r:embed="rId11"/>
+                    <a:blip r:embed="rId7"/>
                     <a:stretch>
                       <a:fillRect/>
                     </a:stretch>
@@ -21150,7 +20790,7 @@
                     <pic:cNvPicPr/>
                   </pic:nvPicPr>
                   <pic:blipFill>
-                    <a:blip r:embed="rId12"/>
+                    <a:blip r:embed="rId8"/>
                     <a:stretch>
                       <a:fillRect/>
                     </a:stretch>
@@ -21202,6 +20842,11 @@
           <w:lang w:eastAsia="zh-CN"/>
         </w:rPr>
       </w:pPr>
+      <w:r>
+        <w:rPr>
+          <w:lang w:eastAsia="zh-CN"/>
+        </w:rPr>
+      </w:r>
     </w:p>
     <w:p>
       <w:pPr>
@@ -23790,7 +23435,6 @@
           <w:sz w:val="26"/>
           <w:lang w:eastAsia="zh-CN"/>
         </w:rPr>
-        <w:lastRenderedPageBreak/>
         <w:t xml:space="preserve">4.3.3 </w:t>
       </w:r>
       <w:r>
@@ -23846,26 +23490,22 @@
         <w:jc w:val="center"/>
       </w:pPr>
       <w:r>
-        <w:rPr>
-          <w:noProof/>
-        </w:rPr>
         <w:drawing>
-          <wp:inline distT="0" distB="0" distL="0" distR="0" wp14:anchorId="5842C913" wp14:editId="1528C695">
-            <wp:extent cx="5303520" cy="3375299"/>
-            <wp:effectExtent l="0" t="0" r="0" b="0"/>
-            <wp:docPr id="13" name="Picture 13"/>
+          <wp:inline xmlns:a="http://schemas.openxmlformats.org/drawingml/2006/main" xmlns:pic="http://schemas.openxmlformats.org/drawingml/2006/picture">
+            <wp:extent cx="5303520" cy="3057945"/>
+            <wp:docPr id="14" name="Picture 14"/>
             <wp:cNvGraphicFramePr>
-              <a:graphicFrameLocks xmlns:a="http://schemas.openxmlformats.org/drawingml/2006/main" noChangeAspect="1"/>
+              <a:graphicFrameLocks noChangeAspect="1"/>
             </wp:cNvGraphicFramePr>
-            <a:graphic xmlns:a="http://schemas.openxmlformats.org/drawingml/2006/main">
+            <a:graphic>
               <a:graphicData uri="http://schemas.openxmlformats.org/drawingml/2006/picture">
-                <pic:pic xmlns:pic="http://schemas.openxmlformats.org/drawingml/2006/picture">
+                <pic:pic>
                   <pic:nvPicPr>
                     <pic:cNvPr id="0" name="fig6_dqn_architecture.png"/>
                     <pic:cNvPicPr/>
                   </pic:nvPicPr>
                   <pic:blipFill>
-                    <a:blip r:embed="rId13"/>
+                    <a:blip r:embed="rId20"/>
                     <a:stretch>
                       <a:fillRect/>
                     </a:stretch>
@@ -23873,11 +23513,9 @@
                   <pic:spPr>
                     <a:xfrm>
                       <a:off x="0" y="0"/>
-                      <a:ext cx="5303520" cy="3375299"/>
+                      <a:ext cx="5303520" cy="3057945"/>
                     </a:xfrm>
-                    <a:prstGeom prst="rect">
-                      <a:avLst/>
-                    </a:prstGeom>
+                    <a:prstGeom prst="rect"/>
                   </pic:spPr>
                 </pic:pic>
               </a:graphicData>
@@ -23890,106 +23528,25 @@
       <w:pPr>
         <w:spacing w:after="200"/>
         <w:jc w:val="center"/>
-        <w:rPr>
-          <w:lang w:eastAsia="zh-CN"/>
-        </w:rPr>
-      </w:pPr>
-      <w:r>
-        <w:rPr>
+      </w:pPr>
+      <w:r>
+        <w:rPr>
+          <w:rFonts w:ascii="Times New Roman" w:hAnsi="Times New Roman"/>
           <w:b/>
           <w:sz w:val="18"/>
-          <w:lang w:eastAsia="zh-CN"/>
-        </w:rPr>
-        <w:t>图</w:t>
-      </w:r>
-      <w:r>
-        <w:rPr>
-          <w:b/>
+        </w:rPr>
+        <w:t xml:space="preserve">图4-4  </w:t>
+      </w:r>
+      <w:r>
+        <w:rPr>
+          <w:rFonts w:ascii="Times New Roman" w:hAnsi="Times New Roman"/>
           <w:sz w:val="18"/>
-          <w:lang w:eastAsia="zh-CN"/>
-        </w:rPr>
-        <w:t xml:space="preserve">4-4  </w:t>
-      </w:r>
-      <w:r>
-        <w:rPr>
-          <w:sz w:val="18"/>
-          <w:lang w:eastAsia="zh-CN"/>
-        </w:rPr>
-        <w:t>DQN</w:t>
-      </w:r>
-      <w:r>
-        <w:rPr>
-          <w:sz w:val="18"/>
-          <w:lang w:eastAsia="zh-CN"/>
-        </w:rPr>
-        <w:t>深度</w:t>
-      </w:r>
-      <w:r>
-        <w:rPr>
-          <w:sz w:val="18"/>
-          <w:lang w:eastAsia="zh-CN"/>
-        </w:rPr>
-        <w:t>Q</w:t>
-      </w:r>
-      <w:r>
-        <w:rPr>
-          <w:sz w:val="18"/>
-          <w:lang w:eastAsia="zh-CN"/>
-        </w:rPr>
-        <w:t>网络架构（</w:t>
-      </w:r>
-      <w:r>
-        <w:rPr>
-          <w:sz w:val="18"/>
-          <w:lang w:eastAsia="zh-CN"/>
-        </w:rPr>
-        <w:t>211</w:t>
-      </w:r>
-      <w:proofErr w:type="gramStart"/>
-      <w:r>
-        <w:rPr>
-          <w:sz w:val="18"/>
-          <w:lang w:eastAsia="zh-CN"/>
-        </w:rPr>
-        <w:t>维状态</w:t>
-      </w:r>
-      <w:proofErr w:type="gramEnd"/>
-      <w:r>
-        <w:rPr>
-          <w:sz w:val="18"/>
-          <w:lang w:eastAsia="zh-CN"/>
-        </w:rPr>
-        <w:t xml:space="preserve"> → 3</w:t>
-      </w:r>
-      <w:r>
-        <w:rPr>
-          <w:sz w:val="18"/>
-          <w:lang w:eastAsia="zh-CN"/>
-        </w:rPr>
-        <w:t>层</w:t>
-      </w:r>
-      <w:r>
-        <w:rPr>
-          <w:sz w:val="18"/>
-          <w:lang w:eastAsia="zh-CN"/>
-        </w:rPr>
-        <w:t>MLP → 400</w:t>
-      </w:r>
-      <w:proofErr w:type="gramStart"/>
-      <w:r>
-        <w:rPr>
-          <w:sz w:val="18"/>
-          <w:lang w:eastAsia="zh-CN"/>
-        </w:rPr>
-        <w:t>维动作</w:t>
-      </w:r>
-      <w:proofErr w:type="gramEnd"/>
-      <w:r>
-        <w:rPr>
-          <w:sz w:val="18"/>
-          <w:lang w:eastAsia="zh-CN"/>
-        </w:rPr>
-        <w:t>价值）</w:t>
+        </w:rPr>
+        <w:t>深度Q网络架构（211维状态 $</w:t>
+        <w:br/>
+        <w:t>ightarrow$ 3层MLP $</w:t>
+        <w:br/>
+        <w:t>ightarrow$ 400维Q值）</w:t>
       </w:r>
     </w:p>
     <w:p>
@@ -24595,7 +24152,14 @@
         <w:rPr>
           <w:lang w:eastAsia="zh-CN"/>
         </w:rPr>
-        <w:t>维）与旋转角度编码（</w:t>
+        <w:t>维）与旋</w:t>
+      </w:r>
+      <w:r>
+        <w:rPr>
+          <w:lang w:eastAsia="zh-CN"/>
+        </w:rPr>
+        <w:lastRenderedPageBreak/>
+        <w:t>转角度编码（</w:t>
       </w:r>
       <w:r>
         <w:rPr>
@@ -24756,7 +24320,6 @@
         <w:ind w:firstLine="420"/>
       </w:pPr>
       <w:r>
-        <w:lastRenderedPageBreak/>
         <w:t>Double DQN</w:t>
       </w:r>
       <w:r>
@@ -26003,7 +25566,6 @@
           <w:sz w:val="26"/>
           <w:lang w:eastAsia="zh-CN"/>
         </w:rPr>
-        <w:lastRenderedPageBreak/>
         <w:t xml:space="preserve">4.3.4 </w:t>
       </w:r>
       <w:r>
@@ -26023,26 +25585,22 @@
         <w:jc w:val="center"/>
       </w:pPr>
       <w:r>
-        <w:rPr>
-          <w:noProof/>
-        </w:rPr>
         <w:drawing>
-          <wp:inline distT="0" distB="0" distL="0" distR="0" wp14:anchorId="5856EC16" wp14:editId="19ABFD68">
-            <wp:extent cx="5303520" cy="3586710"/>
-            <wp:effectExtent l="0" t="0" r="0" b="0"/>
-            <wp:docPr id="12" name="Picture 12"/>
+          <wp:inline xmlns:a="http://schemas.openxmlformats.org/drawingml/2006/main" xmlns:pic="http://schemas.openxmlformats.org/drawingml/2006/picture">
+            <wp:extent cx="5303520" cy="3672819"/>
+            <wp:docPr id="13" name="Picture 13"/>
             <wp:cNvGraphicFramePr>
-              <a:graphicFrameLocks xmlns:a="http://schemas.openxmlformats.org/drawingml/2006/main" noChangeAspect="1"/>
+              <a:graphicFrameLocks noChangeAspect="1"/>
             </wp:cNvGraphicFramePr>
-            <a:graphic xmlns:a="http://schemas.openxmlformats.org/drawingml/2006/main">
+            <a:graphic>
               <a:graphicData uri="http://schemas.openxmlformats.org/drawingml/2006/picture">
-                <pic:pic xmlns:pic="http://schemas.openxmlformats.org/drawingml/2006/picture">
+                <pic:pic>
                   <pic:nvPicPr>
                     <pic:cNvPr id="0" name="fig4_decision_flow.png"/>
                     <pic:cNvPicPr/>
                   </pic:nvPicPr>
                   <pic:blipFill>
-                    <a:blip r:embed="rId14"/>
+                    <a:blip r:embed="rId19"/>
                     <a:stretch>
                       <a:fillRect/>
                     </a:stretch>
@@ -26050,11 +25608,9 @@
                   <pic:spPr>
                     <a:xfrm>
                       <a:off x="0" y="0"/>
-                      <a:ext cx="5303520" cy="3586710"/>
+                      <a:ext cx="5303520" cy="3672819"/>
                     </a:xfrm>
-                    <a:prstGeom prst="rect">
-                      <a:avLst/>
-                    </a:prstGeom>
+                    <a:prstGeom prst="rect"/>
                   </pic:spPr>
                 </pic:pic>
               </a:graphicData>
@@ -26070,47 +25626,18 @@
       </w:pPr>
       <w:r>
         <w:rPr>
+          <w:rFonts w:ascii="Times New Roman" w:hAnsi="Times New Roman"/>
           <w:b/>
           <w:sz w:val="18"/>
         </w:rPr>
-        <w:t>图</w:t>
-      </w:r>
-      <w:r>
-        <w:rPr>
-          <w:b/>
+        <w:t xml:space="preserve">图4-5  </w:t>
+      </w:r>
+      <w:r>
+        <w:rPr>
+          <w:rFonts w:ascii="Times New Roman" w:hAnsi="Times New Roman"/>
           <w:sz w:val="18"/>
         </w:rPr>
-        <w:t xml:space="preserve">4-5  </w:t>
-      </w:r>
-      <w:r>
-        <w:rPr>
-          <w:sz w:val="18"/>
-        </w:rPr>
-        <w:t>混合决策策略流程（</w:t>
-      </w:r>
-      <w:r>
-        <w:rPr>
-          <w:sz w:val="18"/>
-        </w:rPr>
-        <w:t>Dellacherie</w:t>
-      </w:r>
-      <w:r>
-        <w:rPr>
-          <w:sz w:val="18"/>
-        </w:rPr>
-        <w:t>启发式筛选</w:t>
-      </w:r>
-      <w:r>
-        <w:rPr>
-          <w:sz w:val="18"/>
-        </w:rPr>
-        <w:t xml:space="preserve"> + DQN</w:t>
-      </w:r>
-      <w:r>
-        <w:rPr>
-          <w:sz w:val="18"/>
-        </w:rPr>
-        <w:t>长期价值优化）</w:t>
+        <w:t>混合决策策略流程（Dellacherie启发式筛选 + DQN长期价值优化）</w:t>
       </w:r>
     </w:p>
     <w:p>
@@ -26200,6 +25727,7 @@
         <w:rPr>
           <w:lang w:eastAsia="zh-CN"/>
         </w:rPr>
+        <w:lastRenderedPageBreak/>
         <w:t>Q</w:t>
       </w:r>
       <w:r>
@@ -26287,6 +25815,11 @@
           <w:lang w:eastAsia="zh-CN"/>
         </w:rPr>
       </w:pPr>
+      <w:r>
+        <w:rPr>
+          <w:lang w:eastAsia="zh-CN"/>
+        </w:rPr>
+      </w:r>
     </w:p>
     <w:p>
       <w:pPr>
@@ -29687,6 +29220,11 @@
           <w:lang w:eastAsia="zh-CN"/>
         </w:rPr>
       </w:pPr>
+      <w:r>
+        <w:rPr>
+          <w:lang w:eastAsia="zh-CN"/>
+        </w:rPr>
+      </w:r>
     </w:p>
     <w:p>
       <w:pPr>
@@ -29705,6 +29243,7 @@
           <w:sz w:val="28"/>
           <w:lang w:eastAsia="zh-CN"/>
         </w:rPr>
+        <w:lastRenderedPageBreak/>
         <w:t xml:space="preserve">4.5 </w:t>
       </w:r>
       <w:r>
@@ -30236,6 +29775,7 @@
       <w:r>
         <w:t>RM65-B</w:t>
       </w:r>
+      <w:proofErr w:type="spellStart"/>
       <w:r>
         <w:t>出厂标定的关节</w:t>
       </w:r>
@@ -30243,13 +29783,22 @@
         <w:t>PID</w:t>
       </w:r>
       <w:r>
-        <w:t>增益矩阵（对角矩阵，各关节参数独立），</w:t>
+        <w:t>增益矩阵（对角矩阵，各关节参数独立</w:t>
+      </w:r>
+      <w:proofErr w:type="spellEnd"/>
+      <w:r>
+        <w:t>），</w:t>
       </w:r>
       <w:r>
         <w:t>u(t)</w:t>
       </w:r>
-      <w:r>
-        <w:t>为输出至电机的力矩指令。</w:t>
+      <w:proofErr w:type="spellStart"/>
+      <w:r>
+        <w:t>为输出至电机的力矩指令</w:t>
+      </w:r>
+      <w:proofErr w:type="spellEnd"/>
+      <w:r>
+        <w:t>。</w:t>
       </w:r>
       <w:r>
         <w:rPr>
@@ -30641,7 +30190,6 @@
           <w:sz w:val="26"/>
           <w:lang w:eastAsia="zh-CN"/>
         </w:rPr>
-        <w:lastRenderedPageBreak/>
         <w:t xml:space="preserve">4.5.3 </w:t>
       </w:r>
       <w:r>
@@ -30760,6 +30308,7 @@
         <w:rPr>
           <w:lang w:eastAsia="zh-CN"/>
         </w:rPr>
+        <w:lastRenderedPageBreak/>
         <w:t>运动规划中强制执行</w:t>
       </w:r>
       <w:r>
@@ -30991,6 +30540,11 @@
           <w:lang w:eastAsia="zh-CN"/>
         </w:rPr>
       </w:pPr>
+      <w:r>
+        <w:rPr>
+          <w:lang w:eastAsia="zh-CN"/>
+        </w:rPr>
+      </w:r>
     </w:p>
     <w:p>
       <w:pPr>
@@ -31009,6 +30563,7 @@
           <w:sz w:val="28"/>
           <w:lang w:eastAsia="zh-CN"/>
         </w:rPr>
+        <w:lastRenderedPageBreak/>
         <w:t xml:space="preserve">4.6 </w:t>
       </w:r>
       <w:r>
@@ -31028,26 +30583,22 @@
         <w:jc w:val="center"/>
       </w:pPr>
       <w:r>
-        <w:rPr>
-          <w:noProof/>
-        </w:rPr>
         <w:drawing>
-          <wp:inline distT="0" distB="0" distL="0" distR="0" wp14:anchorId="76254A75" wp14:editId="0FA655E1">
-            <wp:extent cx="5303520" cy="3165709"/>
-            <wp:effectExtent l="0" t="0" r="0" b="0"/>
-            <wp:docPr id="11" name="Picture 11"/>
+          <wp:inline xmlns:a="http://schemas.openxmlformats.org/drawingml/2006/main" xmlns:pic="http://schemas.openxmlformats.org/drawingml/2006/picture">
+            <wp:extent cx="5303520" cy="2770916"/>
+            <wp:docPr id="12" name="Picture 12"/>
             <wp:cNvGraphicFramePr>
-              <a:graphicFrameLocks xmlns:a="http://schemas.openxmlformats.org/drawingml/2006/main" noChangeAspect="1"/>
+              <a:graphicFrameLocks noChangeAspect="1"/>
             </wp:cNvGraphicFramePr>
-            <a:graphic xmlns:a="http://schemas.openxmlformats.org/drawingml/2006/main">
+            <a:graphic>
               <a:graphicData uri="http://schemas.openxmlformats.org/drawingml/2006/picture">
-                <pic:pic xmlns:pic="http://schemas.openxmlformats.org/drawingml/2006/picture">
+                <pic:pic>
                   <pic:nvPicPr>
                     <pic:cNvPr id="0" name="fig5_pick_place_sequence.png"/>
                     <pic:cNvPicPr/>
                   </pic:nvPicPr>
                   <pic:blipFill>
-                    <a:blip r:embed="rId15"/>
+                    <a:blip r:embed="rId18"/>
                     <a:stretch>
                       <a:fillRect/>
                     </a:stretch>
@@ -31055,11 +30606,9 @@
                   <pic:spPr>
                     <a:xfrm>
                       <a:off x="0" y="0"/>
-                      <a:ext cx="5303520" cy="3165709"/>
+                      <a:ext cx="5303520" cy="2770916"/>
                     </a:xfrm>
-                    <a:prstGeom prst="rect">
-                      <a:avLst/>
-                    </a:prstGeom>
+                    <a:prstGeom prst="rect"/>
                   </pic:spPr>
                 </pic:pic>
               </a:graphicData>
@@ -31072,60 +30621,21 @@
       <w:pPr>
         <w:spacing w:after="200"/>
         <w:jc w:val="center"/>
-        <w:rPr>
-          <w:lang w:eastAsia="zh-CN"/>
-        </w:rPr>
-      </w:pPr>
-      <w:r>
-        <w:rPr>
+      </w:pPr>
+      <w:r>
+        <w:rPr>
+          <w:rFonts w:ascii="Times New Roman" w:hAnsi="Times New Roman"/>
           <w:b/>
           <w:sz w:val="18"/>
-          <w:lang w:eastAsia="zh-CN"/>
-        </w:rPr>
-        <w:t>图</w:t>
-      </w:r>
-      <w:r>
-        <w:rPr>
-          <w:b/>
+        </w:rPr>
+        <w:t xml:space="preserve">图4-6  </w:t>
+      </w:r>
+      <w:r>
+        <w:rPr>
+          <w:rFonts w:ascii="Times New Roman" w:hAnsi="Times New Roman"/>
           <w:sz w:val="18"/>
-          <w:lang w:eastAsia="zh-CN"/>
-        </w:rPr>
-        <w:t xml:space="preserve">4-6  </w:t>
-      </w:r>
-      <w:r>
-        <w:rPr>
-          <w:sz w:val="18"/>
-          <w:lang w:eastAsia="zh-CN"/>
-        </w:rPr>
-        <w:t>拾取</w:t>
-      </w:r>
-      <w:r>
-        <w:rPr>
-          <w:sz w:val="18"/>
-          <w:lang w:eastAsia="zh-CN"/>
-        </w:rPr>
-        <w:t>-</w:t>
-      </w:r>
-      <w:r>
-        <w:rPr>
-          <w:sz w:val="18"/>
-          <w:lang w:eastAsia="zh-CN"/>
-        </w:rPr>
-        <w:t>放置运动时序图（</w:t>
-      </w:r>
-      <w:r>
-        <w:rPr>
-          <w:sz w:val="18"/>
-          <w:lang w:eastAsia="zh-CN"/>
-        </w:rPr>
-        <w:t>9.8s</w:t>
-      </w:r>
-      <w:r>
-        <w:rPr>
-          <w:sz w:val="18"/>
-          <w:lang w:eastAsia="zh-CN"/>
-        </w:rPr>
-        <w:t>单次循环）</w:t>
+        </w:rPr>
+        <w:t>拾取-放置运动时序图（9.8 s单次循环）</w:t>
       </w:r>
     </w:p>
     <w:p>
@@ -31139,7 +30649,6 @@
         <w:rPr>
           <w:lang w:eastAsia="zh-CN"/>
         </w:rPr>
-        <w:lastRenderedPageBreak/>
         <w:t>将视觉识别、拼接决策、轨迹规划与运动控制四大模块集成为完整的自动化工作流，是系统工程实现的关键环节。工作流以有限状态机形式组织，共包含</w:t>
       </w:r>
       <w:r>
@@ -31489,6 +30998,7 @@
       <w:r>
         <w:t>transform.py</w:t>
       </w:r>
+      <w:proofErr w:type="spellStart"/>
       <w:r>
         <w:t>读取并转换坐标后写入</w:t>
       </w:r>
@@ -31502,7 +31012,11 @@
         <w:t>moveJ_P.py</w:t>
       </w:r>
       <w:r>
-        <w:t>读取并驱动机械臂执行。</w:t>
+        <w:t>读取并驱动机械臂执行</w:t>
+      </w:r>
+      <w:proofErr w:type="spellEnd"/>
+      <w:r>
+        <w:t>。</w:t>
       </w:r>
       <w:r>
         <w:rPr>
@@ -31579,6 +31093,12 @@
           <w:lang w:eastAsia="zh-CN"/>
         </w:rPr>
       </w:pPr>
+      <w:r>
+        <w:rPr>
+          <w:lang w:eastAsia="zh-CN"/>
+        </w:rPr>
+        <w:lastRenderedPageBreak/>
+      </w:r>
     </w:p>
     <w:p>
       <w:pPr>
@@ -31648,22 +31168,341 @@
         <w:jc w:val="center"/>
       </w:pPr>
       <w:r>
-        <w:rPr>
-          <w:noProof/>
-        </w:rPr>
         <w:drawing>
-          <wp:inline distT="0" distB="0" distL="0" distR="0" wp14:anchorId="7B395773" wp14:editId="61DCD840">
+          <wp:inline xmlns:a="http://schemas.openxmlformats.org/drawingml/2006/main" xmlns:pic="http://schemas.openxmlformats.org/drawingml/2006/picture">
             <wp:extent cx="4572000" cy="4572000"/>
-            <wp:effectExtent l="0" t="0" r="0" b="0"/>
+            <wp:docPr id="11" name="Picture 11"/>
+            <wp:cNvGraphicFramePr>
+              <a:graphicFrameLocks noChangeAspect="1"/>
+            </wp:cNvGraphicFramePr>
+            <a:graphic>
+              <a:graphicData uri="http://schemas.openxmlformats.org/drawingml/2006/picture">
+                <pic:pic>
+                  <pic:nvPicPr>
+                    <pic:cNvPr id="0" name="system_running.jpg"/>
+                    <pic:cNvPicPr/>
+                  </pic:nvPicPr>
+                  <pic:blipFill>
+                    <a:blip r:embed="rId17"/>
+                    <a:stretch>
+                      <a:fillRect/>
+                    </a:stretch>
+                  </pic:blipFill>
+                  <pic:spPr>
+                    <a:xfrm>
+                      <a:off x="0" y="0"/>
+                      <a:ext cx="4572000" cy="4572000"/>
+                    </a:xfrm>
+                    <a:prstGeom prst="rect"/>
+                  </pic:spPr>
+                </pic:pic>
+              </a:graphicData>
+            </a:graphic>
+          </wp:inline>
+        </w:drawing>
+      </w:r>
+    </w:p>
+    <w:p>
+      <w:pPr>
+        <w:spacing w:after="200"/>
+        <w:jc w:val="center"/>
+      </w:pPr>
+      <w:r>
+        <w:rPr>
+          <w:rFonts w:ascii="Times New Roman" w:hAnsi="Times New Roman"/>
+          <w:b/>
+          <w:sz w:val="18"/>
+        </w:rPr>
+        <w:t xml:space="preserve">图5-1  </w:t>
+      </w:r>
+      <w:r>
+        <w:rPr>
+          <w:rFonts w:ascii="Times New Roman" w:hAnsi="Times New Roman"/>
+          <w:sz w:val="18"/>
+        </w:rPr>
+        <w:t>系统整体运行场景（RM65-B机械臂 + D435相机 + 工作台）</w:t>
+      </w:r>
+    </w:p>
+    <w:p>
+      <w:pPr>
+        <w:ind w:firstLine="420"/>
+        <w:rPr>
+          <w:lang w:eastAsia="zh-CN"/>
+        </w:rPr>
+      </w:pPr>
+      <w:r>
+        <w:rPr>
+          <w:lang w:eastAsia="zh-CN"/>
+        </w:rPr>
+        <w:t>实验在标准化的竞赛模拟环境中进行。硬件配置：</w:t>
+      </w:r>
+      <w:r>
+        <w:rPr>
+          <w:lang w:eastAsia="zh-CN"/>
+        </w:rPr>
+        <w:t>RM65-B</w:t>
+      </w:r>
+      <w:r>
+        <w:rPr>
+          <w:lang w:eastAsia="zh-CN"/>
+        </w:rPr>
+        <w:t>机械臂，</w:t>
+      </w:r>
+      <w:r>
+        <w:rPr>
+          <w:lang w:eastAsia="zh-CN"/>
+        </w:rPr>
+        <w:t>Intel RealSense D435</w:t>
+      </w:r>
+      <w:r>
+        <w:rPr>
+          <w:lang w:eastAsia="zh-CN"/>
+        </w:rPr>
+        <w:t>相机（固件版本</w:t>
+      </w:r>
+      <w:r>
+        <w:rPr>
+          <w:lang w:eastAsia="zh-CN"/>
+        </w:rPr>
+        <w:t>5.13.0.0</w:t>
+      </w:r>
+      <w:r>
+        <w:rPr>
+          <w:lang w:eastAsia="zh-CN"/>
+        </w:rPr>
+        <w:t>），</w:t>
+      </w:r>
+      <w:r>
+        <w:rPr>
+          <w:lang w:eastAsia="zh-CN"/>
+        </w:rPr>
+        <w:t>Intel Core i7-9700/16 GB RAM/NVIDIA RTX 2080 Ti</w:t>
+      </w:r>
+      <w:r>
+        <w:rPr>
+          <w:lang w:eastAsia="zh-CN"/>
+        </w:rPr>
+        <w:t>计算平台。工作台面尺寸</w:t>
+      </w:r>
+      <w:r>
+        <w:rPr>
+          <w:lang w:eastAsia="zh-CN"/>
+        </w:rPr>
+        <w:t>1.0 m×0.8 m</w:t>
+      </w:r>
+      <w:r>
+        <w:rPr>
+          <w:lang w:eastAsia="zh-CN"/>
+        </w:rPr>
+        <w:t>，表面为哑光黑色木质材料（降低反光干扰），光照条件控制在</w:t>
+      </w:r>
+      <w:r>
+        <w:rPr>
+          <w:lang w:eastAsia="zh-CN"/>
+        </w:rPr>
+        <w:t>500±50 lux</w:t>
+      </w:r>
+      <w:r>
+        <w:rPr>
+          <w:lang w:eastAsia="zh-CN"/>
+        </w:rPr>
+        <w:t>（</w:t>
+      </w:r>
+      <w:r>
+        <w:rPr>
+          <w:lang w:eastAsia="zh-CN"/>
+        </w:rPr>
+        <w:t>LED</w:t>
+      </w:r>
+      <w:r>
+        <w:rPr>
+          <w:lang w:eastAsia="zh-CN"/>
+        </w:rPr>
+        <w:t>漫射光源）。</w:t>
+      </w:r>
+    </w:p>
+    <w:p>
+      <w:pPr>
+        <w:ind w:firstLine="420"/>
+        <w:rPr>
+          <w:lang w:eastAsia="zh-CN"/>
+        </w:rPr>
+      </w:pPr>
+      <w:r>
+        <w:rPr>
+          <w:lang w:eastAsia="zh-CN"/>
+        </w:rPr>
+        <w:t>测试方块共</w:t>
+      </w:r>
+      <w:r>
+        <w:rPr>
+          <w:lang w:eastAsia="zh-CN"/>
+        </w:rPr>
+        <w:t>35</w:t>
+      </w:r>
+      <w:r>
+        <w:rPr>
+          <w:lang w:eastAsia="zh-CN"/>
+        </w:rPr>
+        <w:t>块，</w:t>
+      </w:r>
+      <w:r>
+        <w:rPr>
+          <w:lang w:eastAsia="zh-CN"/>
+        </w:rPr>
+        <w:t>7</w:t>
+      </w:r>
+      <w:r>
+        <w:rPr>
+          <w:lang w:eastAsia="zh-CN"/>
+        </w:rPr>
+        <w:t>种类别各</w:t>
+      </w:r>
+      <w:r>
+        <w:rPr>
+          <w:lang w:eastAsia="zh-CN"/>
+        </w:rPr>
+        <w:t>5</w:t>
+      </w:r>
+      <w:r>
+        <w:rPr>
+          <w:lang w:eastAsia="zh-CN"/>
+        </w:rPr>
+        <w:t>块，由</w:t>
+      </w:r>
+      <w:r>
+        <w:rPr>
+          <w:lang w:eastAsia="zh-CN"/>
+        </w:rPr>
+        <w:t>PLA</w:t>
+      </w:r>
+      <w:r>
+        <w:rPr>
+          <w:lang w:eastAsia="zh-CN"/>
+        </w:rPr>
+        <w:t>材料</w:t>
+      </w:r>
+      <w:r>
+        <w:rPr>
+          <w:lang w:eastAsia="zh-CN"/>
+        </w:rPr>
+        <w:t>3D</w:t>
+      </w:r>
+      <w:r>
+        <w:rPr>
+          <w:lang w:eastAsia="zh-CN"/>
+        </w:rPr>
+        <w:t>打印制成（尺寸</w:t>
+      </w:r>
+      <w:r>
+        <w:rPr>
+          <w:lang w:eastAsia="zh-CN"/>
+        </w:rPr>
+        <w:t>20-50 mm</w:t>
+      </w:r>
+      <w:r>
+        <w:rPr>
+          <w:lang w:eastAsia="zh-CN"/>
+        </w:rPr>
+        <w:t>，颜色红</w:t>
+      </w:r>
+      <w:r>
+        <w:rPr>
+          <w:lang w:eastAsia="zh-CN"/>
+        </w:rPr>
+        <w:t>/</w:t>
+      </w:r>
+      <w:r>
+        <w:rPr>
+          <w:lang w:eastAsia="zh-CN"/>
+        </w:rPr>
+        <w:t>蓝</w:t>
+      </w:r>
+      <w:r>
+        <w:rPr>
+          <w:lang w:eastAsia="zh-CN"/>
+        </w:rPr>
+        <w:t>/</w:t>
+      </w:r>
+      <w:r>
+        <w:rPr>
+          <w:lang w:eastAsia="zh-CN"/>
+        </w:rPr>
+        <w:t>绿</w:t>
+      </w:r>
+      <w:r>
+        <w:rPr>
+          <w:lang w:eastAsia="zh-CN"/>
+        </w:rPr>
+        <w:t>/</w:t>
+      </w:r>
+      <w:r>
+        <w:rPr>
+          <w:lang w:eastAsia="zh-CN"/>
+        </w:rPr>
+        <w:t>黄四色），测试前在台面上随机散布。每组测试重复</w:t>
+      </w:r>
+      <w:r>
+        <w:rPr>
+          <w:lang w:eastAsia="zh-CN"/>
+        </w:rPr>
+        <w:t>10</w:t>
+      </w:r>
+      <w:r>
+        <w:rPr>
+          <w:lang w:eastAsia="zh-CN"/>
+        </w:rPr>
+        <w:t>次，记录以下指标：方块检测数量与精度、抓取成功率、放置精度（与目标位置偏差）、单次循环时间、连续运行稳定性。</w:t>
+      </w:r>
+    </w:p>
+    <w:p>
+      <w:pPr>
+        <w:pStyle w:val="21"/>
+        <w:spacing w:before="240" w:after="160" w:line="300" w:lineRule="auto"/>
+        <w:jc w:val="left"/>
+        <w:rPr>
+          <w:lang w:eastAsia="zh-CN"/>
+        </w:rPr>
+      </w:pPr>
+      <w:bookmarkStart w:id="47" w:name="_Toc229276483"/>
+      <w:r>
+        <w:rPr>
+          <w:rFonts w:ascii="Times New Roman" w:eastAsia="宋体" w:hAnsi="Times New Roman"/>
+          <w:color w:val="000000"/>
+          <w:sz w:val="28"/>
+          <w:lang w:eastAsia="zh-CN"/>
+        </w:rPr>
+        <w:t xml:space="preserve">5.2 </w:t>
+      </w:r>
+      <w:r>
+        <w:rPr>
+          <w:rFonts w:ascii="Times New Roman" w:eastAsia="宋体" w:hAnsi="Times New Roman"/>
+          <w:color w:val="000000"/>
+          <w:sz w:val="28"/>
+          <w:lang w:eastAsia="zh-CN"/>
+        </w:rPr>
+        <w:t>视觉识别性能</w:t>
+      </w:r>
+      <w:bookmarkEnd w:id="47"/>
+    </w:p>
+    <w:p>
+      <w:pPr>
+        <w:spacing w:before="160" w:after="40"/>
+        <w:jc w:val="center"/>
+      </w:pPr>
+      <w:r>
+        <w:drawing>
+          <wp:inline xmlns:a="http://schemas.openxmlformats.org/drawingml/2006/main" xmlns:pic="http://schemas.openxmlformats.org/drawingml/2006/picture">
+            <wp:extent cx="4572000" cy="2571750"/>
             <wp:docPr id="10" name="Picture 10"/>
             <wp:cNvGraphicFramePr>
-              <a:graphicFrameLocks xmlns:a="http://schemas.openxmlformats.org/drawingml/2006/main" noChangeAspect="1"/>
+              <a:graphicFrameLocks noChangeAspect="1"/>
             </wp:cNvGraphicFramePr>
-            <a:graphic xmlns:a="http://schemas.openxmlformats.org/drawingml/2006/main">
+            <a:graphic>
               <a:graphicData uri="http://schemas.openxmlformats.org/drawingml/2006/picture">
-                <pic:pic xmlns:pic="http://schemas.openxmlformats.org/drawingml/2006/picture">
+                <pic:pic>
                   <pic:nvPicPr>
-                    <pic:cNvPr id="0" name="system_running.jpg"/>
+                    <pic:cNvPr id="0" name="recognition_diagram.jpg"/>
                     <pic:cNvPicPr/>
                   </pic:nvPicPr>
                   <pic:blipFill>
@@ -31675,11 +31514,9 @@
                   <pic:spPr>
                     <a:xfrm>
                       <a:off x="0" y="0"/>
-                      <a:ext cx="4572000" cy="4572000"/>
+                      <a:ext cx="4572000" cy="2571750"/>
                     </a:xfrm>
-                    <a:prstGeom prst="rect">
-                      <a:avLst/>
-                    </a:prstGeom>
+                    <a:prstGeom prst="rect"/>
                   </pic:spPr>
                 </pic:pic>
               </a:graphicData>
@@ -31692,449 +31529,21 @@
       <w:pPr>
         <w:spacing w:after="200"/>
         <w:jc w:val="center"/>
-        <w:rPr>
-          <w:lang w:eastAsia="zh-CN"/>
-        </w:rPr>
-      </w:pPr>
-      <w:r>
-        <w:rPr>
+      </w:pPr>
+      <w:r>
+        <w:rPr>
+          <w:rFonts w:ascii="Times New Roman" w:hAnsi="Times New Roman"/>
           <w:b/>
           <w:sz w:val="18"/>
-          <w:lang w:eastAsia="zh-CN"/>
-        </w:rPr>
-        <w:t>图</w:t>
-      </w:r>
-      <w:r>
-        <w:rPr>
-          <w:b/>
+        </w:rPr>
+        <w:t xml:space="preserve">图5-2  </w:t>
+      </w:r>
+      <w:r>
+        <w:rPr>
+          <w:rFonts w:ascii="Times New Roman" w:hAnsi="Times New Roman"/>
           <w:sz w:val="18"/>
-          <w:lang w:eastAsia="zh-CN"/>
-        </w:rPr>
-        <w:t xml:space="preserve">5-1  </w:t>
-      </w:r>
-      <w:r>
-        <w:rPr>
-          <w:sz w:val="18"/>
-          <w:lang w:eastAsia="zh-CN"/>
-        </w:rPr>
-        <w:t>系统整体运行场景（</w:t>
-      </w:r>
-      <w:r>
-        <w:rPr>
-          <w:sz w:val="18"/>
-          <w:lang w:eastAsia="zh-CN"/>
-        </w:rPr>
-        <w:t>RM65-B</w:t>
-      </w:r>
-      <w:r>
-        <w:rPr>
-          <w:sz w:val="18"/>
-          <w:lang w:eastAsia="zh-CN"/>
-        </w:rPr>
-        <w:t>机械臂</w:t>
-      </w:r>
-      <w:r>
-        <w:rPr>
-          <w:sz w:val="18"/>
-          <w:lang w:eastAsia="zh-CN"/>
-        </w:rPr>
-        <w:t xml:space="preserve"> + D435</w:t>
-      </w:r>
-      <w:r>
-        <w:rPr>
-          <w:sz w:val="18"/>
-          <w:lang w:eastAsia="zh-CN"/>
-        </w:rPr>
-        <w:t>相机</w:t>
-      </w:r>
-      <w:r>
-        <w:rPr>
-          <w:sz w:val="18"/>
-          <w:lang w:eastAsia="zh-CN"/>
-        </w:rPr>
-        <w:t xml:space="preserve"> + </w:t>
-      </w:r>
-      <w:r>
-        <w:rPr>
-          <w:sz w:val="18"/>
-          <w:lang w:eastAsia="zh-CN"/>
-        </w:rPr>
-        <w:t>工作台）</w:t>
-      </w:r>
-    </w:p>
-    <w:p>
-      <w:pPr>
-        <w:ind w:firstLine="420"/>
-        <w:rPr>
-          <w:lang w:eastAsia="zh-CN"/>
-        </w:rPr>
-      </w:pPr>
-      <w:r>
-        <w:rPr>
-          <w:lang w:eastAsia="zh-CN"/>
-        </w:rPr>
-        <w:t>实验在标准化的竞赛模拟环境中进行。硬件配置：</w:t>
-      </w:r>
-      <w:r>
-        <w:rPr>
-          <w:lang w:eastAsia="zh-CN"/>
-        </w:rPr>
-        <w:t>RM65-B</w:t>
-      </w:r>
-      <w:r>
-        <w:rPr>
-          <w:lang w:eastAsia="zh-CN"/>
-        </w:rPr>
-        <w:t>机械臂，</w:t>
-      </w:r>
-      <w:r>
-        <w:rPr>
-          <w:lang w:eastAsia="zh-CN"/>
-        </w:rPr>
-        <w:t>Intel RealSense D435</w:t>
-      </w:r>
-      <w:r>
-        <w:rPr>
-          <w:lang w:eastAsia="zh-CN"/>
-        </w:rPr>
-        <w:t>相机（固件版本</w:t>
-      </w:r>
-      <w:r>
-        <w:rPr>
-          <w:lang w:eastAsia="zh-CN"/>
-        </w:rPr>
-        <w:t>5.13.0.0</w:t>
-      </w:r>
-      <w:r>
-        <w:rPr>
-          <w:lang w:eastAsia="zh-CN"/>
-        </w:rPr>
-        <w:t>），</w:t>
-      </w:r>
-      <w:r>
-        <w:rPr>
-          <w:lang w:eastAsia="zh-CN"/>
-        </w:rPr>
-        <w:t>Intel Core i7-9700/16 GB RAM/NVIDIA RTX 2080 Ti</w:t>
-      </w:r>
-      <w:r>
-        <w:rPr>
-          <w:lang w:eastAsia="zh-CN"/>
-        </w:rPr>
-        <w:t>计算平台。工作台面尺寸</w:t>
-      </w:r>
-      <w:r>
-        <w:rPr>
-          <w:lang w:eastAsia="zh-CN"/>
-        </w:rPr>
-        <w:t>1.0 m×0.8 m</w:t>
-      </w:r>
-      <w:r>
-        <w:rPr>
-          <w:lang w:eastAsia="zh-CN"/>
-        </w:rPr>
-        <w:t>，表面为哑光黑色木质材料（降低反光干扰），光照条件控制在</w:t>
-      </w:r>
-      <w:r>
-        <w:rPr>
-          <w:lang w:eastAsia="zh-CN"/>
-        </w:rPr>
-        <w:t>500±50 lux</w:t>
-      </w:r>
-      <w:r>
-        <w:rPr>
-          <w:lang w:eastAsia="zh-CN"/>
-        </w:rPr>
-        <w:t>（</w:t>
-      </w:r>
-      <w:r>
-        <w:rPr>
-          <w:lang w:eastAsia="zh-CN"/>
-        </w:rPr>
-        <w:t>LED</w:t>
-      </w:r>
-      <w:r>
-        <w:rPr>
-          <w:lang w:eastAsia="zh-CN"/>
-        </w:rPr>
-        <w:t>漫射光源）。</w:t>
-      </w:r>
-    </w:p>
-    <w:p>
-      <w:pPr>
-        <w:ind w:firstLine="420"/>
-        <w:rPr>
-          <w:lang w:eastAsia="zh-CN"/>
-        </w:rPr>
-      </w:pPr>
-      <w:r>
-        <w:rPr>
-          <w:lang w:eastAsia="zh-CN"/>
-        </w:rPr>
-        <w:t>测试方块共</w:t>
-      </w:r>
-      <w:r>
-        <w:rPr>
-          <w:lang w:eastAsia="zh-CN"/>
-        </w:rPr>
-        <w:t>35</w:t>
-      </w:r>
-      <w:r>
-        <w:rPr>
-          <w:lang w:eastAsia="zh-CN"/>
-        </w:rPr>
-        <w:t>块，</w:t>
-      </w:r>
-      <w:r>
-        <w:rPr>
-          <w:lang w:eastAsia="zh-CN"/>
-        </w:rPr>
-        <w:t>7</w:t>
-      </w:r>
-      <w:r>
-        <w:rPr>
-          <w:lang w:eastAsia="zh-CN"/>
-        </w:rPr>
-        <w:t>种类别各</w:t>
-      </w:r>
-      <w:r>
-        <w:rPr>
-          <w:lang w:eastAsia="zh-CN"/>
-        </w:rPr>
-        <w:t>5</w:t>
-      </w:r>
-      <w:r>
-        <w:rPr>
-          <w:lang w:eastAsia="zh-CN"/>
-        </w:rPr>
-        <w:t>块，由</w:t>
-      </w:r>
-      <w:r>
-        <w:rPr>
-          <w:lang w:eastAsia="zh-CN"/>
-        </w:rPr>
-        <w:t>PLA</w:t>
-      </w:r>
-      <w:r>
-        <w:rPr>
-          <w:lang w:eastAsia="zh-CN"/>
-        </w:rPr>
-        <w:t>材料</w:t>
-      </w:r>
-      <w:r>
-        <w:rPr>
-          <w:lang w:eastAsia="zh-CN"/>
-        </w:rPr>
-        <w:t>3D</w:t>
-      </w:r>
-      <w:r>
-        <w:rPr>
-          <w:lang w:eastAsia="zh-CN"/>
-        </w:rPr>
-        <w:t>打印制成（尺寸</w:t>
-      </w:r>
-      <w:r>
-        <w:rPr>
-          <w:lang w:eastAsia="zh-CN"/>
-        </w:rPr>
-        <w:t>20-50 mm</w:t>
-      </w:r>
-      <w:r>
-        <w:rPr>
-          <w:lang w:eastAsia="zh-CN"/>
-        </w:rPr>
-        <w:t>，颜色红</w:t>
-      </w:r>
-      <w:r>
-        <w:rPr>
-          <w:lang w:eastAsia="zh-CN"/>
-        </w:rPr>
-        <w:t>/</w:t>
-      </w:r>
-      <w:r>
-        <w:rPr>
-          <w:lang w:eastAsia="zh-CN"/>
-        </w:rPr>
-        <w:t>蓝</w:t>
-      </w:r>
-      <w:r>
-        <w:rPr>
-          <w:lang w:eastAsia="zh-CN"/>
-        </w:rPr>
-        <w:t>/</w:t>
-      </w:r>
-      <w:r>
-        <w:rPr>
-          <w:lang w:eastAsia="zh-CN"/>
-        </w:rPr>
-        <w:t>绿</w:t>
-      </w:r>
-      <w:r>
-        <w:rPr>
-          <w:lang w:eastAsia="zh-CN"/>
-        </w:rPr>
-        <w:t>/</w:t>
-      </w:r>
-      <w:r>
-        <w:rPr>
-          <w:lang w:eastAsia="zh-CN"/>
-        </w:rPr>
-        <w:t>黄四色），测试前在台面上随机散布。每组测试重复</w:t>
-      </w:r>
-      <w:r>
-        <w:rPr>
-          <w:lang w:eastAsia="zh-CN"/>
-        </w:rPr>
-        <w:t>10</w:t>
-      </w:r>
-      <w:r>
-        <w:rPr>
-          <w:lang w:eastAsia="zh-CN"/>
-        </w:rPr>
-        <w:t>次，记</w:t>
-      </w:r>
-      <w:r>
-        <w:rPr>
-          <w:lang w:eastAsia="zh-CN"/>
-        </w:rPr>
-        <w:lastRenderedPageBreak/>
-        <w:t>录以下指标：方块检测数量与精度、抓取成功率、放置精度（与目标位置偏差）、单次循环时间、连续运行稳定性。</w:t>
-      </w:r>
-    </w:p>
-    <w:p>
-      <w:pPr>
-        <w:pStyle w:val="21"/>
-        <w:spacing w:before="240" w:after="160" w:line="300" w:lineRule="auto"/>
-        <w:jc w:val="left"/>
-        <w:rPr>
-          <w:lang w:eastAsia="zh-CN"/>
-        </w:rPr>
-      </w:pPr>
-      <w:bookmarkStart w:id="47" w:name="_Toc229276483"/>
-      <w:r>
-        <w:rPr>
-          <w:rFonts w:ascii="Times New Roman" w:eastAsia="宋体" w:hAnsi="Times New Roman"/>
-          <w:color w:val="000000"/>
-          <w:sz w:val="28"/>
-          <w:lang w:eastAsia="zh-CN"/>
-        </w:rPr>
-        <w:t xml:space="preserve">5.2 </w:t>
-      </w:r>
-      <w:r>
-        <w:rPr>
-          <w:rFonts w:ascii="Times New Roman" w:eastAsia="宋体" w:hAnsi="Times New Roman"/>
-          <w:color w:val="000000"/>
-          <w:sz w:val="28"/>
-          <w:lang w:eastAsia="zh-CN"/>
-        </w:rPr>
-        <w:t>视觉识别性能</w:t>
-      </w:r>
-      <w:bookmarkEnd w:id="47"/>
-    </w:p>
-    <w:p>
-      <w:pPr>
-        <w:spacing w:before="160" w:after="40"/>
-        <w:jc w:val="center"/>
-      </w:pPr>
-      <w:r>
-        <w:rPr>
-          <w:noProof/>
-        </w:rPr>
-        <w:drawing>
-          <wp:inline distT="0" distB="0" distL="0" distR="0" wp14:anchorId="70610AA7" wp14:editId="55E2AF17">
-            <wp:extent cx="4572000" cy="2571750"/>
-            <wp:effectExtent l="0" t="0" r="0" b="0"/>
-            <wp:docPr id="9" name="Picture 9"/>
-            <wp:cNvGraphicFramePr>
-              <a:graphicFrameLocks xmlns:a="http://schemas.openxmlformats.org/drawingml/2006/main" noChangeAspect="1"/>
-            </wp:cNvGraphicFramePr>
-            <a:graphic xmlns:a="http://schemas.openxmlformats.org/drawingml/2006/main">
-              <a:graphicData uri="http://schemas.openxmlformats.org/drawingml/2006/picture">
-                <pic:pic xmlns:pic="http://schemas.openxmlformats.org/drawingml/2006/picture">
-                  <pic:nvPicPr>
-                    <pic:cNvPr id="0" name="recognition_diagram.jpg"/>
-                    <pic:cNvPicPr/>
-                  </pic:nvPicPr>
-                  <pic:blipFill>
-                    <a:blip r:embed="rId17"/>
-                    <a:stretch>
-                      <a:fillRect/>
-                    </a:stretch>
-                  </pic:blipFill>
-                  <pic:spPr>
-                    <a:xfrm>
-                      <a:off x="0" y="0"/>
-                      <a:ext cx="4572000" cy="2571750"/>
-                    </a:xfrm>
-                    <a:prstGeom prst="rect">
-                      <a:avLst/>
-                    </a:prstGeom>
-                  </pic:spPr>
-                </pic:pic>
-              </a:graphicData>
-            </a:graphic>
-          </wp:inline>
-        </w:drawing>
-      </w:r>
-    </w:p>
-    <w:p>
-      <w:pPr>
-        <w:spacing w:after="200"/>
-        <w:jc w:val="center"/>
-        <w:rPr>
-          <w:lang w:eastAsia="zh-CN"/>
-        </w:rPr>
-      </w:pPr>
-      <w:r>
-        <w:rPr>
-          <w:b/>
-          <w:sz w:val="18"/>
-          <w:lang w:eastAsia="zh-CN"/>
-        </w:rPr>
-        <w:t>图</w:t>
-      </w:r>
-      <w:r>
-        <w:rPr>
-          <w:b/>
-          <w:sz w:val="18"/>
-          <w:lang w:eastAsia="zh-CN"/>
-        </w:rPr>
-        <w:t xml:space="preserve">5-2  </w:t>
-      </w:r>
-      <w:r>
-        <w:rPr>
-          <w:sz w:val="18"/>
-          <w:lang w:eastAsia="zh-CN"/>
-        </w:rPr>
-        <w:t>俄罗斯方块视觉识别效果（</w:t>
-      </w:r>
-      <w:r>
-        <w:rPr>
-          <w:sz w:val="18"/>
-          <w:lang w:eastAsia="zh-CN"/>
-        </w:rPr>
-        <w:t>YOLOv8</w:t>
-      </w:r>
-      <w:r>
-        <w:rPr>
-          <w:sz w:val="18"/>
-          <w:lang w:eastAsia="zh-CN"/>
-        </w:rPr>
-        <w:t>实例分割</w:t>
-      </w:r>
-      <w:r>
-        <w:rPr>
-          <w:sz w:val="18"/>
-          <w:lang w:eastAsia="zh-CN"/>
-        </w:rPr>
-        <w:t>+</w:t>
-      </w:r>
-      <w:r>
-        <w:rPr>
-          <w:sz w:val="18"/>
-          <w:lang w:eastAsia="zh-CN"/>
-        </w:rPr>
-        <w:t>分类标注）</w:t>
+        </w:rPr>
+        <w:t>俄罗斯方块视觉识别效果（YOLOv8实例分割+分类标注）</w:t>
       </w:r>
     </w:p>
     <w:p>
@@ -32852,44 +32261,44 @@
         <w:rPr>
           <w:lang w:eastAsia="zh-CN"/>
         </w:rPr>
-        <w:t>）成为系统端到端延迟的主要瓶颈。在良好光照</w:t>
+        <w:t>）成为系统端到端延迟的主要瓶颈。在良好光照条件（</w:t>
+      </w:r>
+      <w:r>
+        <w:rPr>
+          <w:lang w:eastAsia="zh-CN"/>
+        </w:rPr>
+        <w:t>500 lux</w:t>
+      </w:r>
+      <w:r>
+        <w:rPr>
+          <w:lang w:eastAsia="zh-CN"/>
+        </w:rPr>
+        <w:t>）下，模型对所有七类方块的识别精度均超过</w:t>
+      </w:r>
+      <w:r>
+        <w:rPr>
+          <w:lang w:eastAsia="zh-CN"/>
+        </w:rPr>
+        <w:t>90%</w:t>
+      </w:r>
+      <w:r>
+        <w:rPr>
+          <w:lang w:eastAsia="zh-CN"/>
+        </w:rPr>
+        <w:t>；光照降至</w:t>
+      </w:r>
+      <w:r>
+        <w:rPr>
+          <w:lang w:eastAsia="zh-CN"/>
+        </w:rPr>
+        <w:t xml:space="preserve">200 </w:t>
       </w:r>
       <w:r>
         <w:rPr>
           <w:lang w:eastAsia="zh-CN"/>
         </w:rPr>
         <w:lastRenderedPageBreak/>
-        <w:t>条件（</w:t>
-      </w:r>
-      <w:r>
-        <w:rPr>
-          <w:lang w:eastAsia="zh-CN"/>
-        </w:rPr>
-        <w:t>500 lux</w:t>
-      </w:r>
-      <w:r>
-        <w:rPr>
-          <w:lang w:eastAsia="zh-CN"/>
-        </w:rPr>
-        <w:t>）下，模型对所有七类方块的识别精度均超过</w:t>
-      </w:r>
-      <w:r>
-        <w:rPr>
-          <w:lang w:eastAsia="zh-CN"/>
-        </w:rPr>
-        <w:t>90%</w:t>
-      </w:r>
-      <w:r>
-        <w:rPr>
-          <w:lang w:eastAsia="zh-CN"/>
-        </w:rPr>
-        <w:t>；光照降至</w:t>
-      </w:r>
-      <w:r>
-        <w:rPr>
-          <w:lang w:eastAsia="zh-CN"/>
-        </w:rPr>
-        <w:t>200 lux</w:t>
+        <w:t>lux</w:t>
       </w:r>
       <w:r>
         <w:rPr>
@@ -33440,26 +32849,22 @@
         <w:jc w:val="center"/>
       </w:pPr>
       <w:r>
-        <w:rPr>
-          <w:noProof/>
-        </w:rPr>
         <w:drawing>
-          <wp:inline distT="0" distB="0" distL="0" distR="0" wp14:anchorId="7463DA19" wp14:editId="35B2DBA2">
+          <wp:inline xmlns:a="http://schemas.openxmlformats.org/drawingml/2006/main" xmlns:pic="http://schemas.openxmlformats.org/drawingml/2006/picture">
             <wp:extent cx="4572000" cy="4572000"/>
-            <wp:effectExtent l="0" t="0" r="0" b="0"/>
-            <wp:docPr id="8" name="Picture 8"/>
+            <wp:docPr id="9" name="Picture 9"/>
             <wp:cNvGraphicFramePr>
-              <a:graphicFrameLocks xmlns:a="http://schemas.openxmlformats.org/drawingml/2006/main" noChangeAspect="1"/>
+              <a:graphicFrameLocks noChangeAspect="1"/>
             </wp:cNvGraphicFramePr>
-            <a:graphic xmlns:a="http://schemas.openxmlformats.org/drawingml/2006/main">
+            <a:graphic>
               <a:graphicData uri="http://schemas.openxmlformats.org/drawingml/2006/picture">
-                <pic:pic xmlns:pic="http://schemas.openxmlformats.org/drawingml/2006/picture">
+                <pic:pic>
                   <pic:nvPicPr>
                     <pic:cNvPr id="0" name="grasping_process.jpg"/>
                     <pic:cNvPicPr/>
                   </pic:nvPicPr>
                   <pic:blipFill>
-                    <a:blip r:embed="rId18"/>
+                    <a:blip r:embed="rId15"/>
                     <a:stretch>
                       <a:fillRect/>
                     </a:stretch>
@@ -33469,9 +32874,7 @@
                       <a:off x="0" y="0"/>
                       <a:ext cx="4572000" cy="4572000"/>
                     </a:xfrm>
-                    <a:prstGeom prst="rect">
-                      <a:avLst/>
-                    </a:prstGeom>
+                    <a:prstGeom prst="rect"/>
                   </pic:spPr>
                 </pic:pic>
               </a:graphicData>
@@ -33484,31 +32887,19 @@
       <w:pPr>
         <w:spacing w:after="200"/>
         <w:jc w:val="center"/>
-        <w:rPr>
-          <w:lang w:eastAsia="zh-CN"/>
-        </w:rPr>
-      </w:pPr>
-      <w:r>
-        <w:rPr>
+      </w:pPr>
+      <w:r>
+        <w:rPr>
+          <w:rFonts w:ascii="Times New Roman" w:hAnsi="Times New Roman"/>
           <w:b/>
           <w:sz w:val="18"/>
-          <w:lang w:eastAsia="zh-CN"/>
-        </w:rPr>
-        <w:lastRenderedPageBreak/>
-        <w:t>图</w:t>
-      </w:r>
-      <w:r>
-        <w:rPr>
-          <w:b/>
+        </w:rPr>
+        <w:t xml:space="preserve">图5-3  </w:t>
+      </w:r>
+      <w:r>
+        <w:rPr>
+          <w:rFonts w:ascii="Times New Roman" w:hAnsi="Times New Roman"/>
           <w:sz w:val="18"/>
-          <w:lang w:eastAsia="zh-CN"/>
-        </w:rPr>
-        <w:t xml:space="preserve">5-3  </w:t>
-      </w:r>
-      <w:r>
-        <w:rPr>
-          <w:sz w:val="18"/>
-          <w:lang w:eastAsia="zh-CN"/>
         </w:rPr>
         <w:t>气动吸盘精准拾取俄罗斯方块过程</w:t>
       </w:r>
@@ -34347,7 +33738,14 @@
         <w:rPr>
           <w:lang w:eastAsia="zh-CN"/>
         </w:rPr>
-        <w:t>值（</w:t>
+        <w:t>值</w:t>
+      </w:r>
+      <w:r>
+        <w:rPr>
+          <w:lang w:eastAsia="zh-CN"/>
+        </w:rPr>
+        <w:lastRenderedPageBreak/>
+        <w:t>（</w:t>
       </w:r>
       <w:r>
         <w:rPr>
@@ -34799,7 +34197,6 @@
                 <w:rFonts w:ascii="宋体" w:hAnsi="宋体"/>
                 <w:sz w:val="20"/>
               </w:rPr>
-              <w:lastRenderedPageBreak/>
               <w:t>纯DQN</w:t>
             </w:r>
           </w:p>
@@ -35208,26 +34605,22 @@
         <w:jc w:val="center"/>
       </w:pPr>
       <w:r>
-        <w:rPr>
-          <w:noProof/>
-        </w:rPr>
         <w:drawing>
-          <wp:inline distT="0" distB="0" distL="0" distR="0" wp14:anchorId="29A094B8" wp14:editId="10761988">
+          <wp:inline xmlns:a="http://schemas.openxmlformats.org/drawingml/2006/main" xmlns:pic="http://schemas.openxmlformats.org/drawingml/2006/picture">
             <wp:extent cx="4572000" cy="4572000"/>
-            <wp:effectExtent l="0" t="0" r="0" b="0"/>
-            <wp:docPr id="7" name="Picture 7"/>
+            <wp:docPr id="8" name="Picture 8"/>
             <wp:cNvGraphicFramePr>
-              <a:graphicFrameLocks xmlns:a="http://schemas.openxmlformats.org/drawingml/2006/main" noChangeAspect="1"/>
+              <a:graphicFrameLocks noChangeAspect="1"/>
             </wp:cNvGraphicFramePr>
-            <a:graphic xmlns:a="http://schemas.openxmlformats.org/drawingml/2006/main">
+            <a:graphic>
               <a:graphicData uri="http://schemas.openxmlformats.org/drawingml/2006/picture">
-                <pic:pic xmlns:pic="http://schemas.openxmlformats.org/drawingml/2006/picture">
+                <pic:pic>
                   <pic:nvPicPr>
                     <pic:cNvPr id="0" name="assembly_result.jpg"/>
                     <pic:cNvPicPr/>
                   </pic:nvPicPr>
                   <pic:blipFill>
-                    <a:blip r:embed="rId19"/>
+                    <a:blip r:embed="rId14"/>
                     <a:stretch>
                       <a:fillRect/>
                     </a:stretch>
@@ -35237,9 +34630,7 @@
                       <a:off x="0" y="0"/>
                       <a:ext cx="4572000" cy="4572000"/>
                     </a:xfrm>
-                    <a:prstGeom prst="rect">
-                      <a:avLst/>
-                    </a:prstGeom>
+                    <a:prstGeom prst="rect"/>
                   </pic:spPr>
                 </pic:pic>
               </a:graphicData>
@@ -35252,40 +34643,21 @@
       <w:pPr>
         <w:spacing w:after="200"/>
         <w:jc w:val="center"/>
-        <w:rPr>
-          <w:lang w:eastAsia="zh-CN"/>
-        </w:rPr>
-      </w:pPr>
-      <w:r>
-        <w:rPr>
+      </w:pPr>
+      <w:r>
+        <w:rPr>
+          <w:rFonts w:ascii="Times New Roman" w:hAnsi="Times New Roman"/>
           <w:b/>
           <w:sz w:val="18"/>
-          <w:lang w:eastAsia="zh-CN"/>
-        </w:rPr>
-        <w:lastRenderedPageBreak/>
-        <w:t>图</w:t>
-      </w:r>
-      <w:r>
-        <w:rPr>
-          <w:b/>
+        </w:rPr>
+        <w:t xml:space="preserve">图5-4  </w:t>
+      </w:r>
+      <w:r>
+        <w:rPr>
+          <w:rFonts w:ascii="Times New Roman" w:hAnsi="Times New Roman"/>
           <w:sz w:val="18"/>
-          <w:lang w:eastAsia="zh-CN"/>
-        </w:rPr>
-        <w:t xml:space="preserve">5-4  </w:t>
-      </w:r>
-      <w:r>
-        <w:rPr>
-          <w:sz w:val="18"/>
-          <w:lang w:eastAsia="zh-CN"/>
-        </w:rPr>
-        <w:t>35</w:t>
-      </w:r>
-      <w:r>
-        <w:rPr>
-          <w:sz w:val="18"/>
-          <w:lang w:eastAsia="zh-CN"/>
-        </w:rPr>
-        <w:t>块俄罗斯方块全自动拼接完成效果</w:t>
+        </w:rPr>
+        <w:t>35块俄罗斯方块全自动拼接完成效果</w:t>
       </w:r>
     </w:p>
     <w:p>
@@ -35563,6 +34935,7 @@
                 <w:b/>
                 <w:sz w:val="20"/>
               </w:rPr>
+              <w:lastRenderedPageBreak/>
               <w:t>性能指标</w:t>
             </w:r>
             <w:proofErr w:type="spellEnd"/>
@@ -36177,7 +35550,9 @@
       </w:tr>
     </w:tbl>
     <w:p/>
-    <w:p/>
+    <w:p>
+      <w:r/>
+    </w:p>
     <w:p>
       <w:pPr>
         <w:pStyle w:val="1"/>
@@ -36192,6 +35567,7 @@
           <w:color w:val="000000"/>
           <w:sz w:val="32"/>
         </w:rPr>
+        <w:lastRenderedPageBreak/>
         <w:t xml:space="preserve">6. </w:t>
       </w:r>
       <w:r>
@@ -36260,7 +35636,6 @@
         <w:rPr>
           <w:lang w:eastAsia="zh-CN"/>
         </w:rPr>
-        <w:lastRenderedPageBreak/>
         <w:t xml:space="preserve">(1) </w:t>
       </w:r>
       <w:r>
@@ -36383,11 +35758,16 @@
       <w:r>
         <w:t>transformed_result.txt</w:t>
       </w:r>
+      <w:proofErr w:type="spellStart"/>
       <w:r>
         <w:t>的中转文件读写引入了不必要的磁盘</w:t>
       </w:r>
       <w:r>
-        <w:t>I/O</w:t>
+        <w:t>I</w:t>
+      </w:r>
+      <w:proofErr w:type="spellEnd"/>
+      <w:r>
+        <w:t>/O</w:t>
       </w:r>
       <w:r>
         <w:t>延迟（约</w:t>
@@ -36936,6 +36316,14 @@
                 <w:lang w:eastAsia="zh-CN"/>
               </w:rPr>
               <w:br/>
+            </w:r>
+            <w:r>
+              <w:rPr>
+                <w:rFonts w:ascii="宋体" w:hAnsi="宋体"/>
+                <w:sz w:val="20"/>
+                <w:lang w:eastAsia="zh-CN"/>
+              </w:rPr>
+              <w:lastRenderedPageBreak/>
               <w:t>1.9M参数</w:t>
             </w:r>
           </w:p>
@@ -36953,6 +36341,7 @@
                 <w:rFonts w:ascii="宋体" w:hAnsi="宋体"/>
                 <w:sz w:val="20"/>
               </w:rPr>
+              <w:lastRenderedPageBreak/>
               <w:t xml:space="preserve">推理时间~12 </w:t>
             </w:r>
             <w:proofErr w:type="spellStart"/>
@@ -36969,7 +36358,15 @@
                 <w:rFonts w:ascii="宋体" w:hAnsi="宋体"/>
                 <w:sz w:val="20"/>
               </w:rPr>
-              <w:t xml:space="preserve"> (Jetson),</w:t>
+              <w:t xml:space="preserve"> </w:t>
+            </w:r>
+            <w:r>
+              <w:rPr>
+                <w:rFonts w:ascii="宋体" w:hAnsi="宋体"/>
+                <w:sz w:val="20"/>
+              </w:rPr>
+              <w:lastRenderedPageBreak/>
+              <w:t>(Jetson),</w:t>
             </w:r>
             <w:r>
               <w:rPr>
@@ -37020,6 +36417,7 @@
                 <w:rFonts w:ascii="宋体" w:hAnsi="宋体"/>
                 <w:sz w:val="20"/>
               </w:rPr>
+              <w:lastRenderedPageBreak/>
               <w:t>轨迹同步</w:t>
             </w:r>
           </w:p>
@@ -37148,14 +36546,6 @@
                 <w:lang w:eastAsia="zh-CN"/>
               </w:rPr>
               <w:br/>
-            </w:r>
-            <w:r>
-              <w:rPr>
-                <w:rFonts w:ascii="宋体" w:hAnsi="宋体"/>
-                <w:sz w:val="20"/>
-                <w:lang w:eastAsia="zh-CN"/>
-              </w:rPr>
-              <w:lastRenderedPageBreak/>
               <w:t xml:space="preserve">(2-5 </w:t>
             </w:r>
             <w:proofErr w:type="spellStart"/>
@@ -37192,7 +36582,6 @@
                 <w:rFonts w:ascii="宋体" w:hAnsi="宋体"/>
                 <w:sz w:val="20"/>
               </w:rPr>
-              <w:lastRenderedPageBreak/>
               <w:t>ROS话题直接通信</w:t>
             </w:r>
             <w:proofErr w:type="spellEnd"/>
@@ -37216,7 +36605,6 @@
                 <w:rFonts w:ascii="宋体" w:hAnsi="宋体"/>
                 <w:sz w:val="20"/>
               </w:rPr>
-              <w:lastRenderedPageBreak/>
               <w:t>自定义TetrisDetection消息</w:t>
             </w:r>
             <w:proofErr w:type="spellEnd"/>
@@ -37239,7 +36627,6 @@
                 <w:sz w:val="20"/>
                 <w:lang w:eastAsia="zh-CN"/>
               </w:rPr>
-              <w:lastRenderedPageBreak/>
               <w:t xml:space="preserve">数据传输延迟&lt;1 </w:t>
             </w:r>
             <w:proofErr w:type="spellStart"/>
@@ -37267,14 +36654,6 @@
                 <w:lang w:eastAsia="zh-CN"/>
               </w:rPr>
               <w:br/>
-            </w:r>
-            <w:r>
-              <w:rPr>
-                <w:rFonts w:ascii="宋体" w:hAnsi="宋体"/>
-                <w:sz w:val="20"/>
-                <w:lang w:eastAsia="zh-CN"/>
-              </w:rPr>
-              <w:lastRenderedPageBreak/>
               <w:t>消除文件I/O瓶颈</w:t>
             </w:r>
           </w:p>
@@ -37295,7 +36674,6 @@
                 <w:rFonts w:ascii="宋体" w:hAnsi="宋体"/>
                 <w:sz w:val="20"/>
               </w:rPr>
-              <w:lastRenderedPageBreak/>
               <w:t>光照适应</w:t>
             </w:r>
             <w:proofErr w:type="spellEnd"/>
@@ -37738,7 +37116,11 @@
         <w:t>&gt;100×</w:t>
       </w:r>
       <w:r>
-        <w:t>）与轨迹规划算法的验证，通过域随机化（</w:t>
+        <w:t>）与轨迹规划算</w:t>
+      </w:r>
+      <w:r>
+        <w:lastRenderedPageBreak/>
+        <w:t>法的验证，通过域随机化（</w:t>
       </w:r>
       <w:r>
         <w:t>Domain Randomization</w:t>
@@ -37770,14 +37152,7 @@
         <w:rPr>
           <w:lang w:eastAsia="zh-CN"/>
         </w:rPr>
-        <w:t>综上所述，本系统已具备完整的俄罗斯方块自动化拼接能力，在标准化测试环境中各项指标达到设计预期。通过上述优化方案的逐步实施，系统性能有望进一步</w:t>
-      </w:r>
-      <w:r>
-        <w:rPr>
-          <w:lang w:eastAsia="zh-CN"/>
-        </w:rPr>
-        <w:lastRenderedPageBreak/>
-        <w:t>提升至识别精度</w:t>
+        <w:t>综上所述，本系统已具备完整的俄罗斯方块自动化拼接能力，在标准化测试环境中各项指标达到设计预期。通过上述优化方案的逐步实施，系统性能有望进一步提升至识别精度</w:t>
       </w:r>
       <w:r>
         <w:rPr>
@@ -37822,140 +37197,11 @@
           <w:lang w:eastAsia="zh-CN"/>
         </w:rPr>
       </w:pPr>
-    </w:p>
-    <w:p>
-      <w:pPr>
-        <w:rPr>
-          <w:lang w:eastAsia="zh-CN"/>
-        </w:rPr>
-      </w:pPr>
-    </w:p>
-    <w:p>
-      <w:pPr>
-        <w:rPr>
-          <w:lang w:eastAsia="zh-CN"/>
-        </w:rPr>
-      </w:pPr>
-    </w:p>
-    <w:p>
-      <w:pPr>
-        <w:rPr>
-          <w:lang w:eastAsia="zh-CN"/>
-        </w:rPr>
-      </w:pPr>
-    </w:p>
-    <w:p>
-      <w:pPr>
-        <w:rPr>
-          <w:lang w:eastAsia="zh-CN"/>
-        </w:rPr>
-      </w:pPr>
-    </w:p>
-    <w:p>
-      <w:pPr>
-        <w:rPr>
-          <w:lang w:eastAsia="zh-CN"/>
-        </w:rPr>
-      </w:pPr>
-    </w:p>
-    <w:p>
-      <w:pPr>
-        <w:rPr>
-          <w:lang w:eastAsia="zh-CN"/>
-        </w:rPr>
-      </w:pPr>
-    </w:p>
-    <w:p>
-      <w:pPr>
-        <w:rPr>
-          <w:lang w:eastAsia="zh-CN"/>
-        </w:rPr>
-      </w:pPr>
-    </w:p>
-    <w:p>
-      <w:pPr>
-        <w:rPr>
-          <w:lang w:eastAsia="zh-CN"/>
-        </w:rPr>
-      </w:pPr>
-    </w:p>
-    <w:p>
-      <w:pPr>
-        <w:rPr>
-          <w:lang w:eastAsia="zh-CN"/>
-        </w:rPr>
-      </w:pPr>
-    </w:p>
-    <w:p>
-      <w:pPr>
-        <w:rPr>
-          <w:lang w:eastAsia="zh-CN"/>
-        </w:rPr>
-      </w:pPr>
-    </w:p>
-    <w:p>
-      <w:pPr>
-        <w:rPr>
-          <w:lang w:eastAsia="zh-CN"/>
-        </w:rPr>
-      </w:pPr>
-    </w:p>
-    <w:p>
-      <w:pPr>
-        <w:rPr>
-          <w:lang w:eastAsia="zh-CN"/>
-        </w:rPr>
-      </w:pPr>
-    </w:p>
-    <w:p>
-      <w:pPr>
-        <w:rPr>
-          <w:lang w:eastAsia="zh-CN"/>
-        </w:rPr>
-      </w:pPr>
-    </w:p>
-    <w:p>
-      <w:pPr>
-        <w:rPr>
-          <w:lang w:eastAsia="zh-CN"/>
-        </w:rPr>
-      </w:pPr>
-    </w:p>
-    <w:p>
-      <w:pPr>
-        <w:rPr>
-          <w:lang w:eastAsia="zh-CN"/>
-        </w:rPr>
-      </w:pPr>
-    </w:p>
-    <w:p>
-      <w:pPr>
-        <w:rPr>
-          <w:lang w:eastAsia="zh-CN"/>
-        </w:rPr>
-      </w:pPr>
-    </w:p>
-    <w:p>
-      <w:pPr>
-        <w:rPr>
-          <w:lang w:eastAsia="zh-CN"/>
-        </w:rPr>
-      </w:pPr>
-    </w:p>
-    <w:p>
-      <w:pPr>
-        <w:rPr>
-          <w:lang w:eastAsia="zh-CN"/>
-        </w:rPr>
-      </w:pPr>
-    </w:p>
-    <w:p>
-      <w:pPr>
-        <w:rPr>
-          <w:rFonts w:hint="eastAsia"/>
-          <w:lang w:eastAsia="zh-CN"/>
-        </w:rPr>
-      </w:pPr>
+      <w:r>
+        <w:rPr>
+          <w:lang w:eastAsia="zh-CN"/>
+        </w:rPr>
+      </w:r>
     </w:p>
     <w:p>
       <w:pPr>
@@ -38188,47 +37434,7 @@
       </w:r>
     </w:p>
     <w:p>
-      <w:pPr>
-        <w:rPr>
-          <w:lang w:eastAsia="zh-CN"/>
-        </w:rPr>
-      </w:pPr>
-    </w:p>
-    <w:p>
-      <w:pPr>
-        <w:rPr>
-          <w:lang w:eastAsia="zh-CN"/>
-        </w:rPr>
-      </w:pPr>
-    </w:p>
-    <w:p>
-      <w:pPr>
-        <w:rPr>
-          <w:lang w:eastAsia="zh-CN"/>
-        </w:rPr>
-      </w:pPr>
-    </w:p>
-    <w:p>
-      <w:pPr>
-        <w:rPr>
-          <w:lang w:eastAsia="zh-CN"/>
-        </w:rPr>
-      </w:pPr>
-    </w:p>
-    <w:p>
-      <w:pPr>
-        <w:rPr>
-          <w:lang w:eastAsia="zh-CN"/>
-        </w:rPr>
-      </w:pPr>
-    </w:p>
-    <w:p>
-      <w:pPr>
-        <w:rPr>
-          <w:rFonts w:hint="eastAsia"/>
-          <w:lang w:eastAsia="zh-CN"/>
-        </w:rPr>
-      </w:pPr>
+      <w:r/>
     </w:p>
     <w:p>
       <w:pPr>
@@ -38238,7 +37444,6 @@
         <w:br w:type="page"/>
       </w:pPr>
       <w:bookmarkStart w:id="56" w:name="_Toc229276492"/>
-      <w:proofErr w:type="spellStart"/>
       <w:r>
         <w:rPr>
           <w:rFonts w:ascii="Times New Roman" w:eastAsia="宋体" w:hAnsi="Times New Roman"/>
@@ -38249,7 +37454,6 @@
         <w:t>附录</w:t>
       </w:r>
       <w:bookmarkEnd w:id="56"/>
-      <w:proofErr w:type="spellEnd"/>
     </w:p>
     <w:p>
       <w:pPr>
@@ -42490,7 +41694,7 @@
                     <pic:cNvPicPr/>
                   </pic:nvPicPr>
                   <pic:blipFill>
-                    <a:blip r:embed="rId20"/>
+                    <a:blip r:embed="rId9"/>
                     <a:stretch>
                       <a:fillRect/>
                     </a:stretch>
@@ -42562,7 +41766,7 @@
                     <pic:cNvPicPr/>
                   </pic:nvPicPr>
                   <pic:blipFill>
-                    <a:blip r:embed="rId21"/>
+                    <a:blip r:embed="rId10"/>
                     <a:stretch>
                       <a:fillRect/>
                     </a:stretch>
@@ -42660,7 +41864,7 @@
                     <pic:cNvPicPr/>
                   </pic:nvPicPr>
                   <pic:blipFill>
-                    <a:blip r:embed="rId12"/>
+                    <a:blip r:embed="rId8"/>
                     <a:stretch>
                       <a:fillRect/>
                     </a:stretch>

</xml_diff>